<commit_message>
PC1: link de la carpeta del Drive y entrega regenerada
El link va en la portada y en «Material complementario». Se corrió
armar-entrega.sh: anexos, documento principal y PDF regenerados. Cierre
del PC1 al día con lo hecho el jueves.

Co-Authored-By: Claude Opus 5.5 <noreply@anthropic.com>
</commit_message>
<xml_diff>
--- a/07-Entregables/IA/Rumbo — Inteligencia artificial.docx
+++ b/07-Entregables/IA/Rumbo — Inteligencia artificial.docx
@@ -76,7 +76,7 @@
         </w:p>
       </w:sdtContent>
     </w:sdt>
-    <w:bookmarkStart w:id="49" w:name="presentación"/>
+    <w:bookmarkStart w:id="49" w:name="_presentación"/>
     <w:p>
       <w:pPr>
         <w:pStyle w:val="Heading1"/>
@@ -162,7 +162,7 @@
       </w:r>
     </w:p>
     <w:bookmarkEnd w:id="49"/>
-    <w:bookmarkStart w:id="54" w:name="modelo-de-ia-del-producto"/>
+    <w:bookmarkStart w:id="54" w:name="_ad21453a9cb8517835b9c30406213db7b4da246"/>
     <w:p>
       <w:pPr>
         <w:pStyle w:val="Heading1"/>
@@ -171,7 +171,7 @@
         <w:t xml:space="preserve">Modelo de IA del producto</w:t>
       </w:r>
     </w:p>
-    <w:bookmarkStart w:id="50" w:name="contexto"/>
+    <w:bookmarkStart w:id="50" w:name="_contexto"/>
     <w:p>
       <w:pPr>
         <w:pStyle w:val="Heading2"/>
@@ -189,7 +189,7 @@
       </w:r>
     </w:p>
     <w:bookmarkEnd w:id="50"/>
-    <w:bookmarkStart w:id="51" w:name="decisión"/>
+    <w:bookmarkStart w:id="51" w:name="_decisión"/>
     <w:p>
       <w:pPr>
         <w:pStyle w:val="Heading2"/>
@@ -284,7 +284,7 @@
       </w:r>
     </w:p>
     <w:bookmarkEnd w:id="51"/>
-    <w:bookmarkStart w:id="52" w:name="alternativas-consideradas"/>
+    <w:bookmarkStart w:id="52" w:name="_1f3f4284a98ed5deeb904a9dfba2e4cf8d2fc60"/>
     <w:p>
       <w:pPr>
         <w:pStyle w:val="Heading2"/>
@@ -449,7 +449,7 @@
       </w:tr>
     </w:tbl>
     <w:bookmarkEnd w:id="52"/>
-    <w:bookmarkStart w:id="53" w:name="justificación"/>
+    <w:bookmarkStart w:id="53" w:name="_justificación"/>
     <w:p>
       <w:pPr>
         <w:pStyle w:val="Heading2"/>
@@ -468,7 +468,7 @@
     </w:p>
     <w:bookmarkEnd w:id="53"/>
     <w:bookmarkEnd w:id="54"/>
-    <w:bookmarkStart w:id="64" w:name="agentes-de-ia-del-proyecto"/>
+    <w:bookmarkStart w:id="64" w:name="_5241afa51979dc50aec79fd41f92dbabf0e9329"/>
     <w:p>
       <w:pPr>
         <w:pStyle w:val="Heading1"/>
@@ -477,7 +477,7 @@
         <w:t xml:space="preserve">Agentes de IA del proyecto</w:t>
       </w:r>
     </w:p>
-    <w:bookmarkStart w:id="58" w:name="ciclo-de-trabajo-con-el-agente"/>
+    <w:bookmarkStart w:id="58" w:name="_85a7dd45267a94ed7ecc9c0021079e9a5aab1f6"/>
     <w:p>
       <w:pPr>
         <w:pStyle w:val="Heading2"/>
@@ -514,7 +514,7 @@
       <w:r>
         <w:drawing>
           <wp:inline>
-            <wp:extent cx="4027170" cy="13011925"/>
+            <wp:extent cx="4027169" cy="13011925"/>
             <wp:effectExtent b="0" l="0" r="0" t="0"/>
             <wp:docPr descr="Figura 1. Ciclo de trabajo de una sesión con el agente." title="" id="56" name="Picture"/>
             <a:graphic>
@@ -535,7 +535,7 @@
                   <pic:spPr bwMode="auto">
                     <a:xfrm>
                       <a:off x="0" y="0"/>
-                      <a:ext cx="4027170" cy="13011925"/>
+                      <a:ext cx="4027169" cy="13011925"/>
                     </a:xfrm>
                     <a:prstGeom prst="rect">
                       <a:avLst/>
@@ -563,7 +563,7 @@
       </w:r>
     </w:p>
     <w:bookmarkEnd w:id="58"/>
-    <w:bookmarkStart w:id="63" w:name="agentes"/>
+    <w:bookmarkStart w:id="63" w:name="_agentes"/>
     <w:p>
       <w:pPr>
         <w:pStyle w:val="Heading2"/>
@@ -890,7 +890,7 @@
         </w:tc>
       </w:tr>
     </w:tbl>
-    <w:bookmarkStart w:id="59" w:name="claude-code-agente-principal"/>
+    <w:bookmarkStart w:id="59" w:name="_ed108da5b06349d16ca746ee689f3a9611a1049"/>
     <w:p>
       <w:pPr>
         <w:pStyle w:val="Heading3"/>
@@ -1124,7 +1124,7 @@
       </w:r>
     </w:p>
     <w:bookmarkEnd w:id="59"/>
-    <w:bookmarkStart w:id="60" w:name="subagentes-exploración-en-paralelo"/>
+    <w:bookmarkStart w:id="60" w:name="_ab8a87972d9ebddf8860069cddb0f89d6c43055"/>
     <w:p>
       <w:pPr>
         <w:pStyle w:val="Heading3"/>
@@ -1260,7 +1260,7 @@
       </w:r>
     </w:p>
     <w:bookmarkEnd w:id="60"/>
-    <w:bookmarkStart w:id="62" w:name="mcp-de-figma-prototipo-de-interfaces"/>
+    <w:bookmarkStart w:id="62" w:name="_4114302bd9181b4f3020216bbd359015b1582a9"/>
     <w:p>
       <w:pPr>
         <w:pStyle w:val="Heading3"/>

</xml_diff>

<commit_message>
Entregable de IA: .docx actualizado y su PDF
Co-Authored-By: Claude Opus 5.5 <noreply@anthropic.com>
</commit_message>
<xml_diff>
--- a/07-Entregables/IA/Rumbo — Inteligencia artificial.docx
+++ b/07-Entregables/IA/Rumbo — Inteligencia artificial.docx
@@ -1,21 +1,21 @@
 
 <file path=word/document.xml><?xml version="1.0" encoding="utf-8"?>
-<w:document xmlns:w="http://schemas.openxmlformats.org/wordprocessingml/2006/main" xmlns:m="http://schemas.openxmlformats.org/officeDocument/2006/math" xmlns:r="http://schemas.openxmlformats.org/officeDocument/2006/relationships" xmlns:o="urn:schemas-microsoft-com:office:office" xmlns:v="urn:schemas-microsoft-com:vml" xmlns:w10="urn:schemas-microsoft-com:office:word" xmlns:a="http://schemas.openxmlformats.org/drawingml/2006/main" xmlns:pic="http://schemas.openxmlformats.org/drawingml/2006/picture" xmlns:wp="http://schemas.openxmlformats.org/drawingml/2006/wordprocessingDrawing">
+<w:document xmlns:wpc="http://schemas.microsoft.com/office/word/2010/wordprocessingCanvas" xmlns:cx="http://schemas.microsoft.com/office/drawing/2014/chartex" xmlns:cx1="http://schemas.microsoft.com/office/drawing/2015/9/8/chartex" xmlns:cx2="http://schemas.microsoft.com/office/drawing/2015/10/21/chartex" xmlns:cx3="http://schemas.microsoft.com/office/drawing/2016/5/9/chartex" xmlns:cx4="http://schemas.microsoft.com/office/drawing/2016/5/10/chartex" xmlns:cx5="http://schemas.microsoft.com/office/drawing/2016/5/11/chartex" xmlns:cx6="http://schemas.microsoft.com/office/drawing/2016/5/12/chartex" xmlns:cx7="http://schemas.microsoft.com/office/drawing/2016/5/13/chartex" xmlns:cx8="http://schemas.microsoft.com/office/drawing/2016/5/14/chartex" xmlns:mc="http://schemas.openxmlformats.org/markup-compatibility/2006" xmlns:aink="http://schemas.microsoft.com/office/drawing/2016/ink" xmlns:am3d="http://schemas.microsoft.com/office/drawing/2017/model3d" xmlns:o="urn:schemas-microsoft-com:office:office" xmlns:r="http://schemas.openxmlformats.org/officeDocument/2006/relationships" xmlns:m="http://schemas.openxmlformats.org/officeDocument/2006/math" xmlns:v="urn:schemas-microsoft-com:vml" xmlns:wp14="http://schemas.microsoft.com/office/word/2010/wordprocessingDrawing" xmlns:wp="http://schemas.openxmlformats.org/drawingml/2006/wordprocessingDrawing" xmlns:w10="urn:schemas-microsoft-com:office:word" xmlns:w="http://schemas.openxmlformats.org/wordprocessingml/2006/main" xmlns:w14="http://schemas.microsoft.com/office/word/2010/wordml" xmlns:w15="http://schemas.microsoft.com/office/word/2012/wordml" xmlns:w16cex="http://schemas.microsoft.com/office/word/2018/wordml/cex" xmlns:w16cid="http://schemas.microsoft.com/office/word/2016/wordml/cid" xmlns:w16="http://schemas.microsoft.com/office/word/2018/wordml" xmlns:w16sdtdh="http://schemas.microsoft.com/office/word/2020/wordml/sdtdatahash" xmlns:w16se="http://schemas.microsoft.com/office/word/2015/wordml/symex" xmlns:wpg="http://schemas.microsoft.com/office/word/2010/wordprocessingGroup" xmlns:wpi="http://schemas.microsoft.com/office/word/2010/wordprocessingInk" xmlns:wne="http://schemas.microsoft.com/office/word/2006/wordml" xmlns:wps="http://schemas.microsoft.com/office/word/2010/wordprocessingShape" mc:Ignorable="w14 w15 w16se w16cid w16 w16cex w16sdtdh wp14">
   <w:body>
     <w:p>
       <w:pPr>
-        <w:pStyle w:val="Title"/>
-      </w:pPr>
-      <w:r>
-        <w:t xml:space="preserve">Rumbo — Inteligencia artificial</w:t>
-      </w:r>
-    </w:p>
-    <w:p>
-      <w:pPr>
-        <w:pStyle w:val="Subtitle"/>
-      </w:pPr>
-      <w:r>
-        <w:t xml:space="preserve">Universidad de Morón · Ingeniería Informática — Trabajo de Campo (PC1)</w:t>
+        <w:pStyle w:val="Ttulo"/>
+      </w:pPr>
+      <w:r>
+        <w:t>Rumbo — Inteligencia artificial</w:t>
+      </w:r>
+    </w:p>
+    <w:p>
+      <w:pPr>
+        <w:pStyle w:val="Subttulo"/>
+      </w:pPr>
+      <w:r>
+        <w:t>Universidad de Morón · Ingeniería Informática — Trabajo de Campo (PC1)</w:t>
       </w:r>
     </w:p>
     <w:p>
@@ -23,7 +23,7 @@
         <w:pStyle w:val="Author"/>
       </w:pPr>
       <w:r>
-        <w:t xml:space="preserve">Francisco Luciano</w:t>
+        <w:t>Francisco Luciano</w:t>
       </w:r>
     </w:p>
     <w:p>
@@ -31,7 +31,7 @@
         <w:pStyle w:val="Author"/>
       </w:pPr>
       <w:r>
-        <w:t xml:space="preserve">Nahuel Viniegra</w:t>
+        <w:t>Nahuel Viniegra</w:t>
       </w:r>
     </w:p>
     <w:p>
@@ -39,74 +39,292 @@
         <w:pStyle w:val="Author"/>
       </w:pPr>
       <w:r>
-        <w:t xml:space="preserve">Paloma Patiño</w:t>
-      </w:r>
-    </w:p>
-    <w:p>
-      <w:pPr>
-        <w:pStyle w:val="Date"/>
-      </w:pPr>
-      <w:r>
-        <w:t xml:space="preserve">2.º cuatrimestre 2026 · Entrega: 02/10/26</w:t>
+        <w:t>Paloma Patiño</w:t>
+      </w:r>
+    </w:p>
+    <w:p>
+      <w:pPr>
+        <w:pStyle w:val="Fecha"/>
+      </w:pPr>
+      <w:r>
+        <w:t>2.º cuatrimestre 2026 · Entrega: 02/10/26</w:t>
       </w:r>
     </w:p>
     <w:sdt>
       <w:sdtPr>
+        <w:rPr>
+          <w:rFonts w:ascii="Cambria" w:eastAsia="Times New Roman" w:hAnsi="Cambria" w:cs="Cambria"/>
+          <w:color w:val="auto"/>
+          <w:sz w:val="22"/>
+          <w:szCs w:val="22"/>
+        </w:rPr>
+        <w:id w:val="18514326"/>
         <w:docPartObj>
           <w:docPartGallery w:val="Table of Contents"/>
           <w:docPartUnique/>
         </w:docPartObj>
       </w:sdtPr>
+      <w:sdtEndPr/>
       <w:sdtContent>
         <w:p>
           <w:pPr>
-            <w:pStyle w:val="TOCHeading"/>
+            <w:pStyle w:val="TtuloTDC"/>
           </w:pPr>
           <w:r>
-            <w:t xml:space="preserve">Índice</w:t>
+            <w:t>Índice</w:t>
           </w:r>
         </w:p>
         <w:p>
+          <w:pPr>
+            <w:pStyle w:val="TDC1"/>
+            <w:tabs>
+              <w:tab w:val="right" w:leader="dot" w:pos="9060"/>
+            </w:tabs>
+            <w:rPr>
+              <w:noProof/>
+            </w:rPr>
+          </w:pPr>
           <w:r>
-            <w:fldChar w:fldCharType="begin" w:dirty="true"/>
-            <w:instrText xml:space="preserve">TOC \o "1-1" \h \z \u</w:instrText>
+            <w:fldChar w:fldCharType="begin"/>
+          </w:r>
+          <w:r>
+            <w:instrText>TOC \o "1-1" \h \z \u</w:instrText>
+          </w:r>
+          <w:r>
             <w:fldChar w:fldCharType="separate"/>
+          </w:r>
+          <w:hyperlink w:anchor="_Toc242390593" w:history="1">
+            <w:r>
+              <w:rPr>
+                <w:rStyle w:val="Hipervnculo"/>
+                <w:noProof/>
+              </w:rPr>
+              <w:t>Presentación</w:t>
+            </w:r>
+            <w:r>
+              <w:rPr>
+                <w:noProof/>
+                <w:webHidden/>
+              </w:rPr>
+              <w:tab/>
+            </w:r>
+            <w:r>
+              <w:rPr>
+                <w:noProof/>
+                <w:webHidden/>
+              </w:rPr>
+              <w:fldChar w:fldCharType="begin"/>
+            </w:r>
+            <w:r>
+              <w:rPr>
+                <w:noProof/>
+                <w:webHidden/>
+              </w:rPr>
+              <w:instrText xml:space="preserve"> PAGEREF _Toc242390593 \h </w:instrText>
+            </w:r>
+            <w:r>
+              <w:rPr>
+                <w:noProof/>
+                <w:webHidden/>
+              </w:rPr>
+            </w:r>
+            <w:r>
+              <w:rPr>
+                <w:noProof/>
+                <w:webHidden/>
+              </w:rPr>
+              <w:fldChar w:fldCharType="separate"/>
+            </w:r>
+            <w:r>
+              <w:rPr>
+                <w:noProof/>
+                <w:webHidden/>
+              </w:rPr>
+              <w:t>3</w:t>
+            </w:r>
+            <w:r>
+              <w:rPr>
+                <w:noProof/>
+                <w:webHidden/>
+              </w:rPr>
+              <w:fldChar w:fldCharType="end"/>
+            </w:r>
+          </w:hyperlink>
+        </w:p>
+        <w:p>
+          <w:pPr>
+            <w:pStyle w:val="TDC1"/>
+            <w:tabs>
+              <w:tab w:val="right" w:leader="dot" w:pos="9060"/>
+            </w:tabs>
+            <w:rPr>
+              <w:noProof/>
+            </w:rPr>
+          </w:pPr>
+          <w:hyperlink w:anchor="_Toc242390594" w:history="1">
+            <w:r>
+              <w:rPr>
+                <w:rStyle w:val="Hipervnculo"/>
+                <w:noProof/>
+              </w:rPr>
+              <w:t>Modelo de IA del producto</w:t>
+            </w:r>
+            <w:r>
+              <w:rPr>
+                <w:noProof/>
+                <w:webHidden/>
+              </w:rPr>
+              <w:tab/>
+            </w:r>
+            <w:r>
+              <w:rPr>
+                <w:noProof/>
+                <w:webHidden/>
+              </w:rPr>
+              <w:fldChar w:fldCharType="begin"/>
+            </w:r>
+            <w:r>
+              <w:rPr>
+                <w:noProof/>
+                <w:webHidden/>
+              </w:rPr>
+              <w:instrText xml:space="preserve"> PAGEREF _Toc242390594 \h </w:instrText>
+            </w:r>
+            <w:r>
+              <w:rPr>
+                <w:noProof/>
+                <w:webHidden/>
+              </w:rPr>
+            </w:r>
+            <w:r>
+              <w:rPr>
+                <w:noProof/>
+                <w:webHidden/>
+              </w:rPr>
+              <w:fldChar w:fldCharType="separate"/>
+            </w:r>
+            <w:r>
+              <w:rPr>
+                <w:noProof/>
+                <w:webHidden/>
+              </w:rPr>
+              <w:t>4</w:t>
+            </w:r>
+            <w:r>
+              <w:rPr>
+                <w:noProof/>
+                <w:webHidden/>
+              </w:rPr>
+              <w:fldChar w:fldCharType="end"/>
+            </w:r>
+          </w:hyperlink>
+        </w:p>
+        <w:p>
+          <w:pPr>
+            <w:pStyle w:val="TDC1"/>
+            <w:tabs>
+              <w:tab w:val="right" w:leader="dot" w:pos="9060"/>
+            </w:tabs>
+            <w:rPr>
+              <w:noProof/>
+            </w:rPr>
+          </w:pPr>
+          <w:hyperlink w:anchor="_Toc242390595" w:history="1">
+            <w:r>
+              <w:rPr>
+                <w:rStyle w:val="Hipervnculo"/>
+                <w:noProof/>
+              </w:rPr>
+              <w:t>Agentes de IA del proyecto</w:t>
+            </w:r>
+            <w:r>
+              <w:rPr>
+                <w:noProof/>
+                <w:webHidden/>
+              </w:rPr>
+              <w:tab/>
+            </w:r>
+            <w:r>
+              <w:rPr>
+                <w:noProof/>
+                <w:webHidden/>
+              </w:rPr>
+              <w:fldChar w:fldCharType="begin"/>
+            </w:r>
+            <w:r>
+              <w:rPr>
+                <w:noProof/>
+                <w:webHidden/>
+              </w:rPr>
+              <w:instrText xml:space="preserve"> PAGEREF _Toc242390595 \h </w:instrText>
+            </w:r>
+            <w:r>
+              <w:rPr>
+                <w:noProof/>
+                <w:webHidden/>
+              </w:rPr>
+            </w:r>
+            <w:r>
+              <w:rPr>
+                <w:noProof/>
+                <w:webHidden/>
+              </w:rPr>
+              <w:fldChar w:fldCharType="separate"/>
+            </w:r>
+            <w:r>
+              <w:rPr>
+                <w:noProof/>
+                <w:webHidden/>
+              </w:rPr>
+              <w:t>5</w:t>
+            </w:r>
+            <w:r>
+              <w:rPr>
+                <w:noProof/>
+                <w:webHidden/>
+              </w:rPr>
+              <w:fldChar w:fldCharType="end"/>
+            </w:r>
+          </w:hyperlink>
+        </w:p>
+        <w:p>
+          <w:r>
             <w:fldChar w:fldCharType="end"/>
           </w:r>
         </w:p>
       </w:sdtContent>
     </w:sdt>
-    <w:bookmarkStart w:id="49" w:name="_presentación"/>
-    <w:p>
-      <w:pPr>
-        <w:pStyle w:val="Heading1"/>
-      </w:pPr>
-      <w:r>
-        <w:t xml:space="preserve">Presentación</w:t>
-      </w:r>
+    <w:p>
+      <w:pPr>
+        <w:pStyle w:val="Ttulo1"/>
+      </w:pPr>
+      <w:bookmarkStart w:id="0" w:name="_presentación"/>
+      <w:bookmarkStart w:id="1" w:name="_Toc242390593"/>
+      <w:r>
+        <w:lastRenderedPageBreak/>
+        <w:t>Presentación</w:t>
+      </w:r>
+      <w:bookmarkEnd w:id="1"/>
     </w:p>
     <w:p>
       <w:pPr>
         <w:pStyle w:val="FirstParagraph"/>
       </w:pPr>
       <w:r>
-        <w:t xml:space="preserve">En</w:t>
-      </w:r>
-      <w:r>
-        <w:t xml:space="preserve"> </w:t>
+        <w:t xml:space="preserve">En </w:t>
       </w:r>
       <w:r>
         <w:rPr>
           <w:b/>
           <w:bCs/>
         </w:rPr>
-        <w:t xml:space="preserve">Rumbo</w:t>
+        <w:t>Rumbo</w:t>
       </w:r>
       <w:r>
         <w:t xml:space="preserve"> </w:t>
       </w:r>
       <w:r>
-        <w:t xml:space="preserve">la inteligencia artificial aparece en dos lugares distintos, que se documentan por separado:</w:t>
+        <w:t>la inteligencia artificial aparece en dos lugares distintos, que se documentan por separado:</w:t>
       </w:r>
     </w:p>
     <w:p>
@@ -114,7 +332,7 @@
         <w:pStyle w:val="Compact"/>
         <w:numPr>
           <w:ilvl w:val="0"/>
-          <w:numId w:val="1001"/>
+          <w:numId w:val="2"/>
         </w:numPr>
       </w:pPr>
       <w:r>
@@ -122,13 +340,13 @@
           <w:b/>
           <w:bCs/>
         </w:rPr>
-        <w:t xml:space="preserve">Dentro del producto:</w:t>
-      </w:r>
-      <w:r>
-        <w:t xml:space="preserve"> </w:t>
-      </w:r>
-      <w:r>
-        <w:t xml:space="preserve">una única función del sistema usa un modelo de IA para generar borradores de contenido para redes sociales. La primera sección presenta el modelo elegido y la justificación de la elección.</w:t>
+        <w:t>Dentro del producto:</w:t>
+      </w:r>
+      <w:r>
+        <w:t xml:space="preserve"> una única función del sistema usa un modelo de IA para generar borradores de contenido para redes sociales. La primera sección presenta el mod</w:t>
+      </w:r>
+      <w:r>
+        <w:t>elo elegido y la justificación de la elección.</w:t>
       </w:r>
     </w:p>
     <w:p>
@@ -136,7 +354,7 @@
         <w:pStyle w:val="Compact"/>
         <w:numPr>
           <w:ilvl w:val="0"/>
-          <w:numId w:val="1001"/>
+          <w:numId w:val="2"/>
         </w:numPr>
       </w:pPr>
       <w:r>
@@ -144,13 +362,13 @@
           <w:b/>
           <w:bCs/>
         </w:rPr>
-        <w:t xml:space="preserve">Para desarrollar el producto:</w:t>
-      </w:r>
-      <w:r>
-        <w:t xml:space="preserve"> </w:t>
-      </w:r>
-      <w:r>
-        <w:t xml:space="preserve">el equipo trabaja con agentes de IA para analizar, diseñar y documentar el sistema. La segunda sección describe cada agente, qué hace, con qué modelos y herramientas trabaja y qué límites tiene.</w:t>
+        <w:t>Para desarrollar el producto:</w:t>
+      </w:r>
+      <w:r>
+        <w:t xml:space="preserve"> el equipo trabaja con agentes de IA para analizar, diseñar y documentar el sistema. La segunda sección describe cada agente, qué hace, con qué modelos y herramientas trabaja y qué</w:t>
+      </w:r>
+      <w:r>
+        <w:t xml:space="preserve"> límites tiene.</w:t>
       </w:r>
     </w:p>
     <w:p>
@@ -158,26 +376,29 @@
         <w:pStyle w:val="FirstParagraph"/>
       </w:pPr>
       <w:r>
-        <w:t xml:space="preserve">La elección de Claude como herramienta de trabajo del equipo, y la comparación con otros asistentes, forman parte del documento de relevamiento.</w:t>
-      </w:r>
-    </w:p>
-    <w:bookmarkEnd w:id="49"/>
-    <w:bookmarkStart w:id="54" w:name="_ad21453a9cb8517835b9c30406213db7b4da246"/>
-    <w:p>
-      <w:pPr>
-        <w:pStyle w:val="Heading1"/>
-      </w:pPr>
-      <w:r>
-        <w:t xml:space="preserve">Modelo de IA del producto</w:t>
-      </w:r>
-    </w:p>
-    <w:bookmarkStart w:id="50" w:name="_contexto"/>
-    <w:p>
-      <w:pPr>
-        <w:pStyle w:val="Heading2"/>
-      </w:pPr>
-      <w:r>
-        <w:t xml:space="preserve">Contexto</w:t>
+        <w:t>La elección de Claude como herramienta de trabajo del equipo, y la comparación con otros asistentes, forman parte del documento de relevamiento.</w:t>
+      </w:r>
+    </w:p>
+    <w:p>
+      <w:pPr>
+        <w:pStyle w:val="Ttulo1"/>
+      </w:pPr>
+      <w:bookmarkStart w:id="2" w:name="_ad21453a9cb8517835b9c30406213db7b4da246"/>
+      <w:bookmarkStart w:id="3" w:name="_Toc242390594"/>
+      <w:bookmarkEnd w:id="0"/>
+      <w:r>
+        <w:lastRenderedPageBreak/>
+        <w:t>Modelo de IA del producto</w:t>
+      </w:r>
+      <w:bookmarkEnd w:id="3"/>
+    </w:p>
+    <w:p>
+      <w:pPr>
+        <w:pStyle w:val="Ttulo2"/>
+      </w:pPr>
+      <w:bookmarkStart w:id="4" w:name="_contexto"/>
+      <w:r>
+        <w:t>Contexto</w:t>
       </w:r>
     </w:p>
     <w:p>
@@ -185,17 +406,23 @@
         <w:pStyle w:val="FirstParagraph"/>
       </w:pPr>
       <w:r>
-        <w:t xml:space="preserve">La única función de Rumbo que usa IA es CU-20: a partir del tema, el canal y el tono, genera un borrador de posteo en español que una persona revisa antes de usarlo. El stack del proyecto ya fijó LangChain y Claude. Falta elegir qué modelo de Claude se usa. El volumen esperado es bajo: unas decenas de borradores por mes.</w:t>
-      </w:r>
-    </w:p>
-    <w:bookmarkEnd w:id="50"/>
-    <w:bookmarkStart w:id="51" w:name="_decisión"/>
-    <w:p>
-      <w:pPr>
-        <w:pStyle w:val="Heading2"/>
-      </w:pPr>
-      <w:r>
-        <w:t xml:space="preserve">Decisión</w:t>
+        <w:t xml:space="preserve">La única función de Rumbo que usa IA es CU-20: a partir del </w:t>
+      </w:r>
+      <w:r>
+        <w:t>tema, el canal y el tono, genera un borrador de posteo en español que una persona revisa antes de usarlo. El stack del proyecto ya fijó LangChain y Claude. Falta elegir qué modelo de Claude se usa. El volumen esperado es bajo: unas decenas de borradores po</w:t>
+      </w:r>
+      <w:r>
+        <w:t>r mes.</w:t>
+      </w:r>
+    </w:p>
+    <w:p>
+      <w:pPr>
+        <w:pStyle w:val="Ttulo2"/>
+      </w:pPr>
+      <w:bookmarkStart w:id="5" w:name="_decisión"/>
+      <w:bookmarkEnd w:id="4"/>
+      <w:r>
+        <w:t>Decisión</w:t>
       </w:r>
     </w:p>
     <w:p>
@@ -203,7 +430,7 @@
         <w:pStyle w:val="Compact"/>
         <w:numPr>
           <w:ilvl w:val="0"/>
-          <w:numId w:val="1002"/>
+          <w:numId w:val="3"/>
         </w:numPr>
       </w:pPr>
       <w:r>
@@ -211,22 +438,19 @@
           <w:b/>
           <w:bCs/>
         </w:rPr>
-        <w:t xml:space="preserve">Modelo: Claude Sonnet 5.5</w:t>
-      </w:r>
-      <w:r>
-        <w:t xml:space="preserve"> </w:t>
-      </w:r>
-      <w:r>
-        <w:t xml:space="preserve">(</w:t>
+        <w:t>Modelo: Claude Sonnet 5.5</w:t>
+      </w:r>
+      <w:r>
+        <w:t xml:space="preserve"> (</w:t>
       </w:r>
       <w:r>
         <w:rPr>
           <w:rStyle w:val="VerbatimChar"/>
         </w:rPr>
-        <w:t xml:space="preserve">claude-sonnet-5-5</w:t>
-      </w:r>
-      <w:r>
-        <w:t xml:space="preserve">).</w:t>
+        <w:t>claude-sonnet-5-5</w:t>
+      </w:r>
+      <w:r>
+        <w:t>).</w:t>
       </w:r>
     </w:p>
     <w:p>
@@ -234,7 +458,7 @@
         <w:pStyle w:val="Compact"/>
         <w:numPr>
           <w:ilvl w:val="0"/>
-          <w:numId w:val="1002"/>
+          <w:numId w:val="3"/>
         </w:numPr>
       </w:pPr>
       <w:r>
@@ -242,220 +466,240 @@
           <w:b/>
           <w:bCs/>
         </w:rPr>
-        <w:t xml:space="preserve">Integración:</w:t>
-      </w:r>
-      <w:r>
-        <w:t xml:space="preserve"> </w:t>
-      </w:r>
-      <w:r>
-        <w:t xml:space="preserve">el backend arma, con LangChain, una plantilla de prompt con tres variables (tema, canal y tono) y devuelve un único borrador por pedido, que se puede regenerar. El modelo</w:t>
-      </w:r>
-      <w:r>
-        <w:t xml:space="preserve"> </w:t>
+        <w:t>Integración:</w:t>
+      </w:r>
+      <w:r>
+        <w:t xml:space="preserve"> el backend arma, con LangChain, una plantilla de prompt con tres variables (tema, canal y tono) y devuelve un único borrador por pedido, que se puede regenerar. El modelo </w:t>
       </w:r>
       <w:r>
         <w:rPr>
           <w:b/>
           <w:bCs/>
         </w:rPr>
-        <w:t xml:space="preserve">no recibe datos de clientes</w:t>
-      </w:r>
-      <w:r>
-        <w:t xml:space="preserve"> </w:t>
-      </w:r>
-      <w:r>
-        <w:t xml:space="preserve">ni</w:t>
-      </w:r>
-      <w:r>
-        <w:t xml:space="preserve"> </w:t>
+        <w:t>no recibe</w:t>
       </w:r>
       <w:r>
         <w:rPr>
           <w:b/>
           <w:bCs/>
         </w:rPr>
-        <w:t xml:space="preserve">publica</w:t>
-      </w:r>
-      <w:r>
-        <w:t xml:space="preserve"> </w:t>
-      </w:r>
-      <w:r>
-        <w:t xml:space="preserve">nada: la publicación sigue siendo manual (Alcance y fuera de alcance).</w:t>
-      </w:r>
-    </w:p>
-    <w:bookmarkEnd w:id="51"/>
-    <w:bookmarkStart w:id="52" w:name="_1f3f4284a98ed5deeb904a9dfba2e4cf8d2fc60"/>
-    <w:p>
-      <w:pPr>
-        <w:pStyle w:val="Heading2"/>
-      </w:pPr>
-      <w:r>
-        <w:t xml:space="preserve">Alternativas consideradas</w:t>
+        <w:t xml:space="preserve"> datos de clientes</w:t>
+      </w:r>
+      <w:r>
+        <w:t xml:space="preserve"> ni </w:t>
+      </w:r>
+      <w:r>
+        <w:rPr>
+          <w:b/>
+          <w:bCs/>
+        </w:rPr>
+        <w:t>publica</w:t>
+      </w:r>
+      <w:r>
+        <w:t xml:space="preserve"> nada: la publicación sigue siendo manual (Alcance y fuera de alcance).</w:t>
+      </w:r>
+    </w:p>
+    <w:p>
+      <w:pPr>
+        <w:pStyle w:val="Ttulo2"/>
+      </w:pPr>
+      <w:bookmarkStart w:id="6" w:name="_1f3f4284a98ed5deeb904a9dfba2e4cf8d2fc60"/>
+      <w:bookmarkEnd w:id="5"/>
+      <w:r>
+        <w:t>Alternativas consideradas</w:t>
       </w:r>
     </w:p>
     <w:tbl>
       <w:tblPr>
         <w:tblStyle w:val="Table"/>
-        <w:tblW w:type="pct" w:w="5000"/>
+        <w:tblW w:w="5000" w:type="pct"/>
         <w:tblLayout w:type="fixed"/>
-        <w:tblLook w:firstRow="1" w:lastRow="0" w:firstColumn="0" w:lastColumn="0" w:noHBand="0" w:noVBand="0" w:val="0020"/>
+        <w:tblLook w:val="0020" w:firstRow="1" w:lastRow="0" w:firstColumn="0" w:lastColumn="0" w:noHBand="0" w:noVBand="0"/>
       </w:tblPr>
       <w:tblGrid>
-        <w:gridCol w:w="1980"/>
-        <w:gridCol w:w="1980"/>
-        <w:gridCol w:w="1980"/>
-        <w:gridCol w:w="1980"/>
+        <w:gridCol w:w="2321"/>
+        <w:gridCol w:w="2321"/>
+        <w:gridCol w:w="2322"/>
+        <w:gridCol w:w="2322"/>
       </w:tblGrid>
       <w:tr>
         <w:trPr>
-          <w:tblHeader w:val="on"/>
+          <w:cnfStyle w:val="100000000000" w:firstRow="1" w:lastRow="0" w:firstColumn="0" w:lastColumn="0" w:oddVBand="0" w:evenVBand="0" w:oddHBand="0" w:evenHBand="0" w:firstRowFirstColumn="0" w:firstRowLastColumn="0" w:lastRowFirstColumn="0" w:lastRowLastColumn="0"/>
+          <w:tblHeader/>
         </w:trPr>
         <w:tc>
-          <w:tcPr/>
+          <w:tcPr>
+            <w:tcW w:w="1980" w:type="dxa"/>
+          </w:tcPr>
           <w:p>
             <w:pPr>
               <w:pStyle w:val="Compact"/>
             </w:pPr>
             <w:r>
-              <w:t xml:space="preserve">Opción</w:t>
+              <w:t>Opción</w:t>
             </w:r>
           </w:p>
         </w:tc>
         <w:tc>
-          <w:tcPr/>
+          <w:tcPr>
+            <w:tcW w:w="1980" w:type="dxa"/>
+          </w:tcPr>
           <w:p>
             <w:pPr>
               <w:pStyle w:val="Compact"/>
             </w:pPr>
             <w:r>
-              <w:t xml:space="preserve">Pros</w:t>
+              <w:t>Pros</w:t>
             </w:r>
           </w:p>
         </w:tc>
         <w:tc>
-          <w:tcPr/>
+          <w:tcPr>
+            <w:tcW w:w="1980" w:type="dxa"/>
+          </w:tcPr>
           <w:p>
             <w:pPr>
               <w:pStyle w:val="Compact"/>
             </w:pPr>
             <w:r>
-              <w:t xml:space="preserve">Contras</w:t>
+              <w:t>Contras</w:t>
             </w:r>
           </w:p>
         </w:tc>
         <w:tc>
-          <w:tcPr/>
+          <w:tcPr>
+            <w:tcW w:w="1980" w:type="dxa"/>
+          </w:tcPr>
           <w:p>
             <w:pPr>
               <w:pStyle w:val="Compact"/>
             </w:pPr>
             <w:r>
-              <w:t xml:space="preserve">¿Elegida?</w:t>
+              <w:t>¿Elegida?</w:t>
             </w:r>
           </w:p>
         </w:tc>
       </w:tr>
       <w:tr>
         <w:tc>
-          <w:tcPr/>
+          <w:tcPr>
+            <w:tcW w:w="1980" w:type="dxa"/>
+          </w:tcPr>
           <w:p>
             <w:pPr>
               <w:pStyle w:val="Compact"/>
             </w:pPr>
             <w:r>
-              <w:t xml:space="preserve">Claude Sonnet 5.5</w:t>
+              <w:t>Claude Sonnet 5.5</w:t>
             </w:r>
           </w:p>
         </w:tc>
         <w:tc>
-          <w:tcPr/>
+          <w:tcPr>
+            <w:tcW w:w="1980" w:type="dxa"/>
+          </w:tcPr>
           <w:p>
             <w:pPr>
               <w:pStyle w:val="Compact"/>
             </w:pPr>
             <w:r>
-              <w:t xml:space="preserve">Mejor calidad de texto en español; USD 2 por millón de tokens de entrada y USD 10 de salida</w:t>
+              <w:t>Mejor calidad de texto en español; USD 2 por millón de tokens de entrada y USD 10 de salida</w:t>
             </w:r>
           </w:p>
         </w:tc>
         <w:tc>
-          <w:tcPr/>
+          <w:tcPr>
+            <w:tcW w:w="1980" w:type="dxa"/>
+          </w:tcPr>
           <w:p>
             <w:pPr>
               <w:pStyle w:val="Compact"/>
             </w:pPr>
             <w:r>
-              <w:t xml:space="preserve">Duplica el precio de Haiku</w:t>
+              <w:t>Duplica el precio de Haiku</w:t>
             </w:r>
           </w:p>
         </w:tc>
         <w:tc>
-          <w:tcPr/>
+          <w:tcPr>
+            <w:tcW w:w="1980" w:type="dxa"/>
+          </w:tcPr>
           <w:p>
             <w:pPr>
               <w:pStyle w:val="Compact"/>
             </w:pPr>
             <w:r>
-              <w:t xml:space="preserve">Sí</w:t>
+              <w:t>Sí</w:t>
             </w:r>
           </w:p>
         </w:tc>
       </w:tr>
       <w:tr>
         <w:tc>
-          <w:tcPr/>
+          <w:tcPr>
+            <w:tcW w:w="1980" w:type="dxa"/>
+          </w:tcPr>
           <w:p>
             <w:pPr>
               <w:pStyle w:val="Compact"/>
             </w:pPr>
             <w:r>
-              <w:t xml:space="preserve">Claude Haiku 4.5</w:t>
+              <w:t>Claude Haiku 4.5</w:t>
             </w:r>
           </w:p>
         </w:tc>
         <w:tc>
-          <w:tcPr/>
+          <w:tcPr>
+            <w:tcW w:w="1980" w:type="dxa"/>
+          </w:tcPr>
           <w:p>
             <w:pPr>
               <w:pStyle w:val="Compact"/>
             </w:pPr>
             <w:r>
-              <w:t xml:space="preserve">Más rápido; USD 1 de entrada y USD 5 de salida por millón de tokens</w:t>
+              <w:t>Más rápido; USD 1 de entrada y USD 5 de salida por millón de tokens</w:t>
             </w:r>
           </w:p>
         </w:tc>
         <w:tc>
-          <w:tcPr/>
+          <w:tcPr>
+            <w:tcW w:w="1980" w:type="dxa"/>
+          </w:tcPr>
           <w:p>
             <w:pPr>
               <w:pStyle w:val="Compact"/>
             </w:pPr>
             <w:r>
-              <w:t xml:space="preserve">Texto de marketing de menor calidad</w:t>
+              <w:t>Texto de marketing de menor calidad</w:t>
             </w:r>
           </w:p>
         </w:tc>
         <w:tc>
-          <w:tcPr/>
+          <w:tcPr>
+            <w:tcW w:w="1980" w:type="dxa"/>
+          </w:tcPr>
           <w:p>
             <w:pPr>
               <w:pStyle w:val="Compact"/>
             </w:pPr>
             <w:r>
-              <w:t xml:space="preserve">No</w:t>
+              <w:t>No</w:t>
             </w:r>
           </w:p>
         </w:tc>
       </w:tr>
     </w:tbl>
-    <w:bookmarkEnd w:id="52"/>
-    <w:bookmarkStart w:id="53" w:name="_justificación"/>
-    <w:p>
-      <w:pPr>
-        <w:pStyle w:val="Heading2"/>
-      </w:pPr>
-      <w:r>
-        <w:t xml:space="preserve">Justificación</w:t>
+    <w:p>
+      <w:pPr>
+        <w:pStyle w:val="Ttulo2"/>
+      </w:pPr>
+      <w:bookmarkStart w:id="7" w:name="_justificación"/>
+      <w:bookmarkEnd w:id="6"/>
+      <w:r>
+        <w:t>Justific</w:t>
+      </w:r>
+      <w:r>
+        <w:t>ación</w:t>
       </w:r>
     </w:p>
     <w:p>
@@ -463,27 +707,33 @@
         <w:pStyle w:val="FirstParagraph"/>
       </w:pPr>
       <w:r>
-        <w:t xml:space="preserve">Con unas decenas de borradores por mes, el costo es despreciable con cualquiera de los dos modelos: la diferencia se mide en centavos de dólar por mes. Lo que la agencia percibe es la calidad del texto, así que se elige el modelo de más calidad. Precios de la API de Anthropic al 25/09/26.</w:t>
-      </w:r>
-    </w:p>
-    <w:bookmarkEnd w:id="53"/>
-    <w:bookmarkEnd w:id="54"/>
-    <w:bookmarkStart w:id="64" w:name="_5241afa51979dc50aec79fd41f92dbabf0e9329"/>
-    <w:p>
-      <w:pPr>
-        <w:pStyle w:val="Heading1"/>
-      </w:pPr>
-      <w:r>
-        <w:t xml:space="preserve">Agentes de IA del proyecto</w:t>
-      </w:r>
-    </w:p>
-    <w:bookmarkStart w:id="58" w:name="_85a7dd45267a94ed7ecc9c0021079e9a5aab1f6"/>
-    <w:p>
-      <w:pPr>
-        <w:pStyle w:val="Heading2"/>
-      </w:pPr>
-      <w:r>
-        <w:t xml:space="preserve">Ciclo de trabajo con el agente</w:t>
+        <w:t>Con unas decenas de borradores por mes, el costo es despreciable con cualquiera de los dos modelos: la diferencia se mide en centavos de dólar por mes. Lo que la agencia percibe es la calidad del texto, así que se elige el modelo de más calidad. Prec</w:t>
+      </w:r>
+      <w:r>
+        <w:t>ios de la API de Anthropic al 25/09/26.</w:t>
+      </w:r>
+    </w:p>
+    <w:p>
+      <w:pPr>
+        <w:pStyle w:val="Ttulo1"/>
+      </w:pPr>
+      <w:bookmarkStart w:id="8" w:name="_5241afa51979dc50aec79fd41f92dbabf0e9329"/>
+      <w:bookmarkStart w:id="9" w:name="_Toc242390595"/>
+      <w:bookmarkEnd w:id="2"/>
+      <w:bookmarkEnd w:id="7"/>
+      <w:r>
+        <w:lastRenderedPageBreak/>
+        <w:t>Agentes de IA del proyecto</w:t>
+      </w:r>
+      <w:bookmarkEnd w:id="9"/>
+    </w:p>
+    <w:p>
+      <w:pPr>
+        <w:pStyle w:val="Ttulo2"/>
+      </w:pPr>
+      <w:bookmarkStart w:id="10" w:name="_85a7dd45267a94ed7ecc9c0021079e9a5aab1f6"/>
+      <w:r>
+        <w:t>Ciclo de trabajo con el agente</w:t>
       </w:r>
     </w:p>
     <w:p>
@@ -491,20 +741,17 @@
         <w:pStyle w:val="FirstParagraph"/>
       </w:pPr>
       <w:r>
-        <w:t xml:space="preserve">Cada sesión de trabajo con Claude Code sigue el mismo ciclo, definido en CLAUDE.md. El vault versionado con Git funciona como</w:t>
-      </w:r>
-      <w:r>
-        <w:t xml:space="preserve"> </w:t>
+        <w:t xml:space="preserve">Cada sesión de trabajo con Claude Code sigue el mismo ciclo, definido en CLAUDE.md. El vault versionado con Git funciona como </w:t>
       </w:r>
       <w:r>
         <w:rPr>
           <w:b/>
           <w:bCs/>
         </w:rPr>
-        <w:t xml:space="preserve">memoria compartida</w:t>
-      </w:r>
-      <w:r>
-        <w:t xml:space="preserve">: lo que no queda escrito en el vault no sobrevive al chat, y cada integrante retoma desde lo que dejó el otro.</w:t>
+        <w:t>memoria compartida</w:t>
+      </w:r>
+      <w:r>
+        <w:t>: lo que no queda escrito en el vault no sobrevive al chat, y cada integrante retoma desde lo que dejó el otro.</w:t>
       </w:r>
     </w:p>
     <w:p>
@@ -512,22 +759,27 @@
         <w:pStyle w:val="CaptionedFigure"/>
       </w:pPr>
       <w:r>
+        <w:rPr>
+          <w:noProof/>
+        </w:rPr>
+        <w:lastRenderedPageBreak/>
         <w:drawing>
-          <wp:inline>
-            <wp:extent cx="4027169" cy="13011925"/>
-            <wp:effectExtent b="0" l="0" r="0" t="0"/>
-            <wp:docPr descr="Figura 1. Ciclo de trabajo de una sesión con el agente." title="" id="56" name="Picture"/>
-            <a:graphic>
+          <wp:inline distT="0" distB="0" distL="0" distR="0" wp14:anchorId="7C0C170E" wp14:editId="3F26643E">
+            <wp:extent cx="4848225" cy="9829800"/>
+            <wp:effectExtent l="0" t="0" r="0" b="0"/>
+            <wp:docPr id="56" name="Picture" descr="Figura 1. Ciclo de trabajo de una sesión con el agente."/>
+            <wp:cNvGraphicFramePr/>
+            <a:graphic xmlns:a="http://schemas.openxmlformats.org/drawingml/2006/main">
               <a:graphicData uri="http://schemas.openxmlformats.org/drawingml/2006/picture">
-                <pic:pic>
+                <pic:pic xmlns:pic="http://schemas.openxmlformats.org/drawingml/2006/picture">
                   <pic:nvPicPr>
-                    <pic:cNvPr descr="IA-ciclo-de-trabajo.png" id="57" name="Picture"/>
+                    <pic:cNvPr id="57" name="Picture" descr="IA-ciclo-de-trabajo.png"/>
                     <pic:cNvPicPr>
-                      <a:picLocks noChangeArrowheads="1" noChangeAspect="1"/>
+                      <a:picLocks noChangeAspect="1" noChangeArrowheads="1"/>
                     </pic:cNvPicPr>
                   </pic:nvPicPr>
                   <pic:blipFill>
-                    <a:blip r:embed="rId55"/>
+                    <a:blip r:embed="rId7"/>
                     <a:stretch>
                       <a:fillRect/>
                     </a:stretch>
@@ -535,7 +787,7 @@
                   <pic:spPr bwMode="auto">
                     <a:xfrm>
                       <a:off x="0" y="0"/>
-                      <a:ext cx="4027169" cy="13011925"/>
+                      <a:ext cx="4851186" cy="9835804"/>
                     </a:xfrm>
                     <a:prstGeom prst="rect">
                       <a:avLst/>
@@ -559,17 +811,18 @@
         <w:pStyle w:val="ImageCaption"/>
       </w:pPr>
       <w:r>
-        <w:t xml:space="preserve">Figura 1. Ciclo de trabajo de una sesión con el agente.</w:t>
-      </w:r>
-    </w:p>
-    <w:bookmarkEnd w:id="58"/>
-    <w:bookmarkStart w:id="63" w:name="_agentes"/>
-    <w:p>
-      <w:pPr>
-        <w:pStyle w:val="Heading2"/>
-      </w:pPr>
-      <w:r>
-        <w:t xml:space="preserve">Agentes</w:t>
+        <w:lastRenderedPageBreak/>
+        <w:t>Figura 1. Ciclo de trabajo de una sesión con el agente.</w:t>
+      </w:r>
+    </w:p>
+    <w:p>
+      <w:pPr>
+        <w:pStyle w:val="Ttulo2"/>
+      </w:pPr>
+      <w:bookmarkStart w:id="11" w:name="_agentes"/>
+      <w:bookmarkEnd w:id="10"/>
+      <w:r>
+        <w:t>Agentes</w:t>
       </w:r>
     </w:p>
     <w:p>
@@ -577,174 +830,181 @@
         <w:pStyle w:val="FirstParagraph"/>
       </w:pPr>
       <w:r>
-        <w:t xml:space="preserve">El equipo trabaja con</w:t>
-      </w:r>
-      <w:r>
-        <w:t xml:space="preserve"> </w:t>
+        <w:t xml:space="preserve">El equipo trabaja con </w:t>
       </w:r>
       <w:r>
         <w:rPr>
           <w:b/>
           <w:bCs/>
         </w:rPr>
-        <w:t xml:space="preserve">un agente principal</w:t>
-      </w:r>
-      <w:r>
-        <w:t xml:space="preserve">, Claude Code, que según la tarea delega en</w:t>
-      </w:r>
-      <w:r>
-        <w:t xml:space="preserve"> </w:t>
+        <w:t>un agente principal</w:t>
+      </w:r>
+      <w:r>
+        <w:t xml:space="preserve">, Claude Code, que según la tarea delega en </w:t>
       </w:r>
       <w:r>
         <w:rPr>
           <w:b/>
           <w:bCs/>
         </w:rPr>
-        <w:t xml:space="preserve">subagentes</w:t>
-      </w:r>
-      <w:r>
-        <w:t xml:space="preserve"> </w:t>
-      </w:r>
-      <w:r>
-        <w:t xml:space="preserve">o se conecta con herramientas externas mediante</w:t>
-      </w:r>
-      <w:r>
-        <w:t xml:space="preserve"> </w:t>
+        <w:t>subagentes</w:t>
+      </w:r>
+      <w:r>
+        <w:t xml:space="preserve"> o se conecta con herramientas externas mediante </w:t>
       </w:r>
       <w:r>
         <w:rPr>
           <w:b/>
           <w:bCs/>
         </w:rPr>
-        <w:t xml:space="preserve">servidores MCP</w:t>
-      </w:r>
-      <w:r>
-        <w:t xml:space="preserve"> </w:t>
-      </w:r>
-      <w:r>
-        <w:t xml:space="preserve">(</w:t>
+        <w:t>servidores MCP</w:t>
+      </w:r>
+      <w:r>
+        <w:t xml:space="preserve"> (</w:t>
       </w:r>
       <w:r>
         <w:rPr>
           <w:i/>
           <w:iCs/>
         </w:rPr>
-        <w:t xml:space="preserve">Model Context Protocol</w:t>
-      </w:r>
-      <w:r>
-        <w:t xml:space="preserve">). La elección de Claude como agente de trabajo está justificada en Herramientas del proyecto.</w:t>
+        <w:t>Model Context Protocol</w:t>
+      </w:r>
+      <w:r>
+        <w:t>). La el</w:t>
+      </w:r>
+      <w:r>
+        <w:t>ección de Claude como agente de trabajo está justificada en Herramientas del proyecto.</w:t>
       </w:r>
     </w:p>
     <w:tbl>
       <w:tblPr>
         <w:tblStyle w:val="Table"/>
-        <w:tblW w:type="pct" w:w="5000"/>
+        <w:tblW w:w="5000" w:type="pct"/>
         <w:tblLayout w:type="fixed"/>
-        <w:tblLook w:firstRow="1" w:lastRow="0" w:firstColumn="0" w:lastColumn="0" w:noHBand="0" w:noVBand="0" w:val="0020"/>
+        <w:tblLook w:val="0020" w:firstRow="1" w:lastRow="0" w:firstColumn="0" w:lastColumn="0" w:noHBand="0" w:noVBand="0"/>
       </w:tblPr>
       <w:tblGrid>
-        <w:gridCol w:w="1584"/>
-        <w:gridCol w:w="1584"/>
-        <w:gridCol w:w="1584"/>
-        <w:gridCol w:w="1584"/>
-        <w:gridCol w:w="1584"/>
+        <w:gridCol w:w="1858"/>
+        <w:gridCol w:w="1857"/>
+        <w:gridCol w:w="1857"/>
+        <w:gridCol w:w="1857"/>
+        <w:gridCol w:w="1857"/>
       </w:tblGrid>
       <w:tr>
         <w:trPr>
-          <w:tblHeader w:val="on"/>
+          <w:cnfStyle w:val="100000000000" w:firstRow="1" w:lastRow="0" w:firstColumn="0" w:lastColumn="0" w:oddVBand="0" w:evenVBand="0" w:oddHBand="0" w:evenHBand="0" w:firstRowFirstColumn="0" w:firstRowLastColumn="0" w:lastRowFirstColumn="0" w:lastRowLastColumn="0"/>
+          <w:tblHeader/>
         </w:trPr>
         <w:tc>
-          <w:tcPr/>
+          <w:tcPr>
+            <w:tcW w:w="1584" w:type="dxa"/>
+          </w:tcPr>
           <w:p>
             <w:pPr>
               <w:pStyle w:val="Compact"/>
             </w:pPr>
             <w:r>
-              <w:t xml:space="preserve">Agente</w:t>
+              <w:t>Agente</w:t>
             </w:r>
           </w:p>
         </w:tc>
         <w:tc>
-          <w:tcPr/>
+          <w:tcPr>
+            <w:tcW w:w="1584" w:type="dxa"/>
+          </w:tcPr>
           <w:p>
             <w:pPr>
               <w:pStyle w:val="Compact"/>
             </w:pPr>
             <w:r>
-              <w:t xml:space="preserve">Rol</w:t>
+              <w:t>Rol</w:t>
             </w:r>
           </w:p>
         </w:tc>
         <w:tc>
-          <w:tcPr/>
+          <w:tcPr>
+            <w:tcW w:w="1584" w:type="dxa"/>
+          </w:tcPr>
           <w:p>
             <w:pPr>
               <w:pStyle w:val="Compact"/>
             </w:pPr>
             <w:r>
-              <w:t xml:space="preserve">Modelo</w:t>
+              <w:t>Modelo</w:t>
             </w:r>
           </w:p>
         </w:tc>
         <w:tc>
-          <w:tcPr/>
+          <w:tcPr>
+            <w:tcW w:w="1584" w:type="dxa"/>
+          </w:tcPr>
           <w:p>
             <w:pPr>
               <w:pStyle w:val="Compact"/>
             </w:pPr>
             <w:r>
-              <w:t xml:space="preserve">Contexto</w:t>
+              <w:t>Contexto</w:t>
             </w:r>
           </w:p>
         </w:tc>
         <w:tc>
-          <w:tcPr/>
+          <w:tcPr>
+            <w:tcW w:w="1584" w:type="dxa"/>
+          </w:tcPr>
           <w:p>
             <w:pPr>
               <w:pStyle w:val="Compact"/>
             </w:pPr>
             <w:r>
-              <w:t xml:space="preserve">Resultado</w:t>
+              <w:t>Resultado</w:t>
             </w:r>
           </w:p>
         </w:tc>
       </w:tr>
       <w:tr>
         <w:tc>
-          <w:tcPr/>
+          <w:tcPr>
+            <w:tcW w:w="1584" w:type="dxa"/>
+          </w:tcPr>
           <w:p>
             <w:pPr>
               <w:pStyle w:val="Compact"/>
             </w:pPr>
             <w:r>
-              <w:t xml:space="preserve">Claude Code</w:t>
+              <w:t>Claude Code</w:t>
             </w:r>
           </w:p>
         </w:tc>
         <w:tc>
-          <w:tcPr/>
+          <w:tcPr>
+            <w:tcW w:w="1584" w:type="dxa"/>
+          </w:tcPr>
           <w:p>
             <w:pPr>
               <w:pStyle w:val="Compact"/>
             </w:pPr>
             <w:r>
-              <w:t xml:space="preserve">Agente principal de cada sesión</w:t>
+              <w:t>Agente principal de cada sesión</w:t>
             </w:r>
           </w:p>
         </w:tc>
         <w:tc>
-          <w:tcPr/>
+          <w:tcPr>
+            <w:tcW w:w="1584" w:type="dxa"/>
+          </w:tcPr>
           <w:p>
             <w:pPr>
               <w:pStyle w:val="Compact"/>
             </w:pPr>
             <w:r>
-              <w:t xml:space="preserve">Claude Opus o Sonnet, según la tarea</w:t>
+              <w:t>Claude Opus o Sonnet, según la tarea</w:t>
             </w:r>
           </w:p>
         </w:tc>
         <w:tc>
-          <w:tcPr/>
+          <w:tcPr>
+            <w:tcW w:w="1584" w:type="dxa"/>
+          </w:tcPr>
           <w:p>
             <w:pPr>
               <w:pStyle w:val="Compact"/>
@@ -753,150 +1013,172 @@
               <w:rPr>
                 <w:rStyle w:val="VerbatimChar"/>
               </w:rPr>
-              <w:t xml:space="preserve">CLAUDE.md</w:t>
-            </w:r>
-            <w:r>
-              <w:t xml:space="preserve"> </w:t>
-            </w:r>
-            <w:r>
-              <w:t xml:space="preserve">y el vault</w:t>
+              <w:t>CLAUDE.md</w:t>
+            </w:r>
+            <w:r>
+              <w:t xml:space="preserve"> y el vault</w:t>
             </w:r>
           </w:p>
         </w:tc>
         <w:tc>
-          <w:tcPr/>
+          <w:tcPr>
+            <w:tcW w:w="1584" w:type="dxa"/>
+          </w:tcPr>
           <w:p>
             <w:pPr>
               <w:pStyle w:val="Compact"/>
             </w:pPr>
             <w:r>
-              <w:t xml:space="preserve">Notas, diagramas, entregables y código, con commit</w:t>
+              <w:t>Notas, diagramas, entregables y código, con commit</w:t>
             </w:r>
           </w:p>
         </w:tc>
       </w:tr>
       <w:tr>
         <w:tc>
-          <w:tcPr/>
+          <w:tcPr>
+            <w:tcW w:w="1584" w:type="dxa"/>
+          </w:tcPr>
           <w:p>
             <w:pPr>
               <w:pStyle w:val="Compact"/>
             </w:pPr>
             <w:r>
-              <w:t xml:space="preserve">Subagentes</w:t>
+              <w:t>Subagentes</w:t>
             </w:r>
           </w:p>
         </w:tc>
         <w:tc>
-          <w:tcPr/>
+          <w:tcPr>
+            <w:tcW w:w="1584" w:type="dxa"/>
+          </w:tcPr>
           <w:p>
             <w:pPr>
               <w:pStyle w:val="Compact"/>
             </w:pPr>
             <w:r>
-              <w:t xml:space="preserve">Búsqueda y exploración en paralelo</w:t>
+              <w:t>Búsqueda y exploración en paralelo</w:t>
             </w:r>
           </w:p>
         </w:tc>
         <w:tc>
-          <w:tcPr/>
+          <w:tcPr>
+            <w:tcW w:w="1584" w:type="dxa"/>
+          </w:tcPr>
           <w:p>
             <w:pPr>
               <w:pStyle w:val="Compact"/>
             </w:pPr>
             <w:r>
-              <w:t xml:space="preserve">El del agente principal o uno más liviano</w:t>
+              <w:t>El del agente principal o uno más liviano</w:t>
             </w:r>
           </w:p>
         </w:tc>
         <w:tc>
-          <w:tcPr/>
+          <w:tcPr>
+            <w:tcW w:w="1584" w:type="dxa"/>
+          </w:tcPr>
           <w:p>
             <w:pPr>
               <w:pStyle w:val="Compact"/>
             </w:pPr>
             <w:r>
-              <w:t xml:space="preserve">El que les pasa el agente principal</w:t>
+              <w:t>El que les pasa el agente principal</w:t>
             </w:r>
           </w:p>
         </w:tc>
         <w:tc>
-          <w:tcPr/>
+          <w:tcPr>
+            <w:tcW w:w="1584" w:type="dxa"/>
+          </w:tcPr>
           <w:p>
             <w:pPr>
               <w:pStyle w:val="Compact"/>
             </w:pPr>
             <w:r>
-              <w:t xml:space="preserve">Un resumen para el agente principal</w:t>
+              <w:t>Un resumen para el agente principal</w:t>
             </w:r>
           </w:p>
         </w:tc>
       </w:tr>
       <w:tr>
         <w:tc>
-          <w:tcPr/>
+          <w:tcPr>
+            <w:tcW w:w="1584" w:type="dxa"/>
+          </w:tcPr>
           <w:p>
             <w:pPr>
               <w:pStyle w:val="Compact"/>
             </w:pPr>
             <w:r>
-              <w:t xml:space="preserve">MCP de Figma</w:t>
+              <w:t>MCP de Figma</w:t>
             </w:r>
           </w:p>
         </w:tc>
         <w:tc>
-          <w:tcPr/>
+          <w:tcPr>
+            <w:tcW w:w="1584" w:type="dxa"/>
+          </w:tcPr>
           <w:p>
             <w:pPr>
               <w:pStyle w:val="Compact"/>
             </w:pPr>
             <w:r>
-              <w:t xml:space="preserve">Conecta a Claude Code con Figma</w:t>
+              <w:t>Conecta a Claude Code con Figm</w:t>
+            </w:r>
+            <w:r>
+              <w:t>a</w:t>
             </w:r>
           </w:p>
         </w:tc>
         <w:tc>
-          <w:tcPr/>
+          <w:tcPr>
+            <w:tcW w:w="1584" w:type="dxa"/>
+          </w:tcPr>
           <w:p>
             <w:pPr>
               <w:pStyle w:val="Compact"/>
             </w:pPr>
             <w:r>
-              <w:t xml:space="preserve">— (es una herramienta, no un modelo)</w:t>
+              <w:t>— (es una herramienta, no un modelo)</w:t>
             </w:r>
           </w:p>
         </w:tc>
         <w:tc>
-          <w:tcPr/>
+          <w:tcPr>
+            <w:tcW w:w="1584" w:type="dxa"/>
+          </w:tcPr>
           <w:p>
             <w:pPr>
               <w:pStyle w:val="Compact"/>
             </w:pPr>
             <w:r>
-              <w:t xml:space="preserve">El archivo de Figma del prototipo</w:t>
+              <w:t>El archivo de Figma del prototipo</w:t>
             </w:r>
           </w:p>
         </w:tc>
         <w:tc>
-          <w:tcPr/>
+          <w:tcPr>
+            <w:tcW w:w="1584" w:type="dxa"/>
+          </w:tcPr>
           <w:p>
             <w:pPr>
               <w:pStyle w:val="Compact"/>
             </w:pPr>
             <w:r>
-              <w:t xml:space="preserve">Pantallas, componentes, interacciones y PNG</w:t>
+              <w:t>Pantallas, componentes, interacciones y PNG</w:t>
             </w:r>
           </w:p>
         </w:tc>
       </w:tr>
     </w:tbl>
-    <w:bookmarkStart w:id="59" w:name="_ed108da5b06349d16ca746ee689f3a9611a1049"/>
-    <w:p>
-      <w:pPr>
-        <w:pStyle w:val="Heading3"/>
-      </w:pPr>
-      <w:r>
-        <w:t xml:space="preserve">Claude Code — agente principal</w:t>
+    <w:p>
+      <w:pPr>
+        <w:pStyle w:val="Ttulo3"/>
+      </w:pPr>
+      <w:bookmarkStart w:id="12" w:name="_ed108da5b06349d16ca746ee689f3a9611a1049"/>
+      <w:r>
+        <w:t>Claude Code — agente principal</w:t>
       </w:r>
     </w:p>
     <w:p>
@@ -904,7 +1186,7 @@
         <w:pStyle w:val="Compact"/>
         <w:numPr>
           <w:ilvl w:val="0"/>
-          <w:numId w:val="1003"/>
+          <w:numId w:val="4"/>
         </w:numPr>
       </w:pPr>
       <w:r>
@@ -912,13 +1194,16 @@
           <w:b/>
           <w:bCs/>
         </w:rPr>
-        <w:t xml:space="preserve">Qué hace:</w:t>
+        <w:t>Qué hace:</w:t>
       </w:r>
       <w:r>
         <w:t xml:space="preserve"> </w:t>
       </w:r>
       <w:r>
-        <w:t xml:space="preserve">es el agente con el que cada integrante trabaja en su sesión. Lee y edita los archivos del vault, ejecuta comandos, genera los entregables y registra lo hecho. Lo usaron los tres integrantes para el relevamiento, los casos de uso, el modelo de dominio, los diagramas UML, la arquitectura, el contrato de la API y el script SQL.</w:t>
+        <w:t>es el agente con el que cada integrante trabaja en su sesión. Lee y edita los archivos del vault, ejecuta comandos, genera los entregables y registra lo hecho. Lo usaron los tres integrantes para el relevamiento, los casos de uso, el modelo de dominio, los</w:t>
+      </w:r>
+      <w:r>
+        <w:t xml:space="preserve"> diagramas UML, la arquitectura, el contrato de la API y el script SQL.</w:t>
       </w:r>
     </w:p>
     <w:p>
@@ -926,7 +1211,7 @@
         <w:pStyle w:val="Compact"/>
         <w:numPr>
           <w:ilvl w:val="0"/>
-          <w:numId w:val="1003"/>
+          <w:numId w:val="4"/>
         </w:numPr>
       </w:pPr>
       <w:r>
@@ -934,13 +1219,13 @@
           <w:b/>
           <w:bCs/>
         </w:rPr>
-        <w:t xml:space="preserve">Modelos:</w:t>
-      </w:r>
-      <w:r>
-        <w:t xml:space="preserve"> </w:t>
-      </w:r>
-      <w:r>
-        <w:t xml:space="preserve">Claude Opus para el análisis y las decisiones de diseño, y Claude Sonnet para tareas más acotadas. Según el registro de sesiones del equipo: Claude Opus 4.8 del 09/09 al 18/09, Claude Sonnet 5 del 18/09 al 25/09 (diagramas de estado, clases y secuencia) y Claude Opus 5.5 desde el 29/09.</w:t>
+        <w:t>Modelos:</w:t>
+      </w:r>
+      <w:r>
+        <w:t xml:space="preserve"> Claude Opus para el análisis y las decisiones de diseño, y Claude Sonnet para tareas más acotadas. Según el registro de sesiones del equipo: Claude Opus 4.8 del 09/09 al 18/09</w:t>
+      </w:r>
+      <w:r>
+        <w:t>, Claude Sonnet 5 del 18/09 al 25/09 (diagramas de estado, clases y secuencia) y Claude Opus 5.5 desde el 29/09.</w:t>
       </w:r>
     </w:p>
     <w:p>
@@ -948,7 +1233,7 @@
         <w:pStyle w:val="Compact"/>
         <w:numPr>
           <w:ilvl w:val="0"/>
-          <w:numId w:val="1003"/>
+          <w:numId w:val="4"/>
         </w:numPr>
       </w:pPr>
       <w:r>
@@ -956,83 +1241,62 @@
           <w:b/>
           <w:bCs/>
         </w:rPr>
-        <w:t xml:space="preserve">Herramientas:</w:t>
-      </w:r>
-      <w:r>
-        <w:t xml:space="preserve"> </w:t>
-      </w:r>
-      <w:r>
-        <w:t xml:space="preserve">lectura, búsqueda y edición de archivos del repositorio; la línea de comandos, con Git,</w:t>
-      </w:r>
-      <w:r>
-        <w:t xml:space="preserve"> </w:t>
+        <w:t>Herramientas:</w:t>
+      </w:r>
+      <w:r>
+        <w:t xml:space="preserve"> lectura, búsqueda y edición de archivos del repositorio; la línea de comandos, con Git, </w:t>
       </w:r>
       <w:r>
         <w:rPr>
           <w:rStyle w:val="VerbatimChar"/>
         </w:rPr>
-        <w:t xml:space="preserve">pandoc</w:t>
-      </w:r>
-      <w:r>
-        <w:t xml:space="preserve"> </w:t>
-      </w:r>
-      <w:r>
-        <w:t xml:space="preserve">(entregables</w:t>
-      </w:r>
-      <w:r>
-        <w:t xml:space="preserve"> </w:t>
+        <w:t>pandoc</w:t>
+      </w:r>
+      <w:r>
+        <w:t xml:space="preserve"> (entregables </w:t>
       </w:r>
       <w:r>
         <w:rPr>
           <w:rStyle w:val="VerbatimChar"/>
         </w:rPr>
-        <w:t xml:space="preserve">.docx</w:t>
-      </w:r>
-      <w:r>
-        <w:t xml:space="preserve">),</w:t>
-      </w:r>
-      <w:r>
-        <w:t xml:space="preserve"> </w:t>
+        <w:t>.docx</w:t>
+      </w:r>
+      <w:r>
+        <w:t xml:space="preserve">), </w:t>
       </w:r>
       <w:r>
         <w:rPr>
           <w:rStyle w:val="VerbatimChar"/>
         </w:rPr>
-        <w:t xml:space="preserve">mermaid-cli</w:t>
-      </w:r>
-      <w:r>
-        <w:t xml:space="preserve"> </w:t>
-      </w:r>
-      <w:r>
-        <w:t xml:space="preserve">(PNG de los diagramas), Node.js (generador del contrato OpenAPI), Redocly (validación del contrato) y PostgreSQL (validación del script SQL); las</w:t>
-      </w:r>
-      <w:r>
-        <w:t xml:space="preserve"> </w:t>
+        <w:t>mermaid-cli</w:t>
+      </w:r>
+      <w:r>
+        <w:t xml:space="preserve"> (</w:t>
+      </w:r>
+      <w:r>
+        <w:t xml:space="preserve">PNG de los diagramas), Node.js (generador del contrato OpenAPI), Redocly (validación del contrato) y PostgreSQL (validación del script SQL); las </w:t>
       </w:r>
       <w:r>
         <w:rPr>
           <w:b/>
           <w:bCs/>
         </w:rPr>
-        <w:t xml:space="preserve">skills</w:t>
-      </w:r>
-      <w:r>
-        <w:t xml:space="preserve"> </w:t>
-      </w:r>
-      <w:r>
-        <w:t xml:space="preserve">del proyecto en</w:t>
-      </w:r>
-      <w:r>
-        <w:t xml:space="preserve"> </w:t>
+        <w:t>skills</w:t>
+      </w:r>
+      <w:r>
+        <w:t xml:space="preserve"> del proyecto en </w:t>
       </w:r>
       <w:r>
         <w:rPr>
           <w:rStyle w:val="VerbatimChar"/>
         </w:rPr>
-        <w:t xml:space="preserve">.claude/skills/</w:t>
-      </w:r>
-      <w:r>
-        <w:t xml:space="preserve">, compartidas por Git (Skills compartidas); y los servidores MCP de Figma, para el prototipo, y de Mermaid Chart, para validar diagramas.</w:t>
+        <w:t>.claude/skills/</w:t>
+      </w:r>
+      <w:r>
+        <w:t>, compartidas por Git (Skills compartidas); y los servidores MCP de Figma</w:t>
+      </w:r>
+      <w:r>
+        <w:t>, para el prototipo, y de Mermaid Chart, para validar diagramas.</w:t>
       </w:r>
     </w:p>
     <w:p>
@@ -1040,7 +1304,7 @@
         <w:pStyle w:val="Compact"/>
         <w:numPr>
           <w:ilvl w:val="0"/>
-          <w:numId w:val="1003"/>
+          <w:numId w:val="4"/>
         </w:numPr>
       </w:pPr>
       <w:r>
@@ -1048,13 +1312,13 @@
           <w:b/>
           <w:bCs/>
         </w:rPr>
-        <w:t xml:space="preserve">Entrevista de diseño:</w:t>
-      </w:r>
-      <w:r>
-        <w:t xml:space="preserve"> </w:t>
-      </w:r>
-      <w:r>
-        <w:t xml:space="preserve">para decidir, Claude pregunta de a una cuestión, con su recomendación, y la persona decide. Así se hicieron la entrevista de consistencia del 18/09 y la de diseño del 29/09.</w:t>
+        <w:t>Entrevista de diseño:</w:t>
+      </w:r>
+      <w:r>
+        <w:t xml:space="preserve"> para decidir, Claude pregunta de a una cuestión, con su recomendación, y la persona decide. Así se hicieron la entrevista de consistencia del 18/09 y la de diseño del 29</w:t>
+      </w:r>
+      <w:r>
+        <w:t>/09.</w:t>
       </w:r>
     </w:p>
     <w:p>
@@ -1062,7 +1326,7 @@
         <w:pStyle w:val="Compact"/>
         <w:numPr>
           <w:ilvl w:val="0"/>
-          <w:numId w:val="1003"/>
+          <w:numId w:val="4"/>
         </w:numPr>
       </w:pPr>
       <w:r>
@@ -1070,13 +1334,13 @@
           <w:b/>
           <w:bCs/>
         </w:rPr>
-        <w:t xml:space="preserve">De dónde toma el contexto:</w:t>
-      </w:r>
-      <w:r>
-        <w:t xml:space="preserve"> </w:t>
-      </w:r>
-      <w:r>
-        <w:t xml:space="preserve">no recuerda las sesiones anteriores. Cada sesión arranca leyendo CLAUDE.md, Estado del proyecto, la Bitácora de sesiones y Claude Code — memoria del proyecto, y después abre solo las notas de la tarea, entrando por su MOC. Reconoce a la persona por su usuario de Git y hace cada commit con la identidad de esa persona.</w:t>
+        <w:t>De dónde toma el contexto:</w:t>
+      </w:r>
+      <w:r>
+        <w:t xml:space="preserve"> no recuerda las sesiones anteriores. Cada sesión arranca leyendo CLAUDE.md, Estado del proyecto, la Bitácora de sesiones y Claude Code — memoria del proyecto, y después abre solo las notas de la tarea, entrando por su MOC. R</w:t>
+      </w:r>
+      <w:r>
+        <w:t>econoce a la persona por su usuario de Git y hace cada commit con la identidad de esa persona.</w:t>
       </w:r>
     </w:p>
     <w:p>
@@ -1084,7 +1348,7 @@
         <w:pStyle w:val="Compact"/>
         <w:numPr>
           <w:ilvl w:val="0"/>
-          <w:numId w:val="1003"/>
+          <w:numId w:val="4"/>
         </w:numPr>
       </w:pPr>
       <w:r>
@@ -1092,13 +1356,23 @@
           <w:b/>
           <w:bCs/>
         </w:rPr>
-        <w:t xml:space="preserve">Límites:</w:t>
+        <w:t>Límites:</w:t>
       </w:r>
       <w:r>
         <w:t xml:space="preserve"> </w:t>
       </w:r>
       <w:r>
-        <w:t xml:space="preserve">no aprueba decisiones ni da por cerrado un documento: eso lo hace el equipo, y cada decisión queda registrada con su justificación. No inventa datos del negocio: si falta información, avanza con una propuesta marcada como borrador. Cuando dos documentos se contradicen, manda el relevamiento, después las decisiones aprobadas y después el resto. No guarda credenciales en Git ni cambia la identidad de Git de nadie. Respeta el alcance: no propone pagos online, publicación automática en redes ni integración con mayoristas. Y cada acción sobre archivos y comandos queda sujeta a los permisos que la persona le da en la sesión.</w:t>
+        <w:t xml:space="preserve">no aprueba decisiones ni da por cerrado un documento: eso lo hace el equipo, y cada decisión queda registrada con su justificación. No inventa datos del negocio: si falta </w:t>
+      </w:r>
+      <w:r>
+        <w:lastRenderedPageBreak/>
+        <w:t>información, avanza con una propuesta marcada como borrador. Cuando dos documentos se</w:t>
+      </w:r>
+      <w:r>
+        <w:t xml:space="preserve"> contradicen, manda el relevamiento, después las decisiones aprobadas y después el resto. No guarda credenciales en Git ni cambia la identidad de Git de nadie. Respeta el alcance: no propone pagos online, publicación automática en redes ni integración con </w:t>
+      </w:r>
+      <w:r>
+        <w:t>mayoristas. Y cada acción sobre archivos y comandos queda sujeta a los permisos que la persona le da en la sesión.</w:t>
       </w:r>
     </w:p>
     <w:p>
@@ -1106,7 +1380,7 @@
         <w:pStyle w:val="Compact"/>
         <w:numPr>
           <w:ilvl w:val="0"/>
-          <w:numId w:val="1003"/>
+          <w:numId w:val="4"/>
         </w:numPr>
       </w:pPr>
       <w:r>
@@ -1114,23 +1388,23 @@
           <w:b/>
           <w:bCs/>
         </w:rPr>
-        <w:t xml:space="preserve">Ejemplo real:</w:t>
-      </w:r>
-      <w:r>
-        <w:t xml:space="preserve"> </w:t>
-      </w:r>
-      <w:r>
-        <w:t xml:space="preserve">el 29/09, al escribir el script SQL, Claude Code detectó once datos que los casos de uso pedían y el ER no guardaba. Los propuso, Nahuel los aprobó, quedaron registrados como decisión del equipo y se propagaron al ER, al diagrama de clases, a las entidades y al script. Después validó el script contra un PostgreSQL local.</w:t>
-      </w:r>
-    </w:p>
-    <w:bookmarkEnd w:id="59"/>
-    <w:bookmarkStart w:id="60" w:name="_ab8a87972d9ebddf8860069cddb0f89d6c43055"/>
-    <w:p>
-      <w:pPr>
-        <w:pStyle w:val="Heading3"/>
-      </w:pPr>
-      <w:r>
-        <w:t xml:space="preserve">Subagentes — exploración en paralelo</w:t>
+        <w:t>Ejemplo real:</w:t>
+      </w:r>
+      <w:r>
+        <w:t xml:space="preserve"> el 29/09, al escribir el script SQL, Claude Code detectó once datos que los casos de uso pedían y el ER no guardaba. Los propus</w:t>
+      </w:r>
+      <w:r>
+        <w:t>o, Nahuel los aprobó, quedaron registrados como decisión del equipo y se propagaron al ER, al diagrama de clases, a las entidades y al script. Después validó el script contra un PostgreSQL local.</w:t>
+      </w:r>
+    </w:p>
+    <w:p>
+      <w:pPr>
+        <w:pStyle w:val="Ttulo3"/>
+      </w:pPr>
+      <w:bookmarkStart w:id="13" w:name="_ab8a87972d9ebddf8860069cddb0f89d6c43055"/>
+      <w:bookmarkEnd w:id="12"/>
+      <w:r>
+        <w:t>Subagentes — exploración en paralelo</w:t>
       </w:r>
     </w:p>
     <w:p>
@@ -1138,7 +1412,7 @@
         <w:pStyle w:val="Compact"/>
         <w:numPr>
           <w:ilvl w:val="0"/>
-          <w:numId w:val="1004"/>
+          <w:numId w:val="5"/>
         </w:numPr>
       </w:pPr>
       <w:r>
@@ -1146,29 +1420,26 @@
           <w:b/>
           <w:bCs/>
         </w:rPr>
-        <w:t xml:space="preserve">Qué hacen:</w:t>
-      </w:r>
-      <w:r>
-        <w:t xml:space="preserve"> </w:t>
-      </w:r>
-      <w:r>
-        <w:t xml:space="preserve">son instancias de Claude que el agente principal lanza para una tarea acotada, sobre todo</w:t>
-      </w:r>
-      <w:r>
-        <w:t xml:space="preserve"> </w:t>
+        <w:t>Qué hacen:</w:t>
+      </w:r>
+      <w:r>
+        <w:t xml:space="preserve"> son instanci</w:t>
+      </w:r>
+      <w:r>
+        <w:t xml:space="preserve">as de Claude que el agente principal lanza para una tarea acotada, sobre todo </w:t>
       </w:r>
       <w:r>
         <w:rPr>
           <w:b/>
           <w:bCs/>
         </w:rPr>
-        <w:t xml:space="preserve">búsquedas amplias en el vault</w:t>
-      </w:r>
-      <w:r>
-        <w:t xml:space="preserve"> </w:t>
-      </w:r>
-      <w:r>
-        <w:t xml:space="preserve">(por ejemplo, cruzar los 31 CU con las 13 entidades para encontrar incoherencias). Cada subagente trabaja con su propio contexto y le devuelve al agente principal solo la conclusión, no los archivos que leyó.</w:t>
+        <w:t>búsquedas amplias en el vault</w:t>
+      </w:r>
+      <w:r>
+        <w:t xml:space="preserve"> (por ejemplo, cruzar los 31 CU con las 13 entidades para encontrar incoherencias). Cada subagente trabaja con su propio contexto y le devuelve al ag</w:t>
+      </w:r>
+      <w:r>
+        <w:t>ente principal solo la conclusión, no los archivos que leyó.</w:t>
       </w:r>
     </w:p>
     <w:p>
@@ -1176,7 +1447,7 @@
         <w:pStyle w:val="Compact"/>
         <w:numPr>
           <w:ilvl w:val="0"/>
-          <w:numId w:val="1004"/>
+          <w:numId w:val="5"/>
         </w:numPr>
       </w:pPr>
       <w:r>
@@ -1184,13 +1455,10 @@
           <w:b/>
           <w:bCs/>
         </w:rPr>
-        <w:t xml:space="preserve">Modelo:</w:t>
-      </w:r>
-      <w:r>
-        <w:t xml:space="preserve"> </w:t>
-      </w:r>
-      <w:r>
-        <w:t xml:space="preserve">el del agente principal, o uno más liviano cuando la tarea es solo buscar.</w:t>
+        <w:t>Modelo:</w:t>
+      </w:r>
+      <w:r>
+        <w:t xml:space="preserve"> el del agente principal, o uno más liviano cuando la tarea es solo buscar.</w:t>
       </w:r>
     </w:p>
     <w:p>
@@ -1198,7 +1466,7 @@
         <w:pStyle w:val="Compact"/>
         <w:numPr>
           <w:ilvl w:val="0"/>
-          <w:numId w:val="1004"/>
+          <w:numId w:val="5"/>
         </w:numPr>
       </w:pPr>
       <w:r>
@@ -1206,13 +1474,10 @@
           <w:b/>
           <w:bCs/>
         </w:rPr>
-        <w:t xml:space="preserve">Herramientas:</w:t>
-      </w:r>
-      <w:r>
-        <w:t xml:space="preserve"> </w:t>
-      </w:r>
-      <w:r>
-        <w:t xml:space="preserve">las de lectura y búsqueda. Los subagentes de exploración no editan archivos.</w:t>
+        <w:t>Herramientas:</w:t>
+      </w:r>
+      <w:r>
+        <w:t xml:space="preserve"> las de lectura y búsqueda. Los subagentes de exploración no editan archivos.</w:t>
       </w:r>
     </w:p>
     <w:p>
@@ -1220,7 +1485,7 @@
         <w:pStyle w:val="Compact"/>
         <w:numPr>
           <w:ilvl w:val="0"/>
-          <w:numId w:val="1004"/>
+          <w:numId w:val="5"/>
         </w:numPr>
       </w:pPr>
       <w:r>
@@ -1228,13 +1493,13 @@
           <w:b/>
           <w:bCs/>
         </w:rPr>
-        <w:t xml:space="preserve">Por qué se usan:</w:t>
-      </w:r>
-      <w:r>
-        <w:t xml:space="preserve"> </w:t>
-      </w:r>
-      <w:r>
-        <w:t xml:space="preserve">permiten revisar muchas notas sin llenar el contexto de la sesión principal, que sigue concentrada en la tarea.</w:t>
+        <w:t>Por qué se usan:</w:t>
+      </w:r>
+      <w:r>
+        <w:t xml:space="preserve"> perm</w:t>
+      </w:r>
+      <w:r>
+        <w:t>iten revisar muchas notas sin llenar el contexto de la sesión principal, que sigue concentrada en la tarea.</w:t>
       </w:r>
     </w:p>
     <w:p>
@@ -1242,7 +1507,7 @@
         <w:pStyle w:val="Compact"/>
         <w:numPr>
           <w:ilvl w:val="0"/>
-          <w:numId w:val="1004"/>
+          <w:numId w:val="5"/>
         </w:numPr>
       </w:pPr>
       <w:r>
@@ -1250,23 +1515,23 @@
           <w:b/>
           <w:bCs/>
         </w:rPr>
-        <w:t xml:space="preserve">Límites:</w:t>
-      </w:r>
-      <w:r>
-        <w:t xml:space="preserve"> </w:t>
-      </w:r>
-      <w:r>
-        <w:t xml:space="preserve">no ven la conversación de la sesión, solo el pedido que les arma el agente principal. Tampoco hacen commits ni toman decisiones: lo que encuentran lo revisa el agente principal con la persona.</w:t>
-      </w:r>
-    </w:p>
-    <w:bookmarkEnd w:id="60"/>
-    <w:bookmarkStart w:id="62" w:name="_4114302bd9181b4f3020216bbd359015b1582a9"/>
-    <w:p>
-      <w:pPr>
-        <w:pStyle w:val="Heading3"/>
-      </w:pPr>
-      <w:r>
-        <w:t xml:space="preserve">MCP de Figma — prototipo de interfaces</w:t>
+        <w:t>Límites:</w:t>
+      </w:r>
+      <w:r>
+        <w:t xml:space="preserve"> no ven la conversación de la sesión, solo el pedido que les arma el agente principal. Tampoco hacen commits ni toman decisiones: lo que enc</w:t>
+      </w:r>
+      <w:r>
+        <w:t>uentran lo revisa el agente principal con la persona.</w:t>
+      </w:r>
+    </w:p>
+    <w:p>
+      <w:pPr>
+        <w:pStyle w:val="Ttulo3"/>
+      </w:pPr>
+      <w:bookmarkStart w:id="14" w:name="_4114302bd9181b4f3020216bbd359015b1582a9"/>
+      <w:bookmarkEnd w:id="13"/>
+      <w:r>
+        <w:t>MCP de Figma — prototipo de interfaces</w:t>
       </w:r>
     </w:p>
     <w:p>
@@ -1274,7 +1539,7 @@
         <w:pStyle w:val="Compact"/>
         <w:numPr>
           <w:ilvl w:val="0"/>
-          <w:numId w:val="1005"/>
+          <w:numId w:val="6"/>
         </w:numPr>
       </w:pPr>
       <w:r>
@@ -1282,24 +1547,21 @@
           <w:b/>
           <w:bCs/>
         </w:rPr>
-        <w:t xml:space="preserve">Qué hace:</w:t>
-      </w:r>
-      <w:r>
-        <w:t xml:space="preserve"> </w:t>
-      </w:r>
-      <w:r>
-        <w:t xml:space="preserve">conecta a Claude Code con Figma para que pueda leer y escribir en un archivo de diseño. Con él se construyó el Prototipo UI (</w:t>
-      </w:r>
-      <w:hyperlink r:id="rId61">
+        <w:t>Qué hace:</w:t>
+      </w:r>
+      <w:r>
+        <w:t xml:space="preserve"> conecta a Claude Code con Figma para que pueda leer y escribir en un archivo de diseño. Con él se construyó el Prototipo UI (</w:t>
+      </w:r>
+      <w:hyperlink r:id="rId8">
         <w:r>
           <w:rPr>
-            <w:rStyle w:val="Hyperlink"/>
+            <w:rStyle w:val="Hipervnculo"/>
           </w:rPr>
-          <w:t xml:space="preserve">Rumbo — Prototipo PC1</w:t>
+          <w:t>Rumbo — Prototipo PC1</w:t>
         </w:r>
       </w:hyperlink>
       <w:r>
-        <w:t xml:space="preserve">).</w:t>
+        <w:t>).</w:t>
       </w:r>
     </w:p>
     <w:p>
@@ -1307,7 +1569,7 @@
         <w:pStyle w:val="Compact"/>
         <w:numPr>
           <w:ilvl w:val="0"/>
-          <w:numId w:val="1005"/>
+          <w:numId w:val="6"/>
         </w:numPr>
       </w:pPr>
       <w:r>
@@ -1315,13 +1577,10 @@
           <w:b/>
           <w:bCs/>
         </w:rPr>
-        <w:t xml:space="preserve">Herramientas que expone:</w:t>
-      </w:r>
-      <w:r>
-        <w:t xml:space="preserve"> </w:t>
-      </w:r>
-      <w:r>
-        <w:t xml:space="preserve">crear y editar nodos, componentes, estilos y variables, agregar interacciones de prototipo y exportar capturas de cada pantalla.</w:t>
+        <w:t>Herramientas que expone:</w:t>
+      </w:r>
+      <w:r>
+        <w:t xml:space="preserve"> crear y editar nodos, componentes, estilos y variables, agregar interacciones de prototipo y exportar capturas de cada pantalla.</w:t>
       </w:r>
     </w:p>
     <w:p>
@@ -1329,7 +1588,7 @@
         <w:pStyle w:val="Compact"/>
         <w:numPr>
           <w:ilvl w:val="0"/>
-          <w:numId w:val="1005"/>
+          <w:numId w:val="6"/>
         </w:numPr>
       </w:pPr>
       <w:r>
@@ -1337,13 +1596,13 @@
           <w:b/>
           <w:bCs/>
         </w:rPr>
-        <w:t xml:space="preserve">Contexto:</w:t>
-      </w:r>
-      <w:r>
-        <w:t xml:space="preserve"> </w:t>
-      </w:r>
-      <w:r>
-        <w:t xml:space="preserve">los casos de uso, las entidades y los estados del vault. Las pantallas usan el lenguaje ubicuo y los estados reales del modelo.</w:t>
+        <w:t>Contexto:</w:t>
+      </w:r>
+      <w:r>
+        <w:t xml:space="preserve"> los casos de uso, las ent</w:t>
+      </w:r>
+      <w:r>
+        <w:t>idades y los estados del vault. Las pantallas usan el lenguaje ubicuo y los estados reales del modelo.</w:t>
       </w:r>
     </w:p>
     <w:p>
@@ -1351,7 +1610,7 @@
         <w:pStyle w:val="Compact"/>
         <w:numPr>
           <w:ilvl w:val="0"/>
-          <w:numId w:val="1005"/>
+          <w:numId w:val="6"/>
         </w:numPr>
       </w:pPr>
       <w:r>
@@ -1359,13 +1618,13 @@
           <w:b/>
           <w:bCs/>
         </w:rPr>
-        <w:t xml:space="preserve">Límites:</w:t>
-      </w:r>
-      <w:r>
-        <w:t xml:space="preserve"> </w:t>
-      </w:r>
-      <w:r>
-        <w:t xml:space="preserve">trabaja con la cuenta de Figma de quien lo usa (la de estudiante de Paloma) y solo sobre los archivos a los que esa cuenta tiene acceso. El resultado lo revisa una persona antes de darlo por bueno.</w:t>
+        <w:t>Límites:</w:t>
+      </w:r>
+      <w:r>
+        <w:t xml:space="preserve"> trabaja con la cuenta de Figma de quien lo usa (la de estudiante de Paloma) y solo sobre los archivos a los que esa cuenta tiene acceso. El resu</w:t>
+      </w:r>
+      <w:r>
+        <w:t>ltado lo revisa una persona antes de darlo por bueno.</w:t>
       </w:r>
     </w:p>
     <w:p>
@@ -1373,7 +1632,7 @@
         <w:pStyle w:val="Compact"/>
         <w:numPr>
           <w:ilvl w:val="0"/>
-          <w:numId w:val="1005"/>
+          <w:numId w:val="6"/>
         </w:numPr>
       </w:pPr>
       <w:r>
@@ -1381,58 +1640,73 @@
           <w:b/>
           <w:bCs/>
         </w:rPr>
-        <w:t xml:space="preserve">Ejemplo real:</w:t>
-      </w:r>
-      <w:r>
-        <w:t xml:space="preserve"> </w:t>
-      </w:r>
-      <w:r>
-        <w:t xml:space="preserve">el 29/09, Paloma armó con Claude Code y el MCP de Figma un sistema de diseño propio (tokens, estilos de texto, 28 íconos y componentes) y, con él, 31 pantallas navegables, con 435 interacciones y 5 puntos de inicio, uno por rol. Las 36 capturas de</w:t>
-      </w:r>
-      <w:r>
-        <w:t xml:space="preserve"> </w:t>
+        <w:t>Ejemplo real:</w:t>
+      </w:r>
+      <w:r>
+        <w:t xml:space="preserve"> el 29/09, Paloma armó con Claude Code y el MCP de Figma un sistema de diseño propio (tokens, estilos de texto, 28 íconos y componentes) y, con él, 31 pantallas navegables, con 435 interacc</w:t>
+      </w:r>
+      <w:r>
+        <w:t xml:space="preserve">iones y 5 puntos de inicio, uno por rol. Las 36 capturas de </w:t>
       </w:r>
       <w:r>
         <w:rPr>
           <w:rStyle w:val="VerbatimChar"/>
         </w:rPr>
-        <w:t xml:space="preserve">07-Entregables/Prototipo/img/</w:t>
-      </w:r>
-      <w:r>
-        <w:t xml:space="preserve"> </w:t>
-      </w:r>
-      <w:r>
-        <w:t xml:space="preserve">también se exportaron con el MCP.</w:t>
-      </w:r>
-    </w:p>
-    <w:bookmarkEnd w:id="62"/>
-    <w:bookmarkEnd w:id="63"/>
-    <w:bookmarkEnd w:id="64"/>
+        <w:t>07-Entregables/Prototipo/img/</w:t>
+      </w:r>
+      <w:r>
+        <w:t xml:space="preserve"> también se exportaron con el MCP.</w:t>
+      </w:r>
+      <w:bookmarkEnd w:id="8"/>
+      <w:bookmarkEnd w:id="11"/>
+      <w:bookmarkEnd w:id="14"/>
+    </w:p>
     <w:sectPr>
-      <w:footerReference r:id="rId40" w:type="default"/>
+      <w:footerReference w:type="default" r:id="rId9"/>
       <w:footnotePr>
         <w:numRestart w:val="eachSect"/>
       </w:footnotePr>
-      <w:pgSz w:h="16838" w:w="11906"/>
-      <w:pgMar w:bottom="1418" w:footer="708" w:gutter="0" w:header="708" w:left="1418" w:right="1418" w:top="1418"/>
+      <w:pgSz w:w="11906" w:h="16838"/>
+      <w:pgMar w:top="1418" w:right="1418" w:bottom="1418" w:left="1418" w:header="708" w:footer="708" w:gutter="0"/>
+      <w:cols w:space="720"/>
     </w:sectPr>
   </w:body>
 </w:document>
 </file>
 
-<file path=word/comments.xml><?xml version="1.0" encoding="utf-8"?>
-<w:comments xmlns:w="http://schemas.openxmlformats.org/wordprocessingml/2006/main" xmlns:m="http://schemas.openxmlformats.org/officeDocument/2006/math" xmlns:r="http://schemas.openxmlformats.org/officeDocument/2006/relationships" xmlns:o="urn:schemas-microsoft-com:office:office" xmlns:v="urn:schemas-microsoft-com:vml" xmlns:w10="urn:schemas-microsoft-com:office:word" xmlns:a="http://schemas.openxmlformats.org/drawingml/2006/main" xmlns:pic="http://schemas.openxmlformats.org/drawingml/2006/picture" xmlns:wp="http://schemas.openxmlformats.org/drawingml/2006/wordprocessingDrawing"/>
+<file path=word/endnotes.xml><?xml version="1.0" encoding="utf-8"?>
+<w:endnotes xmlns:wpc="http://schemas.microsoft.com/office/word/2010/wordprocessingCanvas" xmlns:cx="http://schemas.microsoft.com/office/drawing/2014/chartex" xmlns:cx1="http://schemas.microsoft.com/office/drawing/2015/9/8/chartex" xmlns:cx2="http://schemas.microsoft.com/office/drawing/2015/10/21/chartex" xmlns:cx3="http://schemas.microsoft.com/office/drawing/2016/5/9/chartex" xmlns:cx4="http://schemas.microsoft.com/office/drawing/2016/5/10/chartex" xmlns:cx5="http://schemas.microsoft.com/office/drawing/2016/5/11/chartex" xmlns:cx6="http://schemas.microsoft.com/office/drawing/2016/5/12/chartex" xmlns:cx7="http://schemas.microsoft.com/office/drawing/2016/5/13/chartex" xmlns:cx8="http://schemas.microsoft.com/office/drawing/2016/5/14/chartex" xmlns:mc="http://schemas.openxmlformats.org/markup-compatibility/2006" xmlns:aink="http://schemas.microsoft.com/office/drawing/2016/ink" xmlns:am3d="http://schemas.microsoft.com/office/drawing/2017/model3d" xmlns:o="urn:schemas-microsoft-com:office:office" xmlns:r="http://schemas.openxmlformats.org/officeDocument/2006/relationships" xmlns:m="http://schemas.openxmlformats.org/officeDocument/2006/math" xmlns:v="urn:schemas-microsoft-com:vml" xmlns:wp14="http://schemas.microsoft.com/office/word/2010/wordprocessingDrawing" xmlns:wp="http://schemas.openxmlformats.org/drawingml/2006/wordprocessingDrawing" xmlns:w10="urn:schemas-microsoft-com:office:word" xmlns:w="http://schemas.openxmlformats.org/wordprocessingml/2006/main" xmlns:w14="http://schemas.microsoft.com/office/word/2010/wordml" xmlns:w15="http://schemas.microsoft.com/office/word/2012/wordml" xmlns:w16cex="http://schemas.microsoft.com/office/word/2018/wordml/cex" xmlns:w16cid="http://schemas.microsoft.com/office/word/2016/wordml/cid" xmlns:w16="http://schemas.microsoft.com/office/word/2018/wordml" xmlns:w16sdtdh="http://schemas.microsoft.com/office/word/2020/wordml/sdtdatahash" xmlns:w16se="http://schemas.microsoft.com/office/word/2015/wordml/symex" xmlns:wpg="http://schemas.microsoft.com/office/word/2010/wordprocessingGroup" xmlns:wpi="http://schemas.microsoft.com/office/word/2010/wordprocessingInk" xmlns:wne="http://schemas.microsoft.com/office/word/2006/wordml" xmlns:wps="http://schemas.microsoft.com/office/word/2010/wordprocessingShape" mc:Ignorable="w14 w15 w16se w16cid w16 w16cex w16sdtdh wp14">
+  <w:endnote w:type="separator" w:id="-1">
+    <w:p>
+      <w:pPr>
+        <w:spacing w:after="0" w:line="240" w:lineRule="auto"/>
+      </w:pPr>
+      <w:r>
+        <w:separator/>
+      </w:r>
+    </w:p>
+  </w:endnote>
+  <w:endnote w:type="continuationSeparator" w:id="0">
+    <w:p>
+      <w:pPr>
+        <w:spacing w:after="0" w:line="240" w:lineRule="auto"/>
+      </w:pPr>
+      <w:r>
+        <w:continuationSeparator/>
+      </w:r>
+    </w:p>
+  </w:endnote>
+</w:endnotes>
 </file>
 
 <file path=word/footer1.xml><?xml version="1.0" encoding="utf-8"?>
-<w:ftr xmlns:w="http://schemas.openxmlformats.org/wordprocessingml/2006/main" xmlns:r="http://schemas.openxmlformats.org/officeDocument/2006/relationships">
+<w:ftr xmlns:wpc="http://schemas.microsoft.com/office/word/2010/wordprocessingCanvas" xmlns:cx="http://schemas.microsoft.com/office/drawing/2014/chartex" xmlns:cx1="http://schemas.microsoft.com/office/drawing/2015/9/8/chartex" xmlns:cx2="http://schemas.microsoft.com/office/drawing/2015/10/21/chartex" xmlns:cx3="http://schemas.microsoft.com/office/drawing/2016/5/9/chartex" xmlns:cx4="http://schemas.microsoft.com/office/drawing/2016/5/10/chartex" xmlns:cx5="http://schemas.microsoft.com/office/drawing/2016/5/11/chartex" xmlns:cx6="http://schemas.microsoft.com/office/drawing/2016/5/12/chartex" xmlns:cx7="http://schemas.microsoft.com/office/drawing/2016/5/13/chartex" xmlns:cx8="http://schemas.microsoft.com/office/drawing/2016/5/14/chartex" xmlns:mc="http://schemas.openxmlformats.org/markup-compatibility/2006" xmlns:aink="http://schemas.microsoft.com/office/drawing/2016/ink" xmlns:am3d="http://schemas.microsoft.com/office/drawing/2017/model3d" xmlns:o="urn:schemas-microsoft-com:office:office" xmlns:r="http://schemas.openxmlformats.org/officeDocument/2006/relationships" xmlns:m="http://schemas.openxmlformats.org/officeDocument/2006/math" xmlns:v="urn:schemas-microsoft-com:vml" xmlns:wp14="http://schemas.microsoft.com/office/word/2010/wordprocessingDrawing" xmlns:wp="http://schemas.openxmlformats.org/drawingml/2006/wordprocessingDrawing" xmlns:w10="urn:schemas-microsoft-com:office:word" xmlns:w="http://schemas.openxmlformats.org/wordprocessingml/2006/main" xmlns:w14="http://schemas.microsoft.com/office/word/2010/wordml" xmlns:w15="http://schemas.microsoft.com/office/word/2012/wordml" xmlns:w16cex="http://schemas.microsoft.com/office/word/2018/wordml/cex" xmlns:w16cid="http://schemas.microsoft.com/office/word/2016/wordml/cid" xmlns:w16="http://schemas.microsoft.com/office/word/2018/wordml" xmlns:w16sdtdh="http://schemas.microsoft.com/office/word/2020/wordml/sdtdatahash" xmlns:w16se="http://schemas.microsoft.com/office/word/2015/wordml/symex" xmlns:wpg="http://schemas.microsoft.com/office/word/2010/wordprocessingGroup" xmlns:wpi="http://schemas.microsoft.com/office/word/2010/wordprocessingInk" xmlns:wne="http://schemas.microsoft.com/office/word/2006/wordml" xmlns:wps="http://schemas.microsoft.com/office/word/2010/wordprocessingShape" mc:Ignorable="w14 w15 w16se w16cid w16 w16cex w16sdtdh wp14">
   <w:p>
     <w:pPr>
       <w:jc w:val="center"/>
     </w:pPr>
     <w:r>
       <w:rPr>
-        <w:rFonts w:ascii="Cambria" w:hAnsi="Cambria"/>
         <w:color w:val="808080"/>
         <w:sz w:val="18"/>
         <w:szCs w:val="18"/>
@@ -1441,7 +1715,6 @@
     </w:r>
     <w:r>
       <w:rPr>
-        <w:rFonts w:ascii="Cambria" w:hAnsi="Cambria"/>
         <w:color w:val="808080"/>
         <w:sz w:val="18"/>
         <w:szCs w:val="18"/>
@@ -1450,7 +1723,6 @@
     </w:r>
     <w:r>
       <w:rPr>
-        <w:rFonts w:ascii="Cambria" w:hAnsi="Cambria"/>
         <w:color w:val="808080"/>
         <w:sz w:val="18"/>
         <w:szCs w:val="18"/>
@@ -1459,7 +1731,6 @@
     </w:r>
     <w:r>
       <w:rPr>
-        <w:rFonts w:ascii="Cambria" w:hAnsi="Cambria"/>
         <w:color w:val="808080"/>
         <w:sz w:val="18"/>
         <w:szCs w:val="18"/>
@@ -1468,7 +1739,6 @@
     </w:r>
     <w:r>
       <w:rPr>
-        <w:rFonts w:ascii="Cambria" w:hAnsi="Cambria"/>
         <w:color w:val="808080"/>
         <w:sz w:val="18"/>
         <w:szCs w:val="18"/>
@@ -1480,18 +1750,24 @@
 </file>
 
 <file path=word/footnotes.xml><?xml version="1.0" encoding="utf-8"?>
-<w:footnotes xmlns:w="http://schemas.openxmlformats.org/wordprocessingml/2006/main" xmlns:m="http://schemas.openxmlformats.org/officeDocument/2006/math" xmlns:r="http://schemas.openxmlformats.org/officeDocument/2006/relationships" xmlns:o="urn:schemas-microsoft-com:office:office" xmlns:v="urn:schemas-microsoft-com:vml" xmlns:w10="urn:schemas-microsoft-com:office:word" xmlns:a="http://schemas.openxmlformats.org/drawingml/2006/main" xmlns:pic="http://schemas.openxmlformats.org/drawingml/2006/picture" xmlns:wp="http://schemas.openxmlformats.org/drawingml/2006/wordprocessingDrawing">
+<w:footnotes xmlns:wpc="http://schemas.microsoft.com/office/word/2010/wordprocessingCanvas" xmlns:cx="http://schemas.microsoft.com/office/drawing/2014/chartex" xmlns:cx1="http://schemas.microsoft.com/office/drawing/2015/9/8/chartex" xmlns:cx2="http://schemas.microsoft.com/office/drawing/2015/10/21/chartex" xmlns:cx3="http://schemas.microsoft.com/office/drawing/2016/5/9/chartex" xmlns:cx4="http://schemas.microsoft.com/office/drawing/2016/5/10/chartex" xmlns:cx5="http://schemas.microsoft.com/office/drawing/2016/5/11/chartex" xmlns:cx6="http://schemas.microsoft.com/office/drawing/2016/5/12/chartex" xmlns:cx7="http://schemas.microsoft.com/office/drawing/2016/5/13/chartex" xmlns:cx8="http://schemas.microsoft.com/office/drawing/2016/5/14/chartex" xmlns:mc="http://schemas.openxmlformats.org/markup-compatibility/2006" xmlns:aink="http://schemas.microsoft.com/office/drawing/2016/ink" xmlns:am3d="http://schemas.microsoft.com/office/drawing/2017/model3d" xmlns:o="urn:schemas-microsoft-com:office:office" xmlns:r="http://schemas.openxmlformats.org/officeDocument/2006/relationships" xmlns:m="http://schemas.openxmlformats.org/officeDocument/2006/math" xmlns:v="urn:schemas-microsoft-com:vml" xmlns:wp14="http://schemas.microsoft.com/office/word/2010/wordprocessingDrawing" xmlns:wp="http://schemas.openxmlformats.org/drawingml/2006/wordprocessingDrawing" xmlns:w10="urn:schemas-microsoft-com:office:word" xmlns:w="http://schemas.openxmlformats.org/wordprocessingml/2006/main" xmlns:w14="http://schemas.microsoft.com/office/word/2010/wordml" xmlns:w15="http://schemas.microsoft.com/office/word/2012/wordml" xmlns:w16cex="http://schemas.microsoft.com/office/word/2018/wordml/cex" xmlns:w16cid="http://schemas.microsoft.com/office/word/2016/wordml/cid" xmlns:w16="http://schemas.microsoft.com/office/word/2018/wordml" xmlns:w16sdtdh="http://schemas.microsoft.com/office/word/2020/wordml/sdtdatahash" xmlns:w16se="http://schemas.microsoft.com/office/word/2015/wordml/symex" xmlns:wpg="http://schemas.microsoft.com/office/word/2010/wordprocessingGroup" xmlns:wpi="http://schemas.microsoft.com/office/word/2010/wordprocessingInk" xmlns:wne="http://schemas.microsoft.com/office/word/2006/wordml" xmlns:wps="http://schemas.microsoft.com/office/word/2010/wordprocessingShape" mc:Ignorable="w14 w15 w16se w16cid w16 w16cex w16sdtdh wp14">
+  <w:footnote w:type="separator" w:id="-1">
+    <w:p>
+      <w:pPr>
+        <w:spacing w:after="0" w:line="240" w:lineRule="auto"/>
+      </w:pPr>
+      <w:r>
+        <w:separator/>
+      </w:r>
+    </w:p>
+  </w:footnote>
   <w:footnote w:type="continuationSeparator" w:id="0">
     <w:p>
+      <w:pPr>
+        <w:spacing w:after="0" w:line="240" w:lineRule="auto"/>
+      </w:pPr>
       <w:r>
         <w:continuationSeparator/>
-      </w:r>
-    </w:p>
-  </w:footnote>
-  <w:footnote w:type="separator" w:id="-1">
-    <w:p>
-      <w:r>
-        <w:separator/>
       </w:r>
     </w:p>
   </w:footnote>
@@ -1499,10 +1775,11 @@
 </file>
 
 <file path=word/numbering.xml><?xml version="1.0" encoding="utf-8"?>
-<w:numbering xmlns:w="http://schemas.openxmlformats.org/wordprocessingml/2006/main">
-  <w:abstractNum w:abstractNumId="990">
+<w:numbering xmlns:wpc="http://schemas.microsoft.com/office/word/2010/wordprocessingCanvas" xmlns:cx="http://schemas.microsoft.com/office/drawing/2014/chartex" xmlns:cx1="http://schemas.microsoft.com/office/drawing/2015/9/8/chartex" xmlns:cx2="http://schemas.microsoft.com/office/drawing/2015/10/21/chartex" xmlns:cx3="http://schemas.microsoft.com/office/drawing/2016/5/9/chartex" xmlns:cx4="http://schemas.microsoft.com/office/drawing/2016/5/10/chartex" xmlns:cx5="http://schemas.microsoft.com/office/drawing/2016/5/11/chartex" xmlns:cx6="http://schemas.microsoft.com/office/drawing/2016/5/12/chartex" xmlns:cx7="http://schemas.microsoft.com/office/drawing/2016/5/13/chartex" xmlns:cx8="http://schemas.microsoft.com/office/drawing/2016/5/14/chartex" xmlns:mc="http://schemas.openxmlformats.org/markup-compatibility/2006" xmlns:aink="http://schemas.microsoft.com/office/drawing/2016/ink" xmlns:am3d="http://schemas.microsoft.com/office/drawing/2017/model3d" xmlns:o="urn:schemas-microsoft-com:office:office" xmlns:r="http://schemas.openxmlformats.org/officeDocument/2006/relationships" xmlns:m="http://schemas.openxmlformats.org/officeDocument/2006/math" xmlns:v="urn:schemas-microsoft-com:vml" xmlns:wp14="http://schemas.microsoft.com/office/word/2010/wordprocessingDrawing" xmlns:wp="http://schemas.openxmlformats.org/drawingml/2006/wordprocessingDrawing" xmlns:w10="urn:schemas-microsoft-com:office:word" xmlns:w="http://schemas.openxmlformats.org/wordprocessingml/2006/main" xmlns:w14="http://schemas.microsoft.com/office/word/2010/wordml" xmlns:w15="http://schemas.microsoft.com/office/word/2012/wordml" xmlns:w16cex="http://schemas.microsoft.com/office/word/2018/wordml/cex" xmlns:w16cid="http://schemas.microsoft.com/office/word/2016/wordml/cid" xmlns:w16="http://schemas.microsoft.com/office/word/2018/wordml" xmlns:w16sdtdh="http://schemas.microsoft.com/office/word/2020/wordml/sdtdatahash" xmlns:w16se="http://schemas.microsoft.com/office/word/2015/wordml/symex" xmlns:wpg="http://schemas.microsoft.com/office/word/2010/wordprocessingGroup" xmlns:wpi="http://schemas.microsoft.com/office/word/2010/wordprocessingInk" xmlns:wne="http://schemas.microsoft.com/office/word/2006/wordml" xmlns:wps="http://schemas.microsoft.com/office/word/2010/wordprocessingShape" mc:Ignorable="w14 w15 w16se w16cid w16 w16cex w16sdtdh wp14">
+  <w:abstractNum w:abstractNumId="0" w15:restartNumberingAfterBreak="0">
     <w:nsid w:val="0000A990"/>
     <w:multiLevelType w:val="multilevel"/>
+    <w:tmpl w:val="010EB42A"/>
     <w:lvl w:ilvl="0">
       <w:numFmt w:val="bullet"/>
       <w:lvlText w:val=" "/>
@@ -1576,9 +1853,10 @@
       </w:pPr>
     </w:lvl>
   </w:abstractNum>
-  <w:abstractNum w:abstractNumId="991">
+  <w:abstractNum w:abstractNumId="1" w15:restartNumberingAfterBreak="0">
     <w:nsid w:val="0000A991"/>
     <w:multiLevelType w:val="multilevel"/>
+    <w:tmpl w:val="287228DC"/>
     <w:lvl w:ilvl="0">
       <w:numFmt w:val="bullet"/>
       <w:lvlText w:val=""/>
@@ -1679,36 +1957,36 @@
       </w:rPr>
     </w:lvl>
   </w:abstractNum>
-  <w:num w:numId="1000">
-    <w:abstractNumId w:val="990"/>
+  <w:num w:numId="1">
+    <w:abstractNumId w:val="0"/>
   </w:num>
-  <w:num w:numId="1001">
-    <w:abstractNumId w:val="991"/>
+  <w:num w:numId="2">
+    <w:abstractNumId w:val="1"/>
   </w:num>
-  <w:num w:numId="1002">
-    <w:abstractNumId w:val="991"/>
+  <w:num w:numId="3">
+    <w:abstractNumId w:val="1"/>
   </w:num>
-  <w:num w:numId="1003">
-    <w:abstractNumId w:val="991"/>
+  <w:num w:numId="4">
+    <w:abstractNumId w:val="1"/>
   </w:num>
-  <w:num w:numId="1004">
-    <w:abstractNumId w:val="991"/>
+  <w:num w:numId="5">
+    <w:abstractNumId w:val="1"/>
   </w:num>
-  <w:num w:numId="1005">
-    <w:abstractNumId w:val="991"/>
+  <w:num w:numId="6">
+    <w:abstractNumId w:val="1"/>
   </w:num>
 </w:numbering>
 </file>
 
 <file path=word/styles.xml><?xml version="1.0" encoding="utf-8"?>
-<w:styles xmlns:r="http://schemas.openxmlformats.org/officeDocument/2006/relationships" xmlns:w="http://schemas.openxmlformats.org/wordprocessingml/2006/main">
+<w:styles xmlns:mc="http://schemas.openxmlformats.org/markup-compatibility/2006" xmlns:r="http://schemas.openxmlformats.org/officeDocument/2006/relationships" xmlns:w="http://schemas.openxmlformats.org/wordprocessingml/2006/main" xmlns:w14="http://schemas.microsoft.com/office/word/2010/wordml" xmlns:w15="http://schemas.microsoft.com/office/word/2012/wordml" xmlns:w16cex="http://schemas.microsoft.com/office/word/2018/wordml/cex" xmlns:w16cid="http://schemas.microsoft.com/office/word/2016/wordml/cid" xmlns:w16="http://schemas.microsoft.com/office/word/2018/wordml" xmlns:w16sdtdh="http://schemas.microsoft.com/office/word/2020/wordml/sdtdatahash" xmlns:w16se="http://schemas.microsoft.com/office/word/2015/wordml/symex" mc:Ignorable="w14 w15 w16se w16cid w16 w16cex w16sdtdh">
   <w:docDefaults>
     <w:rPrDefault>
       <w:rPr>
-        <w:rFonts w:ascii="Cambria" w:cs="Cambria" w:hAnsi="Cambria"/>
+        <w:rFonts w:ascii="Cambria" w:eastAsia="Times New Roman" w:hAnsi="Cambria" w:cs="Cambria"/>
         <w:sz w:val="22"/>
         <w:szCs w:val="22"/>
-        <w:lang w:bidi="ar-SA" w:eastAsia="es-AR" w:val="es-AR"/>
+        <w:lang w:val="es-AR" w:eastAsia="es-AR" w:bidi="ar-SA"/>
       </w:rPr>
     </w:rPrDefault>
     <w:pPrDefault>
@@ -1718,180 +1996,346 @@
       </w:pPr>
     </w:pPrDefault>
   </w:docDefaults>
-  <w:latentStyles w:count="276" w:defLockedState="0" w:defQFormat="0" w:defSemiHidden="0" w:defUIPriority="0" w:defUnhideWhenUsed="0"/>
-  <w:style w:default="1" w:styleId="Normal" w:type="paragraph">
+  <w:latentStyles w:defLockedState="0" w:defUIPriority="0" w:defSemiHidden="0" w:defUnhideWhenUsed="0" w:defQFormat="0" w:count="376">
+    <w:lsdException w:name="heading 5" w:semiHidden="1" w:unhideWhenUsed="1"/>
+    <w:lsdException w:name="index 2" w:semiHidden="1" w:unhideWhenUsed="1"/>
+    <w:lsdException w:name="index 3" w:semiHidden="1" w:unhideWhenUsed="1"/>
+    <w:lsdException w:name="index 4" w:semiHidden="1" w:unhideWhenUsed="1"/>
+    <w:lsdException w:name="index 5" w:semiHidden="1" w:unhideWhenUsed="1"/>
+    <w:lsdException w:name="index 6" w:semiHidden="1" w:unhideWhenUsed="1"/>
+    <w:lsdException w:name="index 7" w:semiHidden="1" w:unhideWhenUsed="1"/>
+    <w:lsdException w:name="index 8" w:semiHidden="1" w:unhideWhenUsed="1"/>
+    <w:lsdException w:name="index 9" w:semiHidden="1" w:unhideWhenUsed="1"/>
+    <w:lsdException w:name="toc 1" w:semiHidden="1" w:uiPriority="39" w:unhideWhenUsed="1"/>
+    <w:lsdException w:name="toc 2" w:semiHidden="1" w:unhideWhenUsed="1"/>
+    <w:lsdException w:name="toc 3" w:semiHidden="1" w:unhideWhenUsed="1"/>
+    <w:lsdException w:name="toc 4" w:semiHidden="1" w:unhideWhenUsed="1"/>
+    <w:lsdException w:name="toc 5" w:semiHidden="1" w:unhideWhenUsed="1"/>
+    <w:lsdException w:name="toc 6" w:semiHidden="1" w:unhideWhenUsed="1"/>
+    <w:lsdException w:name="toc 7" w:semiHidden="1" w:unhideWhenUsed="1"/>
+    <w:lsdException w:name="toc 8" w:semiHidden="1" w:unhideWhenUsed="1"/>
+    <w:lsdException w:name="toc 9" w:semiHidden="1" w:unhideWhenUsed="1"/>
+    <w:lsdException w:name="Normal Indent" w:semiHidden="1" w:unhideWhenUsed="1"/>
+    <w:lsdException w:name="footnote text" w:semiHidden="1" w:unhideWhenUsed="1"/>
+    <w:lsdException w:name="annotation text" w:semiHidden="1" w:unhideWhenUsed="1"/>
+    <w:lsdException w:name="header" w:semiHidden="1" w:unhideWhenUsed="1"/>
+    <w:lsdException w:name="footer" w:semiHidden="1" w:unhideWhenUsed="1"/>
+    <w:lsdException w:name="index heading" w:semiHidden="1" w:unhideWhenUsed="1"/>
+    <w:lsdException w:name="caption" w:semiHidden="1" w:unhideWhenUsed="1"/>
+    <w:lsdException w:name="table of figures" w:semiHidden="1" w:unhideWhenUsed="1"/>
+    <w:lsdException w:name="envelope address" w:semiHidden="1" w:unhideWhenUsed="1"/>
+    <w:lsdException w:name="envelope return" w:semiHidden="1" w:unhideWhenUsed="1"/>
+    <w:lsdException w:name="footnote reference" w:semiHidden="1" w:unhideWhenUsed="1"/>
+    <w:lsdException w:name="annotation reference" w:semiHidden="1" w:unhideWhenUsed="1"/>
+    <w:lsdException w:name="line number" w:semiHidden="1" w:unhideWhenUsed="1"/>
+    <w:lsdException w:name="page number" w:semiHidden="1" w:unhideWhenUsed="1"/>
+    <w:lsdException w:name="endnote reference" w:semiHidden="1" w:unhideWhenUsed="1"/>
+    <w:lsdException w:name="endnote text" w:semiHidden="1" w:unhideWhenUsed="1"/>
+    <w:lsdException w:name="table of authorities" w:semiHidden="1" w:unhideWhenUsed="1"/>
+    <w:lsdException w:name="macro" w:semiHidden="1" w:unhideWhenUsed="1"/>
+    <w:lsdException w:name="toa heading" w:semiHidden="1" w:unhideWhenUsed="1"/>
+    <w:lsdException w:name="List" w:semiHidden="1" w:unhideWhenUsed="1"/>
+    <w:lsdException w:name="List Bullet" w:semiHidden="1" w:unhideWhenUsed="1"/>
+    <w:lsdException w:name="List Number" w:semiHidden="1" w:unhideWhenUsed="1"/>
+    <w:lsdException w:name="List 2" w:semiHidden="1" w:unhideWhenUsed="1"/>
+    <w:lsdException w:name="List 3" w:semiHidden="1" w:unhideWhenUsed="1"/>
+    <w:lsdException w:name="List 4" w:semiHidden="1" w:unhideWhenUsed="1"/>
+    <w:lsdException w:name="List Bullet 2" w:semiHidden="1" w:unhideWhenUsed="1"/>
+    <w:lsdException w:name="List Bullet 3" w:semiHidden="1" w:unhideWhenUsed="1"/>
+    <w:lsdException w:name="List Number 2" w:semiHidden="1" w:unhideWhenUsed="1"/>
+    <w:lsdException w:name="List Number 3" w:semiHidden="1" w:unhideWhenUsed="1"/>
+    <w:lsdException w:name="List Number 4" w:semiHidden="1" w:unhideWhenUsed="1"/>
+    <w:lsdException w:name="List Number 5" w:semiHidden="1" w:unhideWhenUsed="1"/>
+    <w:lsdException w:name="Closing" w:semiHidden="1" w:unhideWhenUsed="1"/>
+    <w:lsdException w:name="Signature" w:semiHidden="1" w:unhideWhenUsed="1"/>
+    <w:lsdException w:name="Default Paragraph Font" w:semiHidden="1" w:unhideWhenUsed="1"/>
+    <w:lsdException w:name="Body Text" w:semiHidden="1" w:unhideWhenUsed="1"/>
+    <w:lsdException w:name="Body Text Indent" w:semiHidden="1" w:unhideWhenUsed="1"/>
+    <w:lsdException w:name="List Continue" w:semiHidden="1" w:unhideWhenUsed="1"/>
+    <w:lsdException w:name="List Continue 2" w:semiHidden="1" w:unhideWhenUsed="1"/>
+    <w:lsdException w:name="List Continue 3" w:semiHidden="1" w:unhideWhenUsed="1"/>
+    <w:lsdException w:name="List Continue 4" w:semiHidden="1" w:unhideWhenUsed="1"/>
+    <w:lsdException w:name="List Continue 5" w:semiHidden="1" w:unhideWhenUsed="1"/>
+    <w:lsdException w:name="Message Header" w:semiHidden="1" w:unhideWhenUsed="1"/>
+    <w:lsdException w:name="Salutation" w:semiHidden="1" w:unhideWhenUsed="1"/>
+    <w:lsdException w:name="Date" w:semiHidden="1" w:unhideWhenUsed="1"/>
+    <w:lsdException w:name="Body Text First Indent" w:semiHidden="1" w:unhideWhenUsed="1"/>
+    <w:lsdException w:name="Body Text Indent 2" w:semiHidden="1" w:unhideWhenUsed="1"/>
+    <w:lsdException w:name="Body Text Indent 3" w:semiHidden="1" w:unhideWhenUsed="1"/>
+    <w:lsdException w:name="Block Text" w:semiHidden="1" w:unhideWhenUsed="1"/>
+    <w:lsdException w:name="Hyperlink" w:semiHidden="1" w:uiPriority="99" w:unhideWhenUsed="1"/>
+    <w:lsdException w:name="FollowedHyperlink" w:semiHidden="1" w:unhideWhenUsed="1"/>
+    <w:lsdException w:name="Document Map" w:semiHidden="1" w:unhideWhenUsed="1"/>
+    <w:lsdException w:name="Plain Text" w:semiHidden="1" w:unhideWhenUsed="1"/>
+    <w:lsdException w:name="E-mail Signature" w:semiHidden="1" w:unhideWhenUsed="1"/>
+    <w:lsdException w:name="HTML Top of Form" w:semiHidden="1" w:unhideWhenUsed="1"/>
+    <w:lsdException w:name="HTML Bottom of Form" w:semiHidden="1" w:unhideWhenUsed="1"/>
+    <w:lsdException w:name="Normal (Web)" w:semiHidden="1" w:unhideWhenUsed="1"/>
+    <w:lsdException w:name="HTML Acronym" w:semiHidden="1" w:unhideWhenUsed="1"/>
+    <w:lsdException w:name="HTML Address" w:semiHidden="1" w:unhideWhenUsed="1"/>
+    <w:lsdException w:name="HTML Cite" w:semiHidden="1" w:unhideWhenUsed="1"/>
+    <w:lsdException w:name="HTML Code" w:semiHidden="1" w:unhideWhenUsed="1"/>
+    <w:lsdException w:name="HTML Definition" w:semiHidden="1" w:unhideWhenUsed="1"/>
+    <w:lsdException w:name="HTML Keyboard" w:semiHidden="1" w:unhideWhenUsed="1"/>
+    <w:lsdException w:name="HTML Preformatted" w:semiHidden="1" w:unhideWhenUsed="1"/>
+    <w:lsdException w:name="HTML Sample" w:semiHidden="1" w:unhideWhenUsed="1"/>
+    <w:lsdException w:name="HTML Typewriter" w:semiHidden="1" w:unhideWhenUsed="1"/>
+    <w:lsdException w:name="HTML Variable" w:semiHidden="1" w:unhideWhenUsed="1"/>
+    <w:lsdException w:name="Normal Table" w:semiHidden="1" w:unhideWhenUsed="1"/>
+    <w:lsdException w:name="annotation subject" w:semiHidden="1" w:unhideWhenUsed="1"/>
+    <w:lsdException w:name="No List" w:semiHidden="1" w:unhideWhenUsed="1"/>
+    <w:lsdException w:name="Outline List 1" w:semiHidden="1" w:unhideWhenUsed="1"/>
+    <w:lsdException w:name="Outline List 2" w:semiHidden="1" w:unhideWhenUsed="1"/>
+    <w:lsdException w:name="Outline List 3" w:semiHidden="1" w:unhideWhenUsed="1"/>
+    <w:lsdException w:name="Table Simple 1" w:semiHidden="1" w:unhideWhenUsed="1"/>
+    <w:lsdException w:name="Table Simple 2" w:semiHidden="1" w:unhideWhenUsed="1"/>
+    <w:lsdException w:name="Table Simple 3" w:semiHidden="1" w:unhideWhenUsed="1"/>
+    <w:lsdException w:name="Table Classic 1" w:semiHidden="1" w:unhideWhenUsed="1"/>
+    <w:lsdException w:name="Table Classic 2" w:semiHidden="1" w:unhideWhenUsed="1"/>
+    <w:lsdException w:name="Table Classic 3" w:semiHidden="1" w:unhideWhenUsed="1"/>
+    <w:lsdException w:name="Table Classic 4" w:semiHidden="1" w:unhideWhenUsed="1"/>
+    <w:lsdException w:name="Table Colorful 1" w:semiHidden="1" w:unhideWhenUsed="1"/>
+    <w:lsdException w:name="Table Colorful 2" w:semiHidden="1" w:unhideWhenUsed="1"/>
+    <w:lsdException w:name="Table Colorful 3" w:semiHidden="1" w:unhideWhenUsed="1"/>
+    <w:lsdException w:name="Table Columns 1" w:semiHidden="1" w:unhideWhenUsed="1"/>
+    <w:lsdException w:name="Table Columns 2" w:semiHidden="1" w:unhideWhenUsed="1"/>
+    <w:lsdException w:name="Table Columns 3" w:semiHidden="1" w:unhideWhenUsed="1"/>
+    <w:lsdException w:name="Table Columns 4" w:semiHidden="1" w:unhideWhenUsed="1"/>
+    <w:lsdException w:name="Table Columns 5" w:semiHidden="1" w:unhideWhenUsed="1"/>
+    <w:lsdException w:name="Table Grid 1" w:semiHidden="1" w:unhideWhenUsed="1"/>
+    <w:lsdException w:name="Table Grid 2" w:semiHidden="1" w:unhideWhenUsed="1"/>
+    <w:lsdException w:name="Table Grid 3" w:semiHidden="1" w:unhideWhenUsed="1"/>
+    <w:lsdException w:name="Table Grid 4" w:semiHidden="1" w:unhideWhenUsed="1"/>
+    <w:lsdException w:name="Table Grid 5" w:semiHidden="1" w:unhideWhenUsed="1"/>
+    <w:lsdException w:name="Table Grid 6" w:semiHidden="1" w:unhideWhenUsed="1"/>
+    <w:lsdException w:name="Table Grid 7" w:semiHidden="1" w:unhideWhenUsed="1"/>
+    <w:lsdException w:name="Table Grid 8" w:semiHidden="1" w:unhideWhenUsed="1"/>
+    <w:lsdException w:name="Table List 1" w:semiHidden="1" w:unhideWhenUsed="1"/>
+    <w:lsdException w:name="Table List 2" w:semiHidden="1" w:unhideWhenUsed="1"/>
+    <w:lsdException w:name="Table List 3" w:semiHidden="1" w:unhideWhenUsed="1"/>
+    <w:lsdException w:name="Table List 4" w:semiHidden="1" w:unhideWhenUsed="1"/>
+    <w:lsdException w:name="Table List 5" w:semiHidden="1" w:unhideWhenUsed="1"/>
+    <w:lsdException w:name="Table List 6" w:semiHidden="1" w:unhideWhenUsed="1"/>
+    <w:lsdException w:name="Table List 7" w:semiHidden="1" w:unhideWhenUsed="1"/>
+    <w:lsdException w:name="Table List 8" w:semiHidden="1" w:unhideWhenUsed="1"/>
+    <w:lsdException w:name="Table 3D effects 1" w:semiHidden="1" w:unhideWhenUsed="1"/>
+    <w:lsdException w:name="Table 3D effects 2" w:semiHidden="1" w:unhideWhenUsed="1"/>
+    <w:lsdException w:name="Table 3D effects 3" w:semiHidden="1" w:unhideWhenUsed="1"/>
+    <w:lsdException w:name="Table Contemporary" w:semiHidden="1" w:unhideWhenUsed="1"/>
+    <w:lsdException w:name="Table Elegant" w:semiHidden="1" w:unhideWhenUsed="1"/>
+    <w:lsdException w:name="Table Professional" w:semiHidden="1" w:unhideWhenUsed="1"/>
+    <w:lsdException w:name="Table Subtle 1" w:semiHidden="1" w:unhideWhenUsed="1"/>
+    <w:lsdException w:name="Table Subtle 2" w:semiHidden="1" w:unhideWhenUsed="1"/>
+    <w:lsdException w:name="Table Web 1" w:semiHidden="1" w:unhideWhenUsed="1"/>
+    <w:lsdException w:name="Table Web 2" w:semiHidden="1" w:unhideWhenUsed="1"/>
+    <w:lsdException w:name="Table Web 3" w:semiHidden="1" w:unhideWhenUsed="1"/>
+    <w:lsdException w:name="Balloon Text" w:semiHidden="1" w:unhideWhenUsed="1"/>
+    <w:lsdException w:name="Table Theme" w:semiHidden="1" w:unhideWhenUsed="1"/>
+    <w:lsdException w:name="Placeholder Text" w:semiHidden="1"/>
+    <w:lsdException w:name="Light Shading"/>
+    <w:lsdException w:name="Light List"/>
+    <w:lsdException w:name="Medium Grid 3"/>
+    <w:lsdException w:name="Dark List"/>
+    <w:lsdException w:name="Colorful Shading"/>
+    <w:lsdException w:name="Colorful List"/>
+    <w:lsdException w:name="Colorful Grid"/>
+    <w:lsdException w:name="Light Shading Accent 1"/>
+    <w:lsdException w:name="Light List Accent 1"/>
+    <w:lsdException w:name="Light Grid Accent 1"/>
+    <w:lsdException w:name="Medium Shading 1 Accent 1"/>
+    <w:lsdException w:name="Medium Shading 2 Accent 1"/>
+    <w:lsdException w:name="Medium List 1 Accent 1"/>
+    <w:lsdException w:name="Revision" w:semiHidden="1"/>
+    <w:lsdException w:name="Medium List 2 Accent 1"/>
+    <w:lsdException w:name="Medium Grid 1 Accent 1"/>
+    <w:lsdException w:name="Medium Grid 2 Accent 1"/>
+    <w:lsdException w:name="Medium Grid 3 Accent 1"/>
+    <w:lsdException w:name="Dark List Accent 1"/>
+    <w:lsdException w:name="Colorful Shading Accent 1"/>
+    <w:lsdException w:name="Colorful List Accent 1"/>
+    <w:lsdException w:name="Colorful Grid Accent 1"/>
+    <w:lsdException w:name="Light Shading Accent 2"/>
+    <w:lsdException w:name="Light List Accent 2"/>
+    <w:lsdException w:name="Light Grid Accent 2"/>
+    <w:lsdException w:name="Medium Shading 1 Accent 2"/>
+    <w:lsdException w:name="Medium Shading 2 Accent 2"/>
+    <w:lsdException w:name="Medium List 1 Accent 2"/>
+    <w:lsdException w:name="Medium List 2 Accent 2"/>
+    <w:lsdException w:name="Medium Grid 1 Accent 2"/>
+    <w:lsdException w:name="Medium Grid 2 Accent 2"/>
+    <w:lsdException w:name="Medium Grid 3 Accent 2"/>
+    <w:lsdException w:name="Dark List Accent 2"/>
+    <w:lsdException w:name="Colorful Shading Accent 2"/>
+    <w:lsdException w:name="Colorful List Accent 2"/>
+    <w:lsdException w:name="Colorful Grid Accent 2"/>
+    <w:lsdException w:name="Light Shading Accent 3"/>
+    <w:lsdException w:name="Light List Accent 3"/>
+    <w:lsdException w:name="Light Grid Accent 3"/>
+    <w:lsdException w:name="Medium Shading 1 Accent 3"/>
+    <w:lsdException w:name="Medium Shading 2 Accent 3"/>
+    <w:lsdException w:name="Medium List 1 Accent 3"/>
+    <w:lsdException w:name="Medium List 2 Accent 3"/>
+    <w:lsdException w:name="Medium Grid 1 Accent 3"/>
+    <w:lsdException w:name="Medium Grid 2 Accent 3"/>
+    <w:lsdException w:name="Medium Grid 3 Accent 3"/>
+    <w:lsdException w:name="Dark List Accent 3"/>
+    <w:lsdException w:name="Colorful Shading Accent 3"/>
+    <w:lsdException w:name="Colorful List Accent 3"/>
+    <w:lsdException w:name="Colorful Grid Accent 3"/>
+    <w:lsdException w:name="Light Shading Accent 4"/>
+    <w:lsdException w:name="Light List Accent 4"/>
+    <w:lsdException w:name="Light Grid Accent 4"/>
+    <w:lsdException w:name="Medium Shading 1 Accent 4"/>
+    <w:lsdException w:name="Medium Shading 2 Accent 4"/>
+    <w:lsdException w:name="Medium List 1 Accent 4"/>
+    <w:lsdException w:name="Medium List 2 Accent 4"/>
+    <w:lsdException w:name="Medium Grid 1 Accent 4"/>
+    <w:lsdException w:name="Medium Grid 2 Accent 4"/>
+    <w:lsdException w:name="Medium Grid 3 Accent 4"/>
+    <w:lsdException w:name="Dark List Accent 4"/>
+    <w:lsdException w:name="Colorful Shading Accent 4"/>
+    <w:lsdException w:name="Colorful List Accent 4"/>
+    <w:lsdException w:name="Colorful Grid Accent 4"/>
+    <w:lsdException w:name="Light Shading Accent 5"/>
+    <w:lsdException w:name="Light List Accent 5"/>
+    <w:lsdException w:name="Light Grid Accent 5"/>
+    <w:lsdException w:name="Medium Shading 1 Accent 5"/>
+    <w:lsdException w:name="Medium Shading 2 Accent 5"/>
+    <w:lsdException w:name="Medium List 1 Accent 5"/>
+    <w:lsdException w:name="Medium List 2 Accent 5"/>
+    <w:lsdException w:name="Medium Grid 1 Accent 5"/>
+    <w:lsdException w:name="Medium Grid 2 Accent 5"/>
+    <w:lsdException w:name="Medium Grid 3 Accent 5"/>
+    <w:lsdException w:name="Dark List Accent 5"/>
+    <w:lsdException w:name="Colorful Shading Accent 5"/>
+    <w:lsdException w:name="Colorful List Accent 5"/>
+    <w:lsdException w:name="Colorful Grid Accent 5"/>
+    <w:lsdException w:name="Light Shading Accent 6"/>
+    <w:lsdException w:name="Light List Accent 6"/>
+    <w:lsdException w:name="Light Grid Accent 6"/>
+    <w:lsdException w:name="Medium Shading 1 Accent 6"/>
+    <w:lsdException w:name="Medium Shading 2 Accent 6"/>
+    <w:lsdException w:name="Medium List 1 Accent 6"/>
+    <w:lsdException w:name="Medium List 2 Accent 6"/>
+    <w:lsdException w:name="Medium Grid 1 Accent 6"/>
+    <w:lsdException w:name="Medium Grid 2 Accent 6"/>
+    <w:lsdException w:name="Medium Grid 3 Accent 6"/>
+    <w:lsdException w:name="Dark List Accent 6"/>
+    <w:lsdException w:name="Colorful Shading Accent 6"/>
+    <w:lsdException w:name="Colorful List Accent 6"/>
+    <w:lsdException w:name="Colorful Grid Accent 6"/>
+    <w:lsdException w:name="Bibliography" w:semiHidden="1" w:unhideWhenUsed="1"/>
+    <w:lsdException w:name="TOC Heading" w:semiHidden="1" w:unhideWhenUsed="1"/>
+    <w:lsdException w:name="Grid Table 4" w:uiPriority="49"/>
+    <w:lsdException w:name="Grid Table 5 Dark" w:uiPriority="50"/>
+    <w:lsdException w:name="Grid Table 6 Colorful" w:uiPriority="51"/>
+    <w:lsdException w:name="Grid Table 7 Colorful" w:uiPriority="52"/>
+    <w:lsdException w:name="Grid Table 1 Light Accent 1" w:uiPriority="46"/>
+    <w:lsdException w:name="Grid Table 2 Accent 1" w:uiPriority="47"/>
+    <w:lsdException w:name="Grid Table 3 Accent 1" w:uiPriority="48"/>
+    <w:lsdException w:name="Grid Table 4 Accent 1" w:uiPriority="49"/>
+    <w:lsdException w:name="Grid Table 5 Dark Accent 1" w:uiPriority="50"/>
+    <w:lsdException w:name="Grid Table 6 Colorful Accent 1" w:uiPriority="51"/>
+    <w:lsdException w:name="Grid Table 7 Colorful Accent 1" w:uiPriority="52"/>
+    <w:lsdException w:name="Grid Table 1 Light Accent 2" w:uiPriority="46"/>
+    <w:lsdException w:name="Grid Table 2 Accent 2" w:uiPriority="47"/>
+    <w:lsdException w:name="Grid Table 3 Accent 2" w:uiPriority="48"/>
+    <w:lsdException w:name="Grid Table 4 Accent 2" w:uiPriority="49"/>
+    <w:lsdException w:name="Grid Table 5 Dark Accent 2" w:uiPriority="50"/>
+    <w:lsdException w:name="Grid Table 6 Colorful Accent 2" w:uiPriority="51"/>
+    <w:lsdException w:name="Grid Table 7 Colorful Accent 2" w:uiPriority="52"/>
+    <w:lsdException w:name="Grid Table 1 Light Accent 3" w:uiPriority="46"/>
+    <w:lsdException w:name="Grid Table 2 Accent 3" w:uiPriority="47"/>
+    <w:lsdException w:name="Grid Table 3 Accent 3" w:uiPriority="48"/>
+    <w:lsdException w:name="Grid Table 4 Accent 3" w:uiPriority="49"/>
+    <w:lsdException w:name="Grid Table 5 Dark Accent 3" w:uiPriority="50"/>
+    <w:lsdException w:name="Grid Table 6 Colorful Accent 3" w:uiPriority="51"/>
+    <w:lsdException w:name="Grid Table 7 Colorful Accent 3" w:uiPriority="52"/>
+    <w:lsdException w:name="Grid Table 1 Light Accent 4" w:uiPriority="46"/>
+    <w:lsdException w:name="Grid Table 2 Accent 4" w:uiPriority="47"/>
+    <w:lsdException w:name="Grid Table 3 Accent 4" w:uiPriority="48"/>
+    <w:lsdException w:name="Grid Table 4 Accent 4" w:uiPriority="49"/>
+    <w:lsdException w:name="Grid Table 5 Dark Accent 4" w:uiPriority="50"/>
+    <w:lsdException w:name="Grid Table 6 Colorful Accent 4" w:uiPriority="51"/>
+    <w:lsdException w:name="Grid Table 7 Colorful Accent 4" w:uiPriority="52"/>
+    <w:lsdException w:name="Grid Table 1 Light Accent 5" w:uiPriority="46"/>
+    <w:lsdException w:name="Grid Table 2 Accent 5" w:uiPriority="47"/>
+    <w:lsdException w:name="Grid Table 3 Accent 5" w:uiPriority="48"/>
+    <w:lsdException w:name="Grid Table 4 Accent 5" w:uiPriority="49"/>
+    <w:lsdException w:name="Grid Table 5 Dark Accent 5" w:uiPriority="50"/>
+    <w:lsdException w:name="Grid Table 6 Colorful Accent 5" w:uiPriority="51"/>
+    <w:lsdException w:name="Grid Table 7 Colorful Accent 5" w:uiPriority="52"/>
+    <w:lsdException w:name="Grid Table 1 Light Accent 6" w:uiPriority="46"/>
+    <w:lsdException w:name="Grid Table 2 Accent 6" w:uiPriority="47"/>
+    <w:lsdException w:name="Grid Table 3 Accent 6" w:uiPriority="48"/>
+    <w:lsdException w:name="Grid Table 4 Accent 6" w:uiPriority="49"/>
+    <w:lsdException w:name="Grid Table 5 Dark Accent 6" w:uiPriority="50"/>
+    <w:lsdException w:name="Grid Table 6 Colorful Accent 6" w:uiPriority="51"/>
+    <w:lsdException w:name="Grid Table 7 Colorful Accent 6" w:uiPriority="52"/>
+    <w:lsdException w:name="List Table 1 Light" w:uiPriority="46"/>
+    <w:lsdException w:name="List Table 2" w:uiPriority="47"/>
+    <w:lsdException w:name="List Table 3" w:uiPriority="48"/>
+    <w:lsdException w:name="List Table 4" w:uiPriority="49"/>
+    <w:lsdException w:name="List Table 5 Dark" w:uiPriority="50"/>
+    <w:lsdException w:name="List Table 6 Colorful" w:uiPriority="51"/>
+    <w:lsdException w:name="List Table 7 Colorful" w:uiPriority="52"/>
+    <w:lsdException w:name="List Table 1 Light Accent 1" w:uiPriority="46"/>
+    <w:lsdException w:name="List Table 2 Accent 1" w:uiPriority="47"/>
+    <w:lsdException w:name="List Table 3 Accent 1" w:uiPriority="48"/>
+    <w:lsdException w:name="List Table 4 Accent 1" w:uiPriority="49"/>
+    <w:lsdException w:name="List Table 5 Dark Accent 1" w:uiPriority="50"/>
+    <w:lsdException w:name="List Table 6 Colorful Accent 1" w:uiPriority="51"/>
+    <w:lsdException w:name="List Table 7 Colorful Accent 1" w:uiPriority="52"/>
+    <w:lsdException w:name="List Table 1 Light Accent 2" w:uiPriority="46"/>
+    <w:lsdException w:name="List Table 2 Accent 2" w:uiPriority="47"/>
+    <w:lsdException w:name="List Table 3 Accent 2" w:uiPriority="48"/>
+    <w:lsdException w:name="List Table 4 Accent 2" w:uiPriority="49"/>
+    <w:lsdException w:name="List Table 5 Dark Accent 2" w:uiPriority="50"/>
+    <w:lsdException w:name="List Table 6 Colorful Accent 2" w:uiPriority="51"/>
+    <w:lsdException w:name="List Table 7 Colorful Accent 2" w:uiPriority="52"/>
+    <w:lsdException w:name="List Table 1 Light Accent 3" w:uiPriority="46"/>
+    <w:lsdException w:name="List Table 2 Accent 3" w:uiPriority="47"/>
+    <w:lsdException w:name="List Table 3 Accent 3" w:uiPriority="48"/>
+    <w:lsdException w:name="List Table 4 Accent 3" w:uiPriority="49"/>
+    <w:lsdException w:name="List Table 5 Dark Accent 3" w:uiPriority="50"/>
+    <w:lsdException w:name="List Table 6 Colorful Accent 3" w:uiPriority="51"/>
+    <w:lsdException w:name="List Table 7 Colorful Accent 3" w:uiPriority="52"/>
+    <w:lsdException w:name="List Table 1 Light Accent 4" w:uiPriority="46"/>
+    <w:lsdException w:name="List Table 2 Accent 4" w:uiPriority="47"/>
+    <w:lsdException w:name="List Table 3 Accent 4" w:uiPriority="48"/>
+    <w:lsdException w:name="List Table 4 Accent 4" w:uiPriority="49"/>
+    <w:lsdException w:name="List Table 5 Dark Accent 4" w:uiPriority="50"/>
+    <w:lsdException w:name="List Table 6 Colorful Accent 4" w:uiPriority="51"/>
+    <w:lsdException w:name="List Table 7 Colorful Accent 4" w:uiPriority="52"/>
+    <w:lsdException w:name="List Table 1 Light Accent 5" w:uiPriority="46"/>
+    <w:lsdException w:name="List Table 2 Accent 5" w:uiPriority="47"/>
+    <w:lsdException w:name="List Table 3 Accent 5" w:uiPriority="48"/>
+    <w:lsdException w:name="List Table 4 Accent 5" w:uiPriority="49"/>
+    <w:lsdException w:name="List Table 5 Dark Accent 5" w:uiPriority="50"/>
+    <w:lsdException w:name="List Table 6 Colorful Accent 5" w:uiPriority="51"/>
+    <w:lsdException w:name="List Table 7 Colorful Accent 5" w:uiPriority="52"/>
+    <w:lsdException w:name="List Table 1 Light Accent 6" w:uiPriority="46"/>
+    <w:lsdException w:name="List Table 2 Accent 6" w:uiPriority="47"/>
+    <w:lsdException w:name="List Table 3 Accent 6" w:uiPriority="48"/>
+    <w:lsdException w:name="List Table 4 Accent 6" w:uiPriority="49"/>
+    <w:lsdException w:name="List Table 5 Dark Accent 6" w:uiPriority="50"/>
+    <w:lsdException w:name="List Table 6 Colorful Accent 6" w:uiPriority="51"/>
+    <w:lsdException w:name="List Table 7 Colorful Accent 6" w:uiPriority="52"/>
+    <w:lsdException w:name="Mention" w:semiHidden="1" w:uiPriority="99" w:unhideWhenUsed="1"/>
+    <w:lsdException w:name="Smart Hyperlink" w:semiHidden="1" w:uiPriority="99" w:unhideWhenUsed="1"/>
+    <w:lsdException w:name="Hashtag" w:semiHidden="1" w:uiPriority="99" w:unhideWhenUsed="1"/>
+    <w:lsdException w:name="Unresolved Mention" w:semiHidden="1" w:uiPriority="99" w:unhideWhenUsed="1"/>
+    <w:lsdException w:name="Smart Link" w:semiHidden="1" w:uiPriority="99" w:unhideWhenUsed="1"/>
+  </w:latentStyles>
+  <w:style w:type="paragraph" w:default="1" w:styleId="Normal">
     <w:name w:val="Normal"/>
     <w:qFormat/>
   </w:style>
-  <w:style w:styleId="BodyText" w:type="paragraph">
-    <w:name w:val="Body Text"/>
-    <w:basedOn w:val="Normal"/>
-    <w:link w:val="BodyTextChar"/>
-    <w:qFormat/>
-    <w:pPr>
-      <w:spacing w:after="140" w:before="0" w:line="264" w:lineRule="auto"/>
-      <w:jc w:val="both"/>
-    </w:pPr>
-  </w:style>
-  <w:style w:customStyle="1" w:styleId="FirstParagraph" w:type="paragraph">
-    <w:name w:val="First Paragraph"/>
-    <w:basedOn w:val="BodyText"/>
-    <w:next w:val="BodyText"/>
-    <w:qFormat/>
-  </w:style>
-  <w:style w:customStyle="1" w:styleId="Compact" w:type="paragraph">
-    <w:name w:val="Compact"/>
-    <w:basedOn w:val="BodyText"/>
-    <w:qFormat/>
-    <w:pPr>
-      <w:spacing w:after="36" w:before="36"/>
-    </w:pPr>
-  </w:style>
-  <w:style w:styleId="Title" w:type="paragraph">
-    <w:name w:val="Title"/>
-    <w:basedOn w:val="Normal"/>
-    <w:next w:val="BodyText"/>
-    <w:link w:val="TitleChar"/>
-    <w:uiPriority w:val="10"/>
-    <w:qFormat/>
-    <w:pPr>
-      <w:spacing w:after="80" w:before="240" w:line="240" w:lineRule="auto"/>
-      <w:contextualSpacing/>
-      <w:jc w:val="center"/>
-    </w:pPr>
-    <w:rPr>
-      <w:rFonts w:ascii="Cambria" w:cs="Cambria" w:hAnsi="Cambria"/>
-      <w:b/>
-      <w:color w:val="1E3A5F"/>
-      <w:sz w:val="48"/>
-      <w:szCs w:val="48"/>
-    </w:rPr>
-  </w:style>
-  <w:style w:customStyle="1" w:styleId="TitleChar" w:type="character">
-    <w:name w:val="Title Char"/>
-    <w:basedOn w:val="DefaultParagraphFont"/>
-    <w:link w:val="Title"/>
-    <w:uiPriority w:val="10"/>
-    <w:rsid w:val="00A10FD9"/>
-    <w:rPr>
-      <w:rFonts w:asciiTheme="majorHAnsi" w:cstheme="majorBidi" w:eastAsiaTheme="majorEastAsia" w:hAnsiTheme="majorHAnsi"/>
-      <w:sz w:val="56"/>
-      <w:szCs w:val="56"/>
-    </w:rPr>
-  </w:style>
-  <w:style w:styleId="Subtitle" w:type="paragraph">
-    <w:name w:val="Subtitle"/>
-    <w:basedOn w:val="Normal"/>
-    <w:next w:val="BodyText"/>
-    <w:link w:val="SubtitleChar"/>
-    <w:uiPriority w:val="11"/>
-    <w:qFormat/>
-    <w:pPr>
-      <w:spacing w:after="160"/>
-      <w:contextualSpacing/>
-      <w:jc w:val="center"/>
-    </w:pPr>
-    <w:rPr>
-      <w:rFonts w:ascii="Cambria" w:cs="Cambria" w:hAnsi="Cambria"/>
-      <w:i/>
-      <w:color w:val="5B6B7B"/>
-      <w:sz w:val="30"/>
-      <w:szCs w:val="30"/>
-    </w:rPr>
-  </w:style>
-  <w:style w:customStyle="1" w:styleId="SubtitleChar" w:type="character">
-    <w:name w:val="Subtitle Char"/>
-    <w:basedOn w:val="DefaultParagraphFont"/>
-    <w:link w:val="Subtitle"/>
-    <w:uiPriority w:val="11"/>
-    <w:rsid w:val="00A10FD9"/>
-    <w:rPr>
-      <w:rFonts w:cstheme="majorBidi" w:eastAsiaTheme="majorEastAsia"/>
-      <w:color w:themeColor="text1" w:themeTint="A6" w:val="595959"/>
-      <w:spacing w:val="15"/>
-      <w:sz w:val="28"/>
-      <w:szCs w:val="28"/>
-    </w:rPr>
-  </w:style>
-  <w:style w:customStyle="1" w:styleId="Author" w:type="paragraph">
-    <w:name w:val="Author"/>
-    <w:basedOn w:val="Normal"/>
-    <w:next w:val="BodyText"/>
-    <w:qFormat/>
-    <w:pPr>
-      <w:keepNext/>
-      <w:spacing w:after="40"/>
-      <w:contextualSpacing/>
-      <w:jc w:val="center"/>
-    </w:pPr>
-    <w:rPr>
-      <w:rFonts w:ascii="Cambria" w:cs="Cambria" w:hAnsi="Cambria"/>
-      <w:color w:val="333333"/>
-      <w:sz w:val="26"/>
-      <w:szCs w:val="26"/>
-    </w:rPr>
-  </w:style>
-  <w:style w:styleId="Date" w:type="paragraph">
-    <w:name w:val="Date"/>
-    <w:basedOn w:val="Normal"/>
-    <w:next w:val="BodyText"/>
-    <w:qFormat/>
-    <w:pPr>
-      <w:spacing w:before="120"/>
-      <w:jc w:val="center"/>
-    </w:pPr>
-    <w:rPr>
-      <w:rFonts w:ascii="Cambria" w:cs="Cambria" w:hAnsi="Cambria"/>
-      <w:color w:val="5B6B7B"/>
-      <w:sz w:val="24"/>
-      <w:szCs w:val="24"/>
-    </w:rPr>
-  </w:style>
-  <w:style w:customStyle="1" w:styleId="AbstractTitle" w:type="paragraph">
-    <w:name w:val="Abstract Title"/>
-    <w:basedOn w:val="Normal"/>
-    <w:next w:val="Abstract"/>
-    <w:qFormat/>
-    <w:pPr>
-      <w:keepNext/>
-      <w:keepLines/>
-      <w:spacing w:after="0" w:before="300"/>
-      <w:jc w:val="center"/>
-    </w:pPr>
-    <w:rPr>
-      <w:b/>
-      <w:sz w:val="20"/>
-      <w:szCs w:val="20"/>
-    </w:rPr>
-  </w:style>
-  <w:style w:customStyle="1" w:styleId="Abstract" w:type="paragraph">
-    <w:name w:val="Abstract"/>
-    <w:basedOn w:val="Normal"/>
-    <w:next w:val="BodyText"/>
-    <w:qFormat/>
-    <w:pPr>
-      <w:keepNext/>
-      <w:keepLines/>
-      <w:spacing w:after="300" w:before="100"/>
-    </w:pPr>
-    <w:rPr>
-      <w:sz w:val="20"/>
-      <w:szCs w:val="20"/>
-    </w:rPr>
-  </w:style>
-  <w:style w:styleId="Bibliography" w:type="paragraph">
-    <w:name w:val="Bibliography"/>
-    <w:basedOn w:val="Normal"/>
-    <w:next w:val="Bibliography"/>
-    <w:qFormat/>
-    <w:pPr/>
-    <w:rPr/>
-  </w:style>
-  <w:style w:styleId="Heading1" w:type="paragraph">
+  <w:style w:type="paragraph" w:styleId="Ttulo1">
     <w:name w:val="heading 1"/>
     <w:basedOn w:val="Normal"/>
-    <w:next w:val="BodyText"/>
-    <w:link w:val="Heading1Char"/>
+    <w:next w:val="Textoindependiente"/>
+    <w:link w:val="Ttulo1Car"/>
     <w:uiPriority w:val="9"/>
     <w:qFormat/>
     <w:pPr>
@@ -1899,58 +2343,55 @@
       <w:keepLines/>
       <w:pageBreakBefore/>
       <w:pBdr>
-        <w:bottom w:color="1E3A5F" w:space="4" w:sz="8" w:val="single"/>
+        <w:bottom w:val="single" w:sz="8" w:space="4" w:color="1E3A5F"/>
       </w:pBdr>
-      <w:spacing w:after="220" w:before="0"/>
+      <w:spacing w:after="220"/>
       <w:jc w:val="left"/>
       <w:outlineLvl w:val="0"/>
     </w:pPr>
     <w:rPr>
-      <w:rFonts w:ascii="Cambria" w:cs="Cambria" w:hAnsi="Cambria"/>
       <w:b/>
       <w:color w:val="1E3A5F"/>
       <w:sz w:val="34"/>
       <w:szCs w:val="34"/>
     </w:rPr>
   </w:style>
-  <w:style w:styleId="Heading2" w:type="paragraph">
+  <w:style w:type="paragraph" w:styleId="Ttulo2">
     <w:name w:val="heading 2"/>
     <w:basedOn w:val="Normal"/>
-    <w:next w:val="BodyText"/>
-    <w:link w:val="Heading2Char"/>
+    <w:next w:val="Textoindependiente"/>
+    <w:link w:val="Ttulo2Car"/>
     <w:uiPriority w:val="9"/>
     <w:qFormat/>
     <w:pPr>
       <w:keepNext/>
       <w:keepLines/>
-      <w:spacing w:after="80" w:before="240"/>
+      <w:spacing w:before="240" w:after="80"/>
       <w:jc w:val="left"/>
       <w:outlineLvl w:val="1"/>
     </w:pPr>
     <w:rPr>
-      <w:rFonts w:ascii="Cambria" w:cs="Cambria" w:hAnsi="Cambria"/>
       <w:b/>
       <w:color w:val="2A4A6B"/>
       <w:sz w:val="27"/>
       <w:szCs w:val="27"/>
     </w:rPr>
   </w:style>
-  <w:style w:styleId="Heading3" w:type="paragraph">
+  <w:style w:type="paragraph" w:styleId="Ttulo3">
     <w:name w:val="heading 3"/>
     <w:basedOn w:val="Normal"/>
-    <w:next w:val="BodyText"/>
-    <w:link w:val="Heading3Char"/>
+    <w:next w:val="Textoindependiente"/>
+    <w:link w:val="Ttulo3Car"/>
     <w:uiPriority w:val="9"/>
     <w:qFormat/>
     <w:pPr>
       <w:keepNext/>
       <w:keepLines/>
-      <w:spacing w:after="60" w:before="160"/>
+      <w:spacing w:before="160" w:after="60"/>
       <w:jc w:val="left"/>
       <w:outlineLvl w:val="2"/>
     </w:pPr>
     <w:rPr>
-      <w:rFonts w:ascii="Cambria" w:cs="Cambria" w:hAnsi="Cambria"/>
       <w:b/>
       <w:i/>
       <w:color w:val="3A5A7B"/>
@@ -1958,11 +2399,11 @@
       <w:szCs w:val="24"/>
     </w:rPr>
   </w:style>
-  <w:style w:styleId="Heading4" w:type="paragraph">
+  <w:style w:type="paragraph" w:styleId="Ttulo4">
     <w:name w:val="heading 4"/>
     <w:basedOn w:val="Normal"/>
-    <w:next w:val="BodyText"/>
-    <w:link w:val="Heading4Char"/>
+    <w:next w:val="Textoindependiente"/>
+    <w:link w:val="Ttulo4Car"/>
     <w:uiPriority w:val="9"/>
     <w:semiHidden/>
     <w:unhideWhenUsed/>
@@ -1971,21 +2412,21 @@
     <w:pPr>
       <w:keepNext/>
       <w:keepLines/>
-      <w:spacing w:after="40" w:before="80"/>
+      <w:spacing w:before="80" w:after="40"/>
       <w:outlineLvl w:val="3"/>
     </w:pPr>
     <w:rPr>
-      <w:rFonts w:cstheme="majorBidi" w:eastAsiaTheme="majorEastAsia"/>
+      <w:rFonts w:eastAsiaTheme="majorEastAsia" w:cstheme="majorBidi"/>
       <w:i/>
       <w:iCs/>
-      <w:color w:themeColor="accent1" w:themeShade="BF" w:val="0F4761"/>
-    </w:rPr>
-  </w:style>
-  <w:style w:styleId="Heading5" w:type="paragraph">
+      <w:color w:val="0F4761" w:themeColor="accent1" w:themeShade="BF"/>
+    </w:rPr>
+  </w:style>
+  <w:style w:type="paragraph" w:styleId="Ttulo5">
     <w:name w:val="heading 5"/>
     <w:basedOn w:val="Normal"/>
-    <w:next w:val="BodyText"/>
-    <w:link w:val="Heading5Char"/>
+    <w:next w:val="Textoindependiente"/>
+    <w:link w:val="Ttulo5Car"/>
     <w:uiPriority w:val="9"/>
     <w:semiHidden/>
     <w:unhideWhenUsed/>
@@ -1994,19 +2435,19 @@
     <w:pPr>
       <w:keepNext/>
       <w:keepLines/>
-      <w:spacing w:after="40" w:before="80"/>
+      <w:spacing w:before="80" w:after="40"/>
       <w:outlineLvl w:val="4"/>
     </w:pPr>
     <w:rPr>
-      <w:rFonts w:cstheme="majorBidi" w:eastAsiaTheme="majorEastAsia"/>
-      <w:color w:themeColor="accent1" w:themeShade="BF" w:val="0F4761"/>
-    </w:rPr>
-  </w:style>
-  <w:style w:styleId="Heading6" w:type="paragraph">
+      <w:rFonts w:eastAsiaTheme="majorEastAsia" w:cstheme="majorBidi"/>
+      <w:color w:val="0F4761" w:themeColor="accent1" w:themeShade="BF"/>
+    </w:rPr>
+  </w:style>
+  <w:style w:type="paragraph" w:styleId="Ttulo6">
     <w:name w:val="heading 6"/>
     <w:basedOn w:val="Normal"/>
-    <w:next w:val="BodyText"/>
-    <w:link w:val="Heading6Char"/>
+    <w:next w:val="Textoindependiente"/>
+    <w:link w:val="Ttulo6Car"/>
     <w:uiPriority w:val="9"/>
     <w:semiHidden/>
     <w:unhideWhenUsed/>
@@ -2015,21 +2456,21 @@
     <w:pPr>
       <w:keepNext/>
       <w:keepLines/>
-      <w:spacing w:after="0" w:before="40"/>
+      <w:spacing w:before="40" w:after="0"/>
       <w:outlineLvl w:val="5"/>
     </w:pPr>
     <w:rPr>
-      <w:rFonts w:cstheme="majorBidi" w:eastAsiaTheme="majorEastAsia"/>
+      <w:rFonts w:eastAsiaTheme="majorEastAsia" w:cstheme="majorBidi"/>
       <w:i/>
       <w:iCs/>
-      <w:color w:themeColor="text1" w:themeTint="A6" w:val="595959"/>
-    </w:rPr>
-  </w:style>
-  <w:style w:styleId="Heading7" w:type="paragraph">
+      <w:color w:val="595959" w:themeColor="text1" w:themeTint="A6"/>
+    </w:rPr>
+  </w:style>
+  <w:style w:type="paragraph" w:styleId="Ttulo7">
     <w:name w:val="heading 7"/>
     <w:basedOn w:val="Normal"/>
-    <w:next w:val="BodyText"/>
-    <w:link w:val="Heading7Char"/>
+    <w:next w:val="Textoindependiente"/>
+    <w:link w:val="Ttulo7Car"/>
     <w:uiPriority w:val="9"/>
     <w:semiHidden/>
     <w:unhideWhenUsed/>
@@ -2038,19 +2479,19 @@
     <w:pPr>
       <w:keepNext/>
       <w:keepLines/>
-      <w:spacing w:after="0" w:before="40"/>
+      <w:spacing w:before="40" w:after="0"/>
       <w:outlineLvl w:val="6"/>
     </w:pPr>
     <w:rPr>
-      <w:rFonts w:cstheme="majorBidi" w:eastAsiaTheme="majorEastAsia"/>
-      <w:color w:themeColor="text1" w:themeTint="A6" w:val="595959"/>
-    </w:rPr>
-  </w:style>
-  <w:style w:styleId="Heading8" w:type="paragraph">
+      <w:rFonts w:eastAsiaTheme="majorEastAsia" w:cstheme="majorBidi"/>
+      <w:color w:val="595959" w:themeColor="text1" w:themeTint="A6"/>
+    </w:rPr>
+  </w:style>
+  <w:style w:type="paragraph" w:styleId="Ttulo8">
     <w:name w:val="heading 8"/>
     <w:basedOn w:val="Normal"/>
-    <w:next w:val="BodyText"/>
-    <w:link w:val="Heading8Char"/>
+    <w:next w:val="Textoindependiente"/>
+    <w:link w:val="Ttulo8Car"/>
     <w:uiPriority w:val="9"/>
     <w:semiHidden/>
     <w:unhideWhenUsed/>
@@ -2063,17 +2504,17 @@
       <w:outlineLvl w:val="7"/>
     </w:pPr>
     <w:rPr>
-      <w:rFonts w:cstheme="majorBidi" w:eastAsiaTheme="majorEastAsia"/>
+      <w:rFonts w:eastAsiaTheme="majorEastAsia" w:cstheme="majorBidi"/>
       <w:i/>
       <w:iCs/>
-      <w:color w:themeColor="text1" w:themeTint="D8" w:val="272727"/>
-    </w:rPr>
-  </w:style>
-  <w:style w:styleId="Heading9" w:type="paragraph">
+      <w:color w:val="272727" w:themeColor="text1" w:themeTint="D8"/>
+    </w:rPr>
+  </w:style>
+  <w:style w:type="paragraph" w:styleId="Ttulo9">
     <w:name w:val="heading 9"/>
     <w:basedOn w:val="Normal"/>
-    <w:next w:val="BodyText"/>
-    <w:link w:val="Heading9Char"/>
+    <w:next w:val="Textoindependiente"/>
+    <w:link w:val="Ttulo9Car"/>
     <w:uiPriority w:val="9"/>
     <w:semiHidden/>
     <w:unhideWhenUsed/>
@@ -2086,191 +2527,367 @@
       <w:outlineLvl w:val="8"/>
     </w:pPr>
     <w:rPr>
-      <w:rFonts w:cstheme="majorBidi" w:eastAsiaTheme="majorEastAsia"/>
-      <w:color w:themeColor="text1" w:themeTint="D8" w:val="272727"/>
-    </w:rPr>
-  </w:style>
-  <w:style w:customStyle="1" w:styleId="Heading1Char" w:type="character">
-    <w:name w:val="Heading 1 Char"/>
-    <w:basedOn w:val="DefaultParagraphFont"/>
-    <w:link w:val="Heading1"/>
+      <w:rFonts w:eastAsiaTheme="majorEastAsia" w:cstheme="majorBidi"/>
+      <w:color w:val="272727" w:themeColor="text1" w:themeTint="D8"/>
+    </w:rPr>
+  </w:style>
+  <w:style w:type="character" w:default="1" w:styleId="Fuentedeprrafopredeter">
+    <w:name w:val="Default Paragraph Font"/>
+    <w:uiPriority w:val="1"/>
+    <w:semiHidden/>
+    <w:unhideWhenUsed/>
+  </w:style>
+  <w:style w:type="table" w:default="1" w:styleId="Tablanormal">
+    <w:name w:val="Normal Table"/>
+    <w:uiPriority w:val="99"/>
+    <w:semiHidden/>
+    <w:unhideWhenUsed/>
+    <w:tblPr>
+      <w:tblInd w:w="0" w:type="dxa"/>
+      <w:tblCellMar>
+        <w:top w:w="0" w:type="dxa"/>
+        <w:left w:w="108" w:type="dxa"/>
+        <w:bottom w:w="0" w:type="dxa"/>
+        <w:right w:w="108" w:type="dxa"/>
+      </w:tblCellMar>
+    </w:tblPr>
+  </w:style>
+  <w:style w:type="numbering" w:default="1" w:styleId="Sinlista">
+    <w:name w:val="No List"/>
+    <w:uiPriority w:val="99"/>
+    <w:semiHidden/>
+    <w:unhideWhenUsed/>
+  </w:style>
+  <w:style w:type="paragraph" w:styleId="Textoindependiente">
+    <w:name w:val="Body Text"/>
+    <w:basedOn w:val="Normal"/>
+    <w:qFormat/>
+    <w:pPr>
+      <w:spacing w:after="140"/>
+    </w:pPr>
+  </w:style>
+  <w:style w:type="paragraph" w:customStyle="1" w:styleId="FirstParagraph">
+    <w:name w:val="First Paragraph"/>
+    <w:basedOn w:val="Textoindependiente"/>
+    <w:next w:val="Textoindependiente"/>
+    <w:qFormat/>
+  </w:style>
+  <w:style w:type="paragraph" w:customStyle="1" w:styleId="Compact">
+    <w:name w:val="Compact"/>
+    <w:basedOn w:val="Textoindependiente"/>
+    <w:qFormat/>
+    <w:pPr>
+      <w:spacing w:before="36" w:after="36"/>
+    </w:pPr>
+  </w:style>
+  <w:style w:type="paragraph" w:styleId="Ttulo">
+    <w:name w:val="Title"/>
+    <w:basedOn w:val="Normal"/>
+    <w:next w:val="Textoindependiente"/>
+    <w:link w:val="TtuloCar"/>
+    <w:uiPriority w:val="10"/>
+    <w:qFormat/>
+    <w:pPr>
+      <w:spacing w:before="240" w:after="80" w:line="240" w:lineRule="auto"/>
+      <w:contextualSpacing/>
+      <w:jc w:val="center"/>
+    </w:pPr>
+    <w:rPr>
+      <w:b/>
+      <w:color w:val="1E3A5F"/>
+      <w:sz w:val="48"/>
+      <w:szCs w:val="48"/>
+    </w:rPr>
+  </w:style>
+  <w:style w:type="character" w:customStyle="1" w:styleId="TtuloCar">
+    <w:name w:val="Título Car"/>
+    <w:basedOn w:val="Fuentedeprrafopredeter"/>
+    <w:link w:val="Ttulo"/>
+    <w:uiPriority w:val="10"/>
+    <w:rsid w:val="00A10FD9"/>
+    <w:rPr>
+      <w:rFonts w:asciiTheme="majorHAnsi" w:eastAsiaTheme="majorEastAsia" w:hAnsiTheme="majorHAnsi" w:cstheme="majorBidi"/>
+      <w:sz w:val="56"/>
+      <w:szCs w:val="56"/>
+    </w:rPr>
+  </w:style>
+  <w:style w:type="paragraph" w:styleId="Subttulo">
+    <w:name w:val="Subtitle"/>
+    <w:basedOn w:val="Normal"/>
+    <w:next w:val="Textoindependiente"/>
+    <w:link w:val="SubttuloCar"/>
+    <w:uiPriority w:val="11"/>
+    <w:qFormat/>
+    <w:pPr>
+      <w:spacing w:after="160"/>
+      <w:contextualSpacing/>
+      <w:jc w:val="center"/>
+    </w:pPr>
+    <w:rPr>
+      <w:i/>
+      <w:color w:val="5B6B7B"/>
+      <w:sz w:val="30"/>
+      <w:szCs w:val="30"/>
+    </w:rPr>
+  </w:style>
+  <w:style w:type="character" w:customStyle="1" w:styleId="SubttuloCar">
+    <w:name w:val="Subtítulo Car"/>
+    <w:basedOn w:val="Fuentedeprrafopredeter"/>
+    <w:link w:val="Subttulo"/>
+    <w:uiPriority w:val="11"/>
+    <w:rsid w:val="00A10FD9"/>
+    <w:rPr>
+      <w:rFonts w:eastAsiaTheme="majorEastAsia" w:cstheme="majorBidi"/>
+      <w:color w:val="595959" w:themeColor="text1" w:themeTint="A6"/>
+      <w:spacing w:val="15"/>
+      <w:sz w:val="28"/>
+      <w:szCs w:val="28"/>
+    </w:rPr>
+  </w:style>
+  <w:style w:type="paragraph" w:customStyle="1" w:styleId="Author">
+    <w:name w:val="Author"/>
+    <w:basedOn w:val="Normal"/>
+    <w:next w:val="Textoindependiente"/>
+    <w:qFormat/>
+    <w:pPr>
+      <w:keepNext/>
+      <w:spacing w:after="40"/>
+      <w:contextualSpacing/>
+      <w:jc w:val="center"/>
+    </w:pPr>
+    <w:rPr>
+      <w:color w:val="333333"/>
+      <w:sz w:val="26"/>
+      <w:szCs w:val="26"/>
+    </w:rPr>
+  </w:style>
+  <w:style w:type="paragraph" w:styleId="Fecha">
+    <w:name w:val="Date"/>
+    <w:basedOn w:val="Normal"/>
+    <w:next w:val="Textoindependiente"/>
+    <w:qFormat/>
+    <w:pPr>
+      <w:spacing w:before="120"/>
+      <w:jc w:val="center"/>
+    </w:pPr>
+    <w:rPr>
+      <w:color w:val="5B6B7B"/>
+      <w:sz w:val="24"/>
+      <w:szCs w:val="24"/>
+    </w:rPr>
+  </w:style>
+  <w:style w:type="paragraph" w:customStyle="1" w:styleId="AbstractTitle">
+    <w:name w:val="Abstract Title"/>
+    <w:basedOn w:val="Normal"/>
+    <w:next w:val="Abstract"/>
+    <w:qFormat/>
+    <w:pPr>
+      <w:keepNext/>
+      <w:keepLines/>
+      <w:spacing w:before="300" w:after="0"/>
+      <w:jc w:val="center"/>
+    </w:pPr>
+    <w:rPr>
+      <w:b/>
+      <w:sz w:val="20"/>
+      <w:szCs w:val="20"/>
+    </w:rPr>
+  </w:style>
+  <w:style w:type="paragraph" w:customStyle="1" w:styleId="Abstract">
+    <w:name w:val="Abstract"/>
+    <w:basedOn w:val="Normal"/>
+    <w:next w:val="Textoindependiente"/>
+    <w:qFormat/>
+    <w:pPr>
+      <w:keepNext/>
+      <w:keepLines/>
+      <w:spacing w:before="100" w:after="300"/>
+    </w:pPr>
+    <w:rPr>
+      <w:sz w:val="20"/>
+      <w:szCs w:val="20"/>
+    </w:rPr>
+  </w:style>
+  <w:style w:type="paragraph" w:styleId="Bibliografa">
+    <w:name w:val="Bibliography"/>
+    <w:basedOn w:val="Normal"/>
+    <w:qFormat/>
+  </w:style>
+  <w:style w:type="character" w:customStyle="1" w:styleId="Ttulo1Car">
+    <w:name w:val="Título 1 Car"/>
+    <w:basedOn w:val="Fuentedeprrafopredeter"/>
+    <w:link w:val="Ttulo1"/>
     <w:uiPriority w:val="9"/>
     <w:rsid w:val="00A10FD9"/>
     <w:rPr>
-      <w:rFonts w:asciiTheme="majorHAnsi" w:cstheme="majorBidi" w:eastAsiaTheme="majorEastAsia" w:hAnsiTheme="majorHAnsi"/>
-      <w:color w:themeColor="accent1" w:themeShade="BF" w:val="0F4761"/>
+      <w:rFonts w:asciiTheme="majorHAnsi" w:eastAsiaTheme="majorEastAsia" w:hAnsiTheme="majorHAnsi" w:cstheme="majorBidi"/>
+      <w:color w:val="0F4761" w:themeColor="accent1" w:themeShade="BF"/>
       <w:sz w:val="40"/>
       <w:szCs w:val="40"/>
     </w:rPr>
   </w:style>
-  <w:style w:customStyle="1" w:styleId="Heading2Char" w:type="character">
-    <w:name w:val="Heading 2 Char"/>
-    <w:basedOn w:val="DefaultParagraphFont"/>
-    <w:link w:val="Heading2"/>
+  <w:style w:type="character" w:customStyle="1" w:styleId="Ttulo2Car">
+    <w:name w:val="Título 2 Car"/>
+    <w:basedOn w:val="Fuentedeprrafopredeter"/>
+    <w:link w:val="Ttulo2"/>
     <w:uiPriority w:val="9"/>
     <w:semiHidden/>
     <w:rsid w:val="00A10FD9"/>
     <w:rPr>
-      <w:rFonts w:asciiTheme="majorHAnsi" w:cstheme="majorBidi" w:eastAsiaTheme="majorEastAsia" w:hAnsiTheme="majorHAnsi"/>
-      <w:color w:themeColor="accent1" w:themeShade="BF" w:val="0F4761"/>
+      <w:rFonts w:asciiTheme="majorHAnsi" w:eastAsiaTheme="majorEastAsia" w:hAnsiTheme="majorHAnsi" w:cstheme="majorBidi"/>
+      <w:color w:val="0F4761" w:themeColor="accent1" w:themeShade="BF"/>
       <w:sz w:val="32"/>
       <w:szCs w:val="32"/>
     </w:rPr>
   </w:style>
-  <w:style w:customStyle="1" w:styleId="Heading3Char" w:type="character">
-    <w:name w:val="Heading 3 Char"/>
-    <w:basedOn w:val="DefaultParagraphFont"/>
-    <w:link w:val="Heading3"/>
+  <w:style w:type="character" w:customStyle="1" w:styleId="Ttulo3Car">
+    <w:name w:val="Título 3 Car"/>
+    <w:basedOn w:val="Fuentedeprrafopredeter"/>
+    <w:link w:val="Ttulo3"/>
     <w:uiPriority w:val="9"/>
     <w:semiHidden/>
     <w:rsid w:val="00A10FD9"/>
     <w:rPr>
-      <w:rFonts w:cstheme="majorBidi" w:eastAsiaTheme="majorEastAsia"/>
-      <w:color w:themeColor="accent1" w:themeShade="BF" w:val="0F4761"/>
+      <w:rFonts w:eastAsiaTheme="majorEastAsia" w:cstheme="majorBidi"/>
+      <w:color w:val="0F4761" w:themeColor="accent1" w:themeShade="BF"/>
       <w:sz w:val="28"/>
       <w:szCs w:val="28"/>
     </w:rPr>
   </w:style>
-  <w:style w:customStyle="1" w:styleId="Heading4Char" w:type="character">
-    <w:name w:val="Heading 4 Char"/>
-    <w:basedOn w:val="DefaultParagraphFont"/>
-    <w:link w:val="Heading4"/>
+  <w:style w:type="character" w:customStyle="1" w:styleId="Ttulo4Car">
+    <w:name w:val="Título 4 Car"/>
+    <w:basedOn w:val="Fuentedeprrafopredeter"/>
+    <w:link w:val="Ttulo4"/>
     <w:uiPriority w:val="9"/>
     <w:semiHidden/>
     <w:rsid w:val="00A10FD9"/>
     <w:rPr>
-      <w:rFonts w:cstheme="majorBidi" w:eastAsiaTheme="majorEastAsia"/>
+      <w:rFonts w:eastAsiaTheme="majorEastAsia" w:cstheme="majorBidi"/>
       <w:i/>
       <w:iCs/>
-      <w:color w:themeColor="accent1" w:themeShade="BF" w:val="0F4761"/>
-    </w:rPr>
-  </w:style>
-  <w:style w:customStyle="1" w:styleId="Heading5Char" w:type="character">
-    <w:name w:val="Heading 5 Char"/>
-    <w:basedOn w:val="DefaultParagraphFont"/>
-    <w:link w:val="Heading5"/>
+      <w:color w:val="0F4761" w:themeColor="accent1" w:themeShade="BF"/>
+    </w:rPr>
+  </w:style>
+  <w:style w:type="character" w:customStyle="1" w:styleId="Ttulo5Car">
+    <w:name w:val="Título 5 Car"/>
+    <w:basedOn w:val="Fuentedeprrafopredeter"/>
+    <w:link w:val="Ttulo5"/>
     <w:uiPriority w:val="9"/>
     <w:semiHidden/>
     <w:rsid w:val="00A10FD9"/>
     <w:rPr>
-      <w:rFonts w:cstheme="majorBidi" w:eastAsiaTheme="majorEastAsia"/>
-      <w:color w:themeColor="accent1" w:themeShade="BF" w:val="0F4761"/>
-    </w:rPr>
-  </w:style>
-  <w:style w:customStyle="1" w:styleId="Heading6Char" w:type="character">
-    <w:name w:val="Heading 6 Char"/>
-    <w:basedOn w:val="DefaultParagraphFont"/>
-    <w:link w:val="Heading6"/>
+      <w:rFonts w:eastAsiaTheme="majorEastAsia" w:cstheme="majorBidi"/>
+      <w:color w:val="0F4761" w:themeColor="accent1" w:themeShade="BF"/>
+    </w:rPr>
+  </w:style>
+  <w:style w:type="character" w:customStyle="1" w:styleId="Ttulo6Car">
+    <w:name w:val="Título 6 Car"/>
+    <w:basedOn w:val="Fuentedeprrafopredeter"/>
+    <w:link w:val="Ttulo6"/>
     <w:uiPriority w:val="9"/>
     <w:semiHidden/>
     <w:rsid w:val="00A10FD9"/>
     <w:rPr>
-      <w:rFonts w:cstheme="majorBidi" w:eastAsiaTheme="majorEastAsia"/>
+      <w:rFonts w:eastAsiaTheme="majorEastAsia" w:cstheme="majorBidi"/>
       <w:i/>
       <w:iCs/>
-      <w:color w:themeColor="text1" w:themeTint="A6" w:val="595959"/>
-    </w:rPr>
-  </w:style>
-  <w:style w:customStyle="1" w:styleId="Heading7Char" w:type="character">
-    <w:name w:val="Heading 7 Char"/>
-    <w:basedOn w:val="DefaultParagraphFont"/>
-    <w:link w:val="Heading7"/>
+      <w:color w:val="595959" w:themeColor="text1" w:themeTint="A6"/>
+    </w:rPr>
+  </w:style>
+  <w:style w:type="character" w:customStyle="1" w:styleId="Ttulo7Car">
+    <w:name w:val="Título 7 Car"/>
+    <w:basedOn w:val="Fuentedeprrafopredeter"/>
+    <w:link w:val="Ttulo7"/>
     <w:uiPriority w:val="9"/>
     <w:semiHidden/>
     <w:rsid w:val="00A10FD9"/>
     <w:rPr>
-      <w:rFonts w:cstheme="majorBidi" w:eastAsiaTheme="majorEastAsia"/>
-      <w:color w:themeColor="text1" w:themeTint="A6" w:val="595959"/>
-    </w:rPr>
-  </w:style>
-  <w:style w:customStyle="1" w:styleId="Heading8Char" w:type="character">
-    <w:name w:val="Heading 8 Char"/>
-    <w:basedOn w:val="DefaultParagraphFont"/>
-    <w:link w:val="Heading8"/>
+      <w:rFonts w:eastAsiaTheme="majorEastAsia" w:cstheme="majorBidi"/>
+      <w:color w:val="595959" w:themeColor="text1" w:themeTint="A6"/>
+    </w:rPr>
+  </w:style>
+  <w:style w:type="character" w:customStyle="1" w:styleId="Ttulo8Car">
+    <w:name w:val="Título 8 Car"/>
+    <w:basedOn w:val="Fuentedeprrafopredeter"/>
+    <w:link w:val="Ttulo8"/>
     <w:uiPriority w:val="9"/>
     <w:semiHidden/>
     <w:rsid w:val="00A10FD9"/>
     <w:rPr>
-      <w:rFonts w:cstheme="majorBidi" w:eastAsiaTheme="majorEastAsia"/>
+      <w:rFonts w:eastAsiaTheme="majorEastAsia" w:cstheme="majorBidi"/>
       <w:i/>
       <w:iCs/>
-      <w:color w:themeColor="text1" w:themeTint="D8" w:val="272727"/>
-    </w:rPr>
-  </w:style>
-  <w:style w:customStyle="1" w:styleId="Heading9Char" w:type="character">
-    <w:name w:val="Heading 9 Char"/>
-    <w:basedOn w:val="DefaultParagraphFont"/>
-    <w:link w:val="Heading9"/>
+      <w:color w:val="272727" w:themeColor="text1" w:themeTint="D8"/>
+    </w:rPr>
+  </w:style>
+  <w:style w:type="character" w:customStyle="1" w:styleId="Ttulo9Car">
+    <w:name w:val="Título 9 Car"/>
+    <w:basedOn w:val="Fuentedeprrafopredeter"/>
+    <w:link w:val="Ttulo9"/>
     <w:uiPriority w:val="9"/>
     <w:semiHidden/>
     <w:rsid w:val="00A10FD9"/>
     <w:rPr>
-      <w:rFonts w:cstheme="majorBidi" w:eastAsiaTheme="majorEastAsia"/>
-      <w:color w:themeColor="text1" w:themeTint="D8" w:val="272727"/>
-    </w:rPr>
-  </w:style>
-  <w:style w:styleId="BlockText" w:type="paragraph">
+      <w:rFonts w:eastAsiaTheme="majorEastAsia" w:cstheme="majorBidi"/>
+      <w:color w:val="272727" w:themeColor="text1" w:themeTint="D8"/>
+    </w:rPr>
+  </w:style>
+  <w:style w:type="paragraph" w:styleId="Textodebloque">
     <w:name w:val="Block Text"/>
-    <w:basedOn w:val="BodyText"/>
-    <w:next w:val="BodyText"/>
+    <w:basedOn w:val="Textoindependiente"/>
+    <w:next w:val="Textoindependiente"/>
     <w:uiPriority w:val="9"/>
     <w:unhideWhenUsed/>
     <w:qFormat/>
     <w:pPr>
-      <w:spacing w:after="100" w:before="100"/>
-      <w:ind w:firstLine="0" w:left="480" w:right="480"/>
+      <w:spacing w:before="100" w:after="100"/>
+      <w:ind w:left="480" w:right="480"/>
     </w:pPr>
   </w:style>
-  <w:style w:styleId="FootnoteText" w:type="paragraph">
-    <w:name w:val="Footnote Text"/>
+  <w:style w:type="paragraph" w:styleId="Textonotapie">
+    <w:name w:val="footnote text"/>
     <w:basedOn w:val="Normal"/>
-    <w:next w:val="FootnoteText"/>
     <w:uiPriority w:val="9"/>
     <w:unhideWhenUsed/>
     <w:qFormat/>
   </w:style>
-  <w:style w:styleId="FootnoteBlockText" w:type="paragraph">
+  <w:style w:type="paragraph" w:customStyle="1" w:styleId="FootnoteBlockText">
     <w:name w:val="Footnote Block Text"/>
-    <w:basedOn w:val="FootnoteText"/>
-    <w:next w:val="FootnoteText"/>
+    <w:basedOn w:val="Textonotapie"/>
+    <w:next w:val="Textonotapie"/>
     <w:uiPriority w:val="9"/>
     <w:unhideWhenUsed/>
     <w:qFormat/>
     <w:pPr>
-      <w:spacing w:after="100" w:before="100"/>
-      <w:ind w:firstLine="0" w:left="480" w:right="480"/>
+      <w:spacing w:before="100" w:after="100"/>
+      <w:ind w:left="480" w:right="480"/>
     </w:pPr>
   </w:style>
-  <w:style w:default="1" w:styleId="DefaultParagraphFont" w:type="character">
-    <w:name w:val="Default Paragraph Font"/>
-    <w:semiHidden/>
-    <w:unhideWhenUsed/>
-  </w:style>
-  <w:style w:default="1" w:styleId="Table" w:type="table">
+  <w:style w:type="table" w:customStyle="1" w:styleId="Table">
     <w:name w:val="Table"/>
-    <w:basedOn w:val="TableNormal"/>
     <w:semiHidden/>
     <w:unhideWhenUsed/>
     <w:qFormat/>
     <w:tblPr>
-      <w:tblInd w:type="dxa" w:w="0"/>
+      <w:tblInd w:w="0" w:type="dxa"/>
       <w:tblCellMar>
-        <w:top w:type="dxa" w:w="0"/>
-        <w:left w:type="dxa" w:w="108"/>
-        <w:bottom w:type="dxa" w:w="0"/>
-        <w:right w:type="dxa" w:w="108"/>
+        <w:top w:w="0" w:type="dxa"/>
+        <w:left w:w="108" w:type="dxa"/>
+        <w:bottom w:w="0" w:type="dxa"/>
+        <w:right w:w="108" w:type="dxa"/>
       </w:tblCellMar>
     </w:tblPr>
     <w:tblStylePr w:type="firstRow">
+      <w:tblPr/>
       <w:tcPr>
         <w:tcBorders>
-          <w:bottom w:val="single"/>
+          <w:bottom w:val="single" w:sz="0" w:space="0" w:color="auto"/>
         </w:tcBorders>
         <w:vAlign w:val="bottom"/>
       </w:tcPr>
     </w:tblStylePr>
   </w:style>
-  <w:style w:customStyle="1" w:styleId="DefinitionTerm" w:type="paragraph">
+  <w:style w:type="paragraph" w:customStyle="1" w:styleId="DefinitionTerm">
     <w:name w:val="Definition Term"/>
     <w:basedOn w:val="Normal"/>
     <w:next w:val="Definition"/>
@@ -2283,78 +2900,77 @@
       <w:b/>
     </w:rPr>
   </w:style>
-  <w:style w:customStyle="1" w:styleId="Definition" w:type="paragraph">
+  <w:style w:type="paragraph" w:customStyle="1" w:styleId="Definition">
     <w:name w:val="Definition"/>
     <w:basedOn w:val="Normal"/>
   </w:style>
-  <w:style w:styleId="Caption" w:type="paragraph">
-    <w:name w:val="Caption"/>
+  <w:style w:type="paragraph" w:styleId="Descripcin">
+    <w:name w:val="caption"/>
     <w:basedOn w:val="Normal"/>
-    <w:link w:val="BodyTextChar"/>
-    <w:pPr>
-      <w:spacing w:after="120" w:before="0"/>
-    </w:pPr>
+    <w:link w:val="DescripcinCar"/>
     <w:rPr>
       <w:i/>
     </w:rPr>
   </w:style>
-  <w:style w:customStyle="1" w:styleId="TableCaption" w:type="paragraph">
+  <w:style w:type="paragraph" w:customStyle="1" w:styleId="TableCaption">
     <w:name w:val="Table Caption"/>
-    <w:basedOn w:val="Caption"/>
+    <w:basedOn w:val="Descripcin"/>
     <w:pPr>
       <w:keepNext/>
     </w:pPr>
   </w:style>
-  <w:style w:customStyle="1" w:styleId="ImageCaption" w:type="paragraph">
+  <w:style w:type="paragraph" w:customStyle="1" w:styleId="ImageCaption">
     <w:name w:val="Image Caption"/>
-    <w:basedOn w:val="Caption"/>
-  </w:style>
-  <w:style w:customStyle="1" w:styleId="Figure" w:type="paragraph">
+    <w:basedOn w:val="Descripcin"/>
+  </w:style>
+  <w:style w:type="paragraph" w:customStyle="1" w:styleId="Figure">
     <w:name w:val="Figure"/>
     <w:basedOn w:val="Normal"/>
   </w:style>
-  <w:style w:customStyle="1" w:styleId="CaptionedFigure" w:type="paragraph">
+  <w:style w:type="paragraph" w:customStyle="1" w:styleId="CaptionedFigure">
     <w:name w:val="Captioned Figure"/>
     <w:basedOn w:val="Figure"/>
     <w:pPr>
       <w:keepNext/>
     </w:pPr>
   </w:style>
-  <w:style w:customStyle="1" w:styleId="BodyTextChar" w:type="character">
-    <w:name w:val="Body Text Char"/>
-    <w:basedOn w:val="DefaultParagraphFont"/>
-    <w:link w:val="BodyText"/>
-  </w:style>
-  <w:style w:customStyle="1" w:styleId="VerbatimChar" w:type="character">
+  <w:style w:type="character" w:customStyle="1" w:styleId="DescripcinCar">
+    <w:name w:val="Descripción Car"/>
+    <w:basedOn w:val="Fuentedeprrafopredeter"/>
+    <w:link w:val="Descripcin"/>
+  </w:style>
+  <w:style w:type="character" w:customStyle="1" w:styleId="VerbatimChar">
     <w:name w:val="Verbatim Char"/>
-    <w:basedOn w:val="BodyTextChar"/>
+    <w:basedOn w:val="DescripcinCar"/>
+    <w:link w:val="SourceCode"/>
     <w:rPr>
       <w:rFonts w:ascii="Consolas" w:hAnsi="Consolas"/>
       <w:sz w:val="22"/>
     </w:rPr>
   </w:style>
-  <w:style w:customStyle="1" w:styleId="SectionNumber" w:type="character">
+  <w:style w:type="character" w:customStyle="1" w:styleId="SectionNumber">
     <w:name w:val="Section Number"/>
-    <w:basedOn w:val="BodyTextChar"/>
-  </w:style>
-  <w:style w:styleId="FootnoteReference" w:type="character">
-    <w:name w:val="Footnote Reference"/>
-    <w:basedOn w:val="BodyTextChar"/>
+    <w:basedOn w:val="DescripcinCar"/>
+  </w:style>
+  <w:style w:type="character" w:styleId="Refdenotaalpie">
+    <w:name w:val="footnote reference"/>
+    <w:basedOn w:val="DescripcinCar"/>
     <w:rPr>
       <w:vertAlign w:val="superscript"/>
     </w:rPr>
   </w:style>
-  <w:style w:styleId="Hyperlink" w:type="character">
+  <w:style w:type="character" w:styleId="Hipervnculo">
     <w:name w:val="Hyperlink"/>
-    <w:basedOn w:val="BodyTextChar"/>
-    <w:rPr>
-      <w:color w:themeColor="accent1" w:val="4F81BD"/>
-    </w:rPr>
-  </w:style>
-  <w:style w:styleId="TOCHeading" w:type="paragraph">
+    <w:basedOn w:val="DescripcinCar"/>
+    <w:uiPriority w:val="99"/>
+    <w:rPr>
+      <w:color w:val="156082" w:themeColor="accent1"/>
+    </w:rPr>
+  </w:style>
+  <w:style w:type="paragraph" w:styleId="TtuloTDC">
     <w:name w:val="TOC Heading"/>
-    <w:basedOn w:val="Heading1"/>
-    <w:next w:val="BodyText"/>
+    <w:basedOn w:val="Ttulo1"/>
+    <w:next w:val="Textoindependiente"/>
     <w:uiPriority w:val="39"/>
     <w:unhideWhenUsed/>
     <w:qFormat/>
@@ -2363,10 +2979,9 @@
       <w:outlineLvl w:val="9"/>
     </w:pPr>
     <w:rPr>
-      <w:rFonts w:asciiTheme="majorHAnsi" w:cstheme="majorBidi" w:eastAsiaTheme="majorEastAsia" w:hAnsiTheme="majorHAnsi"/>
+      <w:rFonts w:asciiTheme="majorHAnsi" w:eastAsiaTheme="majorEastAsia" w:hAnsiTheme="majorHAnsi" w:cstheme="majorBidi"/>
       <w:b w:val="0"/>
-      <w:bCs w:val="0"/>
-      <w:color w:themeColor="accent1" w:themeShade="BF" w:val="365F91"/>
+      <w:color w:val="0F4761" w:themeColor="accent1" w:themeShade="BF"/>
     </w:rPr>
   </w:style>
   <w:style w:type="paragraph" w:customStyle="1" w:styleId="SourceCode">
@@ -2374,234 +2989,311 @@
     <w:basedOn w:val="Normal"/>
     <w:link w:val="VerbatimChar"/>
     <w:pPr>
-      <w:wordWrap w:val="off"/>
+      <w:wordWrap w:val="0"/>
     </w:pPr>
   </w:style>
   <w:style w:type="character" w:customStyle="1" w:styleId="KeywordTok">
     <w:name w:val="KeywordTok"/>
     <w:basedOn w:val="VerbatimChar"/>
     <w:rPr>
+      <w:rFonts w:ascii="Consolas" w:hAnsi="Consolas"/>
       <w:b/>
       <w:color w:val="007020"/>
+      <w:sz w:val="22"/>
     </w:rPr>
   </w:style>
   <w:style w:type="character" w:customStyle="1" w:styleId="DataTypeTok">
     <w:name w:val="DataTypeTok"/>
     <w:basedOn w:val="VerbatimChar"/>
     <w:rPr>
+      <w:rFonts w:ascii="Consolas" w:hAnsi="Consolas"/>
       <w:color w:val="902000"/>
+      <w:sz w:val="22"/>
     </w:rPr>
   </w:style>
   <w:style w:type="character" w:customStyle="1" w:styleId="DecValTok">
     <w:name w:val="DecValTok"/>
     <w:basedOn w:val="VerbatimChar"/>
     <w:rPr>
-      <w:color w:val="40a070"/>
+      <w:rFonts w:ascii="Consolas" w:hAnsi="Consolas"/>
+      <w:color w:val="40A070"/>
+      <w:sz w:val="22"/>
     </w:rPr>
   </w:style>
   <w:style w:type="character" w:customStyle="1" w:styleId="BaseNTok">
     <w:name w:val="BaseNTok"/>
     <w:basedOn w:val="VerbatimChar"/>
     <w:rPr>
-      <w:color w:val="40a070"/>
+      <w:rFonts w:ascii="Consolas" w:hAnsi="Consolas"/>
+      <w:color w:val="40A070"/>
+      <w:sz w:val="22"/>
     </w:rPr>
   </w:style>
   <w:style w:type="character" w:customStyle="1" w:styleId="FloatTok">
     <w:name w:val="FloatTok"/>
     <w:basedOn w:val="VerbatimChar"/>
     <w:rPr>
-      <w:color w:val="40a070"/>
+      <w:rFonts w:ascii="Consolas" w:hAnsi="Consolas"/>
+      <w:color w:val="40A070"/>
+      <w:sz w:val="22"/>
     </w:rPr>
   </w:style>
   <w:style w:type="character" w:customStyle="1" w:styleId="ConstantTok">
     <w:name w:val="ConstantTok"/>
     <w:basedOn w:val="VerbatimChar"/>
     <w:rPr>
+      <w:rFonts w:ascii="Consolas" w:hAnsi="Consolas"/>
       <w:color w:val="880000"/>
+      <w:sz w:val="22"/>
     </w:rPr>
   </w:style>
   <w:style w:type="character" w:customStyle="1" w:styleId="CharTok">
     <w:name w:val="CharTok"/>
     <w:basedOn w:val="VerbatimChar"/>
     <w:rPr>
-      <w:color w:val="4070a0"/>
+      <w:rFonts w:ascii="Consolas" w:hAnsi="Consolas"/>
+      <w:color w:val="4070A0"/>
+      <w:sz w:val="22"/>
     </w:rPr>
   </w:style>
   <w:style w:type="character" w:customStyle="1" w:styleId="SpecialCharTok">
     <w:name w:val="SpecialCharTok"/>
     <w:basedOn w:val="VerbatimChar"/>
     <w:rPr>
-      <w:color w:val="4070a0"/>
+      <w:rFonts w:ascii="Consolas" w:hAnsi="Consolas"/>
+      <w:color w:val="4070A0"/>
+      <w:sz w:val="22"/>
     </w:rPr>
   </w:style>
   <w:style w:type="character" w:customStyle="1" w:styleId="StringTok">
     <w:name w:val="StringTok"/>
     <w:basedOn w:val="VerbatimChar"/>
     <w:rPr>
-      <w:color w:val="4070a0"/>
+      <w:rFonts w:ascii="Consolas" w:hAnsi="Consolas"/>
+      <w:color w:val="4070A0"/>
+      <w:sz w:val="22"/>
     </w:rPr>
   </w:style>
   <w:style w:type="character" w:customStyle="1" w:styleId="VerbatimStringTok">
     <w:name w:val="VerbatimStringTok"/>
     <w:basedOn w:val="VerbatimChar"/>
     <w:rPr>
-      <w:color w:val="4070a0"/>
+      <w:rFonts w:ascii="Consolas" w:hAnsi="Consolas"/>
+      <w:color w:val="4070A0"/>
+      <w:sz w:val="22"/>
     </w:rPr>
   </w:style>
   <w:style w:type="character" w:customStyle="1" w:styleId="SpecialStringTok">
     <w:name w:val="SpecialStringTok"/>
     <w:basedOn w:val="VerbatimChar"/>
     <w:rPr>
-      <w:color w:val="bb6688"/>
+      <w:rFonts w:ascii="Consolas" w:hAnsi="Consolas"/>
+      <w:color w:val="BB6688"/>
+      <w:sz w:val="22"/>
     </w:rPr>
   </w:style>
   <w:style w:type="character" w:customStyle="1" w:styleId="ImportTok">
     <w:name w:val="ImportTok"/>
     <w:basedOn w:val="VerbatimChar"/>
     <w:rPr>
+      <w:rFonts w:ascii="Consolas" w:hAnsi="Consolas"/>
       <w:b/>
       <w:color w:val="008000"/>
+      <w:sz w:val="22"/>
     </w:rPr>
   </w:style>
   <w:style w:type="character" w:customStyle="1" w:styleId="CommentTok">
     <w:name w:val="CommentTok"/>
     <w:basedOn w:val="VerbatimChar"/>
     <w:rPr>
+      <w:rFonts w:ascii="Consolas" w:hAnsi="Consolas"/>
       <w:i/>
-      <w:color w:val="60a0b0"/>
+      <w:color w:val="60A0B0"/>
+      <w:sz w:val="22"/>
     </w:rPr>
   </w:style>
   <w:style w:type="character" w:customStyle="1" w:styleId="DocumentationTok">
     <w:name w:val="DocumentationTok"/>
     <w:basedOn w:val="VerbatimChar"/>
     <w:rPr>
+      <w:rFonts w:ascii="Consolas" w:hAnsi="Consolas"/>
       <w:i/>
-      <w:color w:val="ba2121"/>
+      <w:color w:val="BA2121"/>
+      <w:sz w:val="22"/>
     </w:rPr>
   </w:style>
   <w:style w:type="character" w:customStyle="1" w:styleId="AnnotationTok">
     <w:name w:val="AnnotationTok"/>
     <w:basedOn w:val="VerbatimChar"/>
     <w:rPr>
+      <w:rFonts w:ascii="Consolas" w:hAnsi="Consolas"/>
       <w:b/>
       <w:i/>
-      <w:color w:val="60a0b0"/>
+      <w:color w:val="60A0B0"/>
+      <w:sz w:val="22"/>
     </w:rPr>
   </w:style>
   <w:style w:type="character" w:customStyle="1" w:styleId="CommentVarTok">
     <w:name w:val="CommentVarTok"/>
     <w:basedOn w:val="VerbatimChar"/>
     <w:rPr>
+      <w:rFonts w:ascii="Consolas" w:hAnsi="Consolas"/>
       <w:b/>
       <w:i/>
-      <w:color w:val="60a0b0"/>
+      <w:color w:val="60A0B0"/>
+      <w:sz w:val="22"/>
     </w:rPr>
   </w:style>
   <w:style w:type="character" w:customStyle="1" w:styleId="OtherTok">
     <w:name w:val="OtherTok"/>
     <w:basedOn w:val="VerbatimChar"/>
     <w:rPr>
+      <w:rFonts w:ascii="Consolas" w:hAnsi="Consolas"/>
       <w:color w:val="007020"/>
+      <w:sz w:val="22"/>
     </w:rPr>
   </w:style>
   <w:style w:type="character" w:customStyle="1" w:styleId="FunctionTok">
     <w:name w:val="FunctionTok"/>
     <w:basedOn w:val="VerbatimChar"/>
     <w:rPr>
-      <w:color w:val="06287e"/>
+      <w:rFonts w:ascii="Consolas" w:hAnsi="Consolas"/>
+      <w:color w:val="06287E"/>
+      <w:sz w:val="22"/>
     </w:rPr>
   </w:style>
   <w:style w:type="character" w:customStyle="1" w:styleId="VariableTok">
     <w:name w:val="VariableTok"/>
     <w:basedOn w:val="VerbatimChar"/>
     <w:rPr>
-      <w:color w:val="19177c"/>
+      <w:rFonts w:ascii="Consolas" w:hAnsi="Consolas"/>
+      <w:color w:val="19177C"/>
+      <w:sz w:val="22"/>
     </w:rPr>
   </w:style>
   <w:style w:type="character" w:customStyle="1" w:styleId="ControlFlowTok">
     <w:name w:val="ControlFlowTok"/>
     <w:basedOn w:val="VerbatimChar"/>
     <w:rPr>
+      <w:rFonts w:ascii="Consolas" w:hAnsi="Consolas"/>
       <w:b/>
       <w:color w:val="007020"/>
+      <w:sz w:val="22"/>
     </w:rPr>
   </w:style>
   <w:style w:type="character" w:customStyle="1" w:styleId="OperatorTok">
     <w:name w:val="OperatorTok"/>
     <w:basedOn w:val="VerbatimChar"/>
     <w:rPr>
+      <w:rFonts w:ascii="Consolas" w:hAnsi="Consolas"/>
       <w:color w:val="666666"/>
+      <w:sz w:val="22"/>
     </w:rPr>
   </w:style>
   <w:style w:type="character" w:customStyle="1" w:styleId="BuiltInTok">
     <w:name w:val="BuiltInTok"/>
     <w:basedOn w:val="VerbatimChar"/>
     <w:rPr>
+      <w:rFonts w:ascii="Consolas" w:hAnsi="Consolas"/>
       <w:color w:val="008000"/>
+      <w:sz w:val="22"/>
     </w:rPr>
   </w:style>
   <w:style w:type="character" w:customStyle="1" w:styleId="ExtensionTok">
     <w:name w:val="ExtensionTok"/>
     <w:basedOn w:val="VerbatimChar"/>
-    <w:rPr/>
+    <w:rPr>
+      <w:rFonts w:ascii="Consolas" w:hAnsi="Consolas"/>
+      <w:sz w:val="22"/>
+    </w:rPr>
   </w:style>
   <w:style w:type="character" w:customStyle="1" w:styleId="PreprocessorTok">
     <w:name w:val="PreprocessorTok"/>
     <w:basedOn w:val="VerbatimChar"/>
     <w:rPr>
-      <w:color w:val="bc7a00"/>
+      <w:rFonts w:ascii="Consolas" w:hAnsi="Consolas"/>
+      <w:color w:val="BC7A00"/>
+      <w:sz w:val="22"/>
     </w:rPr>
   </w:style>
   <w:style w:type="character" w:customStyle="1" w:styleId="AttributeTok">
     <w:name w:val="AttributeTok"/>
     <w:basedOn w:val="VerbatimChar"/>
     <w:rPr>
-      <w:color w:val="7d9029"/>
+      <w:rFonts w:ascii="Consolas" w:hAnsi="Consolas"/>
+      <w:color w:val="7D9029"/>
+      <w:sz w:val="22"/>
     </w:rPr>
   </w:style>
   <w:style w:type="character" w:customStyle="1" w:styleId="RegionMarkerTok">
     <w:name w:val="RegionMarkerTok"/>
     <w:basedOn w:val="VerbatimChar"/>
-    <w:rPr/>
+    <w:rPr>
+      <w:rFonts w:ascii="Consolas" w:hAnsi="Consolas"/>
+      <w:sz w:val="22"/>
+    </w:rPr>
   </w:style>
   <w:style w:type="character" w:customStyle="1" w:styleId="InformationTok">
     <w:name w:val="InformationTok"/>
     <w:basedOn w:val="VerbatimChar"/>
     <w:rPr>
+      <w:rFonts w:ascii="Consolas" w:hAnsi="Consolas"/>
       <w:b/>
       <w:i/>
-      <w:color w:val="60a0b0"/>
+      <w:color w:val="60A0B0"/>
+      <w:sz w:val="22"/>
     </w:rPr>
   </w:style>
   <w:style w:type="character" w:customStyle="1" w:styleId="WarningTok">
     <w:name w:val="WarningTok"/>
     <w:basedOn w:val="VerbatimChar"/>
     <w:rPr>
+      <w:rFonts w:ascii="Consolas" w:hAnsi="Consolas"/>
       <w:b/>
       <w:i/>
-      <w:color w:val="60a0b0"/>
+      <w:color w:val="60A0B0"/>
+      <w:sz w:val="22"/>
     </w:rPr>
   </w:style>
   <w:style w:type="character" w:customStyle="1" w:styleId="AlertTok">
     <w:name w:val="AlertTok"/>
     <w:basedOn w:val="VerbatimChar"/>
     <w:rPr>
+      <w:rFonts w:ascii="Consolas" w:hAnsi="Consolas"/>
       <w:b/>
-      <w:color w:val="ff0000"/>
+      <w:color w:val="FF0000"/>
+      <w:sz w:val="22"/>
     </w:rPr>
   </w:style>
   <w:style w:type="character" w:customStyle="1" w:styleId="ErrorTok">
     <w:name w:val="ErrorTok"/>
     <w:basedOn w:val="VerbatimChar"/>
     <w:rPr>
+      <w:rFonts w:ascii="Consolas" w:hAnsi="Consolas"/>
       <w:b/>
-      <w:color w:val="ff0000"/>
+      <w:color w:val="FF0000"/>
+      <w:sz w:val="22"/>
     </w:rPr>
   </w:style>
   <w:style w:type="character" w:customStyle="1" w:styleId="NormalTok">
     <w:name w:val="NormalTok"/>
     <w:basedOn w:val="VerbatimChar"/>
-    <w:rPr/>
+    <w:rPr>
+      <w:rFonts w:ascii="Consolas" w:hAnsi="Consolas"/>
+      <w:sz w:val="22"/>
+    </w:rPr>
+  </w:style>
+  <w:style w:type="paragraph" w:styleId="TDC1">
+    <w:name w:val="toc 1"/>
+    <w:basedOn w:val="Normal"/>
+    <w:next w:val="Normal"/>
+    <w:autoRedefine/>
+    <w:uiPriority w:val="39"/>
+    <w:unhideWhenUsed/>
+    <w:rsid w:val="00E21D7E"/>
+    <w:pPr>
+      <w:spacing w:after="100"/>
+    </w:pPr>
   </w:style>
 </w:styles>
 </file>

</xml_diff>